<commit_message>
Git Workflow, Restore, Revert & Reset
</commit_message>
<xml_diff>
--- a/Git_Github.docx
+++ b/Git_Github.docx
@@ -19,7 +19,6 @@
     <w:p>
       <w:pPr>
         <w:rPr>
-          <w:sz w:val="32"/>
           <w:szCs w:val="32"/>
           <w:lang w:val="en-US"/>
         </w:rPr>
@@ -32,7 +31,6 @@
       </w:r>
       <w:r>
         <w:rPr>
-          <w:sz w:val="32"/>
           <w:szCs w:val="32"/>
           <w:lang w:val="en-US"/>
         </w:rPr>
@@ -47,7 +45,6 @@
           <w:numId w:val="1"/>
         </w:numPr>
         <w:rPr>
-          <w:sz w:val="32"/>
           <w:szCs w:val="32"/>
           <w:lang w:val="en-US"/>
         </w:rPr>
@@ -56,7 +53,6 @@
         <w:rPr>
           <w:b/>
           <w:bCs/>
-          <w:sz w:val="32"/>
           <w:szCs w:val="32"/>
           <w:lang w:val="en-US"/>
         </w:rPr>
@@ -64,7 +60,6 @@
       </w:r>
       <w:r>
         <w:rPr>
-          <w:sz w:val="32"/>
           <w:szCs w:val="32"/>
           <w:lang w:val="en-US"/>
         </w:rPr>
@@ -79,14 +74,12 @@
           <w:numId w:val="1"/>
         </w:numPr>
         <w:rPr>
-          <w:sz w:val="32"/>
           <w:szCs w:val="32"/>
           <w:lang w:val="en-US"/>
         </w:rPr>
       </w:pPr>
       <w:r>
         <w:rPr>
-          <w:sz w:val="32"/>
           <w:szCs w:val="32"/>
           <w:lang w:val="en-US"/>
         </w:rPr>
@@ -101,14 +94,12 @@
           <w:numId w:val="1"/>
         </w:numPr>
         <w:rPr>
-          <w:sz w:val="32"/>
           <w:szCs w:val="32"/>
           <w:lang w:val="en-US"/>
         </w:rPr>
       </w:pPr>
       <w:r>
         <w:rPr>
-          <w:sz w:val="32"/>
           <w:szCs w:val="32"/>
           <w:lang w:val="en-US"/>
         </w:rPr>
@@ -120,7 +111,6 @@
         <w:rPr>
           <w:b/>
           <w:bCs/>
-          <w:sz w:val="32"/>
           <w:szCs w:val="32"/>
           <w:lang w:val="en-US"/>
         </w:rPr>
@@ -129,7 +119,6 @@
         <w:rPr>
           <w:b/>
           <w:bCs/>
-          <w:sz w:val="32"/>
           <w:szCs w:val="32"/>
           <w:lang w:val="en-US"/>
         </w:rPr>
@@ -139,7 +128,6 @@
         <w:rPr>
           <w:b/>
           <w:bCs/>
-          <w:sz w:val="32"/>
           <w:szCs w:val="32"/>
           <w:lang w:val="en-US"/>
         </w:rPr>
@@ -156,14 +144,12 @@
         <w:rPr>
           <w:b/>
           <w:bCs/>
-          <w:sz w:val="32"/>
           <w:szCs w:val="32"/>
           <w:lang w:val="en-US"/>
         </w:rPr>
       </w:pPr>
       <w:r>
         <w:rPr>
-          <w:sz w:val="32"/>
           <w:szCs w:val="32"/>
           <w:lang w:val="en-US"/>
         </w:rPr>
@@ -180,14 +166,12 @@
         <w:rPr>
           <w:b/>
           <w:bCs/>
-          <w:sz w:val="32"/>
           <w:szCs w:val="32"/>
           <w:lang w:val="en-US"/>
         </w:rPr>
       </w:pPr>
       <w:r>
         <w:rPr>
-          <w:sz w:val="32"/>
           <w:szCs w:val="32"/>
           <w:lang w:val="en-US"/>
         </w:rPr>
@@ -204,14 +188,12 @@
         <w:rPr>
           <w:b/>
           <w:bCs/>
-          <w:sz w:val="32"/>
           <w:szCs w:val="32"/>
           <w:lang w:val="en-US"/>
         </w:rPr>
       </w:pPr>
       <w:r>
         <w:rPr>
-          <w:sz w:val="32"/>
           <w:szCs w:val="32"/>
           <w:lang w:val="en-US"/>
         </w:rPr>
@@ -235,7 +217,6 @@
     <w:p>
       <w:pPr>
         <w:rPr>
-          <w:sz w:val="32"/>
           <w:szCs w:val="32"/>
           <w:lang w:val="en-US"/>
         </w:rPr>
@@ -248,7 +229,6 @@
       </w:r>
       <w:r>
         <w:rPr>
-          <w:sz w:val="32"/>
           <w:szCs w:val="32"/>
           <w:lang w:val="en-US"/>
         </w:rPr>
@@ -258,7 +238,6 @@
         <w:rPr>
           <w:b/>
           <w:bCs/>
-          <w:sz w:val="32"/>
           <w:szCs w:val="32"/>
           <w:lang w:val="en-US"/>
         </w:rPr>
@@ -268,7 +247,6 @@
         <w:rPr>
           <w:b/>
           <w:bCs/>
-          <w:sz w:val="32"/>
           <w:szCs w:val="32"/>
           <w:lang w:val="en-US"/>
         </w:rPr>
@@ -276,7 +254,6 @@
       </w:r>
       <w:r>
         <w:rPr>
-          <w:sz w:val="32"/>
           <w:szCs w:val="32"/>
           <w:lang w:val="en-US"/>
         </w:rPr>
@@ -286,7 +263,6 @@
     <w:p>
       <w:pPr>
         <w:rPr>
-          <w:sz w:val="32"/>
           <w:szCs w:val="32"/>
           <w:lang w:val="en-US"/>
         </w:rPr>
@@ -299,7 +275,6 @@
       </w:r>
       <w:r>
         <w:rPr>
-          <w:sz w:val="32"/>
           <w:szCs w:val="32"/>
           <w:lang w:val="en-US"/>
         </w:rPr>
@@ -314,14 +289,12 @@
           <w:numId w:val="4"/>
         </w:numPr>
         <w:rPr>
-          <w:sz w:val="32"/>
           <w:szCs w:val="32"/>
           <w:lang w:val="en-US"/>
         </w:rPr>
       </w:pPr>
       <w:r>
         <w:rPr>
-          <w:sz w:val="32"/>
           <w:szCs w:val="32"/>
           <w:lang w:val="en-US"/>
         </w:rPr>
@@ -336,14 +309,12 @@
           <w:numId w:val="4"/>
         </w:numPr>
         <w:rPr>
-          <w:sz w:val="32"/>
           <w:szCs w:val="32"/>
           <w:lang w:val="en-US"/>
         </w:rPr>
       </w:pPr>
       <w:r>
         <w:rPr>
-          <w:sz w:val="32"/>
           <w:szCs w:val="32"/>
           <w:lang w:val="en-US"/>
         </w:rPr>
@@ -360,14 +331,12 @@
         <w:rPr>
           <w:b/>
           <w:bCs/>
-          <w:sz w:val="32"/>
           <w:szCs w:val="32"/>
           <w:lang w:val="en-US"/>
         </w:rPr>
       </w:pPr>
       <w:r>
         <w:rPr>
-          <w:sz w:val="32"/>
           <w:szCs w:val="32"/>
           <w:lang w:val="en-US"/>
         </w:rPr>
@@ -384,14 +353,12 @@
         <w:rPr>
           <w:b/>
           <w:bCs/>
-          <w:sz w:val="32"/>
           <w:szCs w:val="32"/>
           <w:lang w:val="en-US"/>
         </w:rPr>
       </w:pPr>
       <w:r>
         <w:rPr>
-          <w:sz w:val="32"/>
           <w:szCs w:val="32"/>
           <w:lang w:val="en-US"/>
         </w:rPr>
@@ -401,7 +368,6 @@
         <w:rPr>
           <w:b/>
           <w:bCs/>
-          <w:sz w:val="32"/>
           <w:szCs w:val="32"/>
           <w:lang w:val="en-US"/>
         </w:rPr>
@@ -409,7 +375,6 @@
       </w:r>
       <w:r>
         <w:rPr>
-          <w:sz w:val="32"/>
           <w:szCs w:val="32"/>
           <w:lang w:val="en-US"/>
         </w:rPr>
@@ -424,14 +389,12 @@
           <w:numId w:val="4"/>
         </w:numPr>
         <w:rPr>
-          <w:sz w:val="32"/>
           <w:szCs w:val="32"/>
           <w:lang w:val="en-US"/>
         </w:rPr>
       </w:pPr>
       <w:r>
         <w:rPr>
-          <w:sz w:val="32"/>
           <w:szCs w:val="32"/>
           <w:lang w:val="en-US"/>
         </w:rPr>
@@ -439,12 +402,1474 @@
       </w:r>
       <w:r>
         <w:rPr>
-          <w:sz w:val="32"/>
           <w:szCs w:val="32"/>
           <w:lang w:val="en-US"/>
         </w:rPr>
         <w:t xml:space="preserve"> host the project docs</w:t>
       </w:r>
+    </w:p>
+    <w:p>
+      <w:pPr>
+        <w:pStyle w:val="Heading1"/>
+        <w:rPr>
+          <w:lang w:val="en-US"/>
+        </w:rPr>
+      </w:pPr>
+      <w:r>
+        <w:rPr>
+          <w:lang w:val="en-US"/>
+        </w:rPr>
+        <w:t>Local vs Remote Repo</w:t>
+      </w:r>
+    </w:p>
+    <w:p>
+      <w:pPr>
+        <w:pStyle w:val="ListParagraph"/>
+        <w:numPr>
+          <w:ilvl w:val="0"/>
+          <w:numId w:val="5"/>
+        </w:numPr>
+        <w:rPr>
+          <w:lang w:val="en-US"/>
+        </w:rPr>
+      </w:pPr>
+      <w:r>
+        <w:rPr>
+          <w:b/>
+          <w:bCs/>
+          <w:lang w:val="en-US"/>
+        </w:rPr>
+        <w:t>Local Repository:</w:t>
+      </w:r>
+      <w:r>
+        <w:rPr>
+          <w:lang w:val="en-US"/>
+        </w:rPr>
+        <w:t xml:space="preserve"> A local repository is the Git repository stored on your computer.</w:t>
+      </w:r>
+    </w:p>
+    <w:p>
+      <w:pPr>
+        <w:pStyle w:val="ListParagraph"/>
+        <w:numPr>
+          <w:ilvl w:val="1"/>
+          <w:numId w:val="5"/>
+        </w:numPr>
+        <w:rPr>
+          <w:b/>
+          <w:bCs/>
+          <w:lang w:val="en-US"/>
+        </w:rPr>
+      </w:pPr>
+      <w:r>
+        <w:rPr>
+          <w:lang w:val="en-US"/>
+        </w:rPr>
+        <w:t>Everything happens on your machine only.</w:t>
+      </w:r>
+    </w:p>
+    <w:p>
+      <w:pPr>
+        <w:pStyle w:val="ListParagraph"/>
+        <w:numPr>
+          <w:ilvl w:val="0"/>
+          <w:numId w:val="5"/>
+        </w:numPr>
+        <w:rPr>
+          <w:b/>
+          <w:bCs/>
+          <w:lang w:val="en-US"/>
+        </w:rPr>
+      </w:pPr>
+      <w:r>
+        <w:rPr>
+          <w:b/>
+          <w:bCs/>
+          <w:lang w:val="en-US"/>
+        </w:rPr>
+        <w:lastRenderedPageBreak/>
+        <w:t>Remote Repository:</w:t>
+      </w:r>
+      <w:r>
+        <w:rPr>
+          <w:b/>
+          <w:bCs/>
+          <w:lang w:val="en-US"/>
+        </w:rPr>
+        <w:t xml:space="preserve"> </w:t>
+      </w:r>
+      <w:r>
+        <w:rPr>
+          <w:lang w:val="en-US"/>
+        </w:rPr>
+        <w:t>A remote repository is the Git repository stored on a server.</w:t>
+      </w:r>
+    </w:p>
+    <w:p>
+      <w:pPr>
+        <w:ind w:firstLine="720"/>
+        <w:rPr>
+          <w:lang w:val="en-US"/>
+        </w:rPr>
+      </w:pPr>
+      <w:r>
+        <w:rPr>
+          <w:lang w:val="en-US"/>
+        </w:rPr>
+        <w:t>It is used for:</w:t>
+      </w:r>
+    </w:p>
+    <w:p>
+      <w:pPr>
+        <w:pStyle w:val="ListParagraph"/>
+        <w:numPr>
+          <w:ilvl w:val="1"/>
+          <w:numId w:val="5"/>
+        </w:numPr>
+        <w:rPr>
+          <w:lang w:val="en-US"/>
+        </w:rPr>
+      </w:pPr>
+      <w:r>
+        <w:rPr>
+          <w:lang w:val="en-US"/>
+        </w:rPr>
+        <w:t>Backup</w:t>
+      </w:r>
+    </w:p>
+    <w:p>
+      <w:pPr>
+        <w:pStyle w:val="ListParagraph"/>
+        <w:numPr>
+          <w:ilvl w:val="1"/>
+          <w:numId w:val="5"/>
+        </w:numPr>
+        <w:rPr>
+          <w:lang w:val="en-US"/>
+        </w:rPr>
+      </w:pPr>
+      <w:r>
+        <w:rPr>
+          <w:lang w:val="en-US"/>
+        </w:rPr>
+        <w:t>Team collaboration</w:t>
+      </w:r>
+    </w:p>
+    <w:p>
+      <w:pPr>
+        <w:pStyle w:val="ListParagraph"/>
+        <w:numPr>
+          <w:ilvl w:val="1"/>
+          <w:numId w:val="5"/>
+        </w:numPr>
+        <w:rPr>
+          <w:lang w:val="en-US"/>
+        </w:rPr>
+      </w:pPr>
+      <w:r>
+        <w:rPr>
+          <w:lang w:val="en-US"/>
+        </w:rPr>
+        <w:t>Sharing code</w:t>
+      </w:r>
+    </w:p>
+    <w:p>
+      <w:pPr>
+        <w:pStyle w:val="ListParagraph"/>
+        <w:numPr>
+          <w:ilvl w:val="1"/>
+          <w:numId w:val="5"/>
+        </w:numPr>
+        <w:rPr>
+          <w:lang w:val="en-US"/>
+        </w:rPr>
+      </w:pPr>
+      <w:r>
+        <w:rPr>
+          <w:lang w:val="en-US"/>
+        </w:rPr>
+        <w:t>Deployment workflow</w:t>
+      </w:r>
+    </w:p>
+    <w:p>
+      <w:pPr>
+        <w:pStyle w:val="ListParagraph"/>
+        <w:rPr>
+          <w:lang w:val="en-US"/>
+        </w:rPr>
+      </w:pPr>
+      <w:r>
+        <w:rPr>
+          <w:lang w:val="en-US"/>
+        </w:rPr>
+        <w:t>Server Platforms:</w:t>
+      </w:r>
+    </w:p>
+    <w:p>
+      <w:pPr>
+        <w:pStyle w:val="ListParagraph"/>
+        <w:numPr>
+          <w:ilvl w:val="0"/>
+          <w:numId w:val="6"/>
+        </w:numPr>
+        <w:rPr>
+          <w:lang w:val="en-US"/>
+        </w:rPr>
+      </w:pPr>
+      <w:r>
+        <w:rPr>
+          <w:lang w:val="en-US"/>
+        </w:rPr>
+        <w:t>GitHub</w:t>
+      </w:r>
+    </w:p>
+    <w:p>
+      <w:pPr>
+        <w:pStyle w:val="ListParagraph"/>
+        <w:numPr>
+          <w:ilvl w:val="0"/>
+          <w:numId w:val="6"/>
+        </w:numPr>
+        <w:rPr>
+          <w:lang w:val="en-US"/>
+        </w:rPr>
+      </w:pPr>
+      <w:r>
+        <w:rPr>
+          <w:lang w:val="en-US"/>
+        </w:rPr>
+        <w:t>GitLab</w:t>
+      </w:r>
+    </w:p>
+    <w:p>
+      <w:pPr>
+        <w:pStyle w:val="ListParagraph"/>
+        <w:numPr>
+          <w:ilvl w:val="0"/>
+          <w:numId w:val="6"/>
+        </w:numPr>
+        <w:rPr>
+          <w:lang w:val="en-US"/>
+        </w:rPr>
+      </w:pPr>
+      <w:r>
+        <w:rPr>
+          <w:lang w:val="en-US"/>
+        </w:rPr>
+        <w:t>Bitbucket, etc.</w:t>
+      </w:r>
+    </w:p>
+    <w:p>
+      <w:pPr>
+        <w:pStyle w:val="Heading1"/>
+        <w:rPr>
+          <w:lang w:val="en-US"/>
+        </w:rPr>
+      </w:pPr>
+      <w:r>
+        <w:rPr>
+          <w:lang w:val="en-US"/>
+        </w:rPr>
+        <w:t>Git workflow:</w:t>
+      </w:r>
+    </w:p>
+    <w:p>
+      <w:pPr>
+        <w:rPr>
+          <w:lang w:val="en-US"/>
+        </w:rPr>
+      </w:pPr>
+      <w:r>
+        <w:rPr>
+          <w:lang w:val="en-US"/>
+        </w:rPr>
+        <w:tab/>
+        <w:t xml:space="preserve">Write code </w:t>
+      </w:r>
+      <w:r>
+        <w:t xml:space="preserve">→ </w:t>
+      </w:r>
+      <w:r>
+        <w:t xml:space="preserve">Track Changes </w:t>
+      </w:r>
+      <w:r>
+        <w:t xml:space="preserve">→ </w:t>
+      </w:r>
+      <w:r>
+        <w:t xml:space="preserve">Commit </w:t>
+      </w:r>
+      <w:r>
+        <w:t xml:space="preserve">→ </w:t>
+      </w:r>
+      <w:r>
+        <w:t xml:space="preserve">Push </w:t>
+      </w:r>
+      <w:r>
+        <w:t xml:space="preserve">→ </w:t>
+      </w:r>
+      <w:r>
+        <w:t>collaborate</w:t>
+      </w:r>
+    </w:p>
+    <w:p>
+      <w:pPr>
+        <w:rPr>
+          <w:lang w:val="en-US"/>
+        </w:rPr>
+      </w:pPr>
+      <w:r>
+        <w:rPr>
+          <w:noProof/>
+          <w:lang w:val="en-US"/>
+        </w:rPr>
+        <w:drawing>
+          <wp:inline distT="0" distB="0" distL="0" distR="0" wp14:anchorId="1D65E668" wp14:editId="1CEE9320">
+            <wp:extent cx="5731510" cy="3136265"/>
+            <wp:effectExtent l="0" t="0" r="2540" b="6985"/>
+            <wp:docPr id="1615480579" name="Picture 1"/>
+            <wp:cNvGraphicFramePr>
+              <a:graphicFrameLocks xmlns:a="http://schemas.openxmlformats.org/drawingml/2006/main" noChangeAspect="1"/>
+            </wp:cNvGraphicFramePr>
+            <a:graphic xmlns:a="http://schemas.openxmlformats.org/drawingml/2006/main">
+              <a:graphicData uri="http://schemas.openxmlformats.org/drawingml/2006/picture">
+                <pic:pic xmlns:pic="http://schemas.openxmlformats.org/drawingml/2006/picture">
+                  <pic:nvPicPr>
+                    <pic:cNvPr id="1615480579" name="Picture 1615480579"/>
+                    <pic:cNvPicPr/>
+                  </pic:nvPicPr>
+                  <pic:blipFill>
+                    <a:blip r:embed="rId5" cstate="print">
+                      <a:extLst>
+                        <a:ext uri="{28A0092B-C50C-407E-A947-70E740481C1C}">
+                          <a14:useLocalDpi xmlns:a14="http://schemas.microsoft.com/office/drawing/2010/main" val="0"/>
+                        </a:ext>
+                      </a:extLst>
+                    </a:blip>
+                    <a:stretch>
+                      <a:fillRect/>
+                    </a:stretch>
+                  </pic:blipFill>
+                  <pic:spPr>
+                    <a:xfrm>
+                      <a:off x="0" y="0"/>
+                      <a:ext cx="5731510" cy="3136265"/>
+                    </a:xfrm>
+                    <a:prstGeom prst="rect">
+                      <a:avLst/>
+                    </a:prstGeom>
+                  </pic:spPr>
+                </pic:pic>
+              </a:graphicData>
+            </a:graphic>
+          </wp:inline>
+        </w:drawing>
+      </w:r>
+    </w:p>
+    <w:p>
+      <w:pPr>
+        <w:rPr>
+          <w:lang w:val="en-US"/>
+        </w:rPr>
+      </w:pPr>
+    </w:p>
+    <w:p>
+      <w:pPr>
+        <w:rPr>
+          <w:lang w:val="en-US"/>
+        </w:rPr>
+      </w:pPr>
+      <w:r>
+        <w:rPr>
+          <w:b/>
+          <w:bCs/>
+          <w:lang w:val="en-US"/>
+        </w:rPr>
+        <w:t>Git add</w:t>
+      </w:r>
+      <w:r>
+        <w:rPr>
+          <w:b/>
+          <w:bCs/>
+          <w:lang w:val="en-US"/>
+        </w:rPr>
+        <w:t xml:space="preserve"> </w:t>
+      </w:r>
+      <w:r>
+        <w:rPr>
+          <w:b/>
+          <w:bCs/>
+          <w:lang w:val="en-US"/>
+        </w:rPr>
+        <w:t>.</w:t>
+      </w:r>
+      <w:r>
+        <w:rPr>
+          <w:lang w:val="en-US"/>
+        </w:rPr>
+        <w:t xml:space="preserve"> The command is to track the changes on the local. Or we can say staging area.</w:t>
+      </w:r>
+    </w:p>
+    <w:p>
+      <w:pPr>
+        <w:rPr>
+          <w:lang w:val="en-US"/>
+        </w:rPr>
+      </w:pPr>
+      <w:r>
+        <w:rPr>
+          <w:b/>
+          <w:bCs/>
+          <w:lang w:val="en-US"/>
+        </w:rPr>
+        <w:lastRenderedPageBreak/>
+        <w:t>Commit changes</w:t>
+      </w:r>
+      <w:r>
+        <w:rPr>
+          <w:b/>
+          <w:bCs/>
+          <w:lang w:val="en-US"/>
+        </w:rPr>
+        <w:t xml:space="preserve">: </w:t>
+      </w:r>
+      <w:r>
+        <w:rPr>
+          <w:lang w:val="en-US"/>
+        </w:rPr>
+        <w:t>Commit saves the snapshot of your code.</w:t>
+      </w:r>
+      <w:r>
+        <w:rPr>
+          <w:lang w:val="en-US"/>
+        </w:rPr>
+        <w:t xml:space="preserve"> Finalize the changes.</w:t>
+      </w:r>
+    </w:p>
+    <w:p>
+      <w:pPr>
+        <w:ind w:firstLine="360"/>
+      </w:pPr>
+      <w:r>
+        <w:t>A commit contains:</w:t>
+      </w:r>
+    </w:p>
+    <w:p>
+      <w:pPr>
+        <w:pStyle w:val="ListParagraph"/>
+        <w:numPr>
+          <w:ilvl w:val="0"/>
+          <w:numId w:val="8"/>
+        </w:numPr>
+      </w:pPr>
+      <w:r>
+        <w:t xml:space="preserve">Code changes </w:t>
+      </w:r>
+    </w:p>
+    <w:p>
+      <w:pPr>
+        <w:pStyle w:val="ListParagraph"/>
+        <w:numPr>
+          <w:ilvl w:val="0"/>
+          <w:numId w:val="8"/>
+        </w:numPr>
+      </w:pPr>
+      <w:r>
+        <w:t xml:space="preserve">Commit message </w:t>
+      </w:r>
+    </w:p>
+    <w:p>
+      <w:pPr>
+        <w:pStyle w:val="ListParagraph"/>
+        <w:numPr>
+          <w:ilvl w:val="0"/>
+          <w:numId w:val="8"/>
+        </w:numPr>
+      </w:pPr>
+      <w:r>
+        <w:t xml:space="preserve">Author </w:t>
+      </w:r>
+    </w:p>
+    <w:p>
+      <w:pPr>
+        <w:pStyle w:val="ListParagraph"/>
+        <w:numPr>
+          <w:ilvl w:val="0"/>
+          <w:numId w:val="8"/>
+        </w:numPr>
+      </w:pPr>
+      <w:r>
+        <w:t>Timestamp</w:t>
+      </w:r>
+    </w:p>
+    <w:p>
+      <w:r>
+        <w:rPr>
+          <w:b/>
+          <w:bCs/>
+        </w:rPr>
+        <w:t>Push to Remote Repository</w:t>
+      </w:r>
+      <w:r>
+        <w:rPr>
+          <w:b/>
+          <w:bCs/>
+        </w:rPr>
+        <w:t xml:space="preserve">: </w:t>
+      </w:r>
+      <w:r>
+        <w:t>When</w:t>
+      </w:r>
+      <w:r>
+        <w:t xml:space="preserve"> you commit code, all the changes are reflected </w:t>
+      </w:r>
+      <w:r>
+        <w:t>locally, and when you push the code, all changes are reflected in the</w:t>
+      </w:r>
+      <w:r>
+        <w:t xml:space="preserve"> remote repo.</w:t>
+      </w:r>
+    </w:p>
+    <w:p/>
+    <w:p>
+      <w:r>
+        <w:rPr>
+          <w:b/>
+          <w:bCs/>
+        </w:rPr>
+        <w:t>.gitignore</w:t>
+      </w:r>
+      <w:r>
+        <w:rPr>
+          <w:b/>
+          <w:bCs/>
+        </w:rPr>
+        <w:t xml:space="preserve">: </w:t>
+      </w:r>
+      <w:r>
+        <w:t>A .gitignore file tells</w:t>
+      </w:r>
+      <w:r>
+        <w:t xml:space="preserve"> Git which files or folders should not be tracked.</w:t>
+      </w:r>
+    </w:p>
+    <w:p/>
+    <w:p>
+      <w:pPr>
+        <w:pStyle w:val="Heading1"/>
+      </w:pPr>
+      <w:r>
+        <w:t>Git Restore vs Git Revert</w:t>
+      </w:r>
+    </w:p>
+    <w:p>
+      <w:r>
+        <w:tab/>
+      </w:r>
+      <w:r>
+        <w:rPr>
+          <w:b/>
+          <w:bCs/>
+        </w:rPr>
+        <w:t>Git Restore:</w:t>
+      </w:r>
+      <w:r>
+        <w:rPr>
+          <w:b/>
+          <w:bCs/>
+        </w:rPr>
+        <w:t xml:space="preserve"> </w:t>
+      </w:r>
+      <w:r>
+        <w:t xml:space="preserve">Git restore Undo local/uncommitted </w:t>
+      </w:r>
+      <w:r>
+        <w:t>changes</w:t>
+      </w:r>
+      <w:r>
+        <w:t>. Or we can say that discard changes in your local working directory.</w:t>
+      </w:r>
+    </w:p>
+    <w:p>
+      <w:pPr>
+        <w:pStyle w:val="ListParagraph"/>
+        <w:numPr>
+          <w:ilvl w:val="0"/>
+          <w:numId w:val="9"/>
+        </w:numPr>
+      </w:pPr>
+      <w:r>
+        <w:rPr>
+          <w:b/>
+          <w:bCs/>
+        </w:rPr>
+        <w:t>git restore file_name:</w:t>
+      </w:r>
+      <w:r>
+        <w:t xml:space="preserve"> this command is for a specific file. Undo or discard a single file. </w:t>
+      </w:r>
+    </w:p>
+    <w:p>
+      <w:pPr>
+        <w:pStyle w:val="ListParagraph"/>
+        <w:numPr>
+          <w:ilvl w:val="0"/>
+          <w:numId w:val="9"/>
+        </w:numPr>
+      </w:pPr>
+      <w:r>
+        <w:rPr>
+          <w:b/>
+          <w:bCs/>
+        </w:rPr>
+        <w:t xml:space="preserve">git restore file1 file2: </w:t>
+      </w:r>
+      <w:r>
+        <w:t>Used for multiple files.</w:t>
+      </w:r>
+    </w:p>
+    <w:p>
+      <w:pPr>
+        <w:pStyle w:val="ListParagraph"/>
+        <w:numPr>
+          <w:ilvl w:val="0"/>
+          <w:numId w:val="9"/>
+        </w:numPr>
+      </w:pPr>
+      <w:r>
+        <w:rPr>
+          <w:b/>
+          <w:bCs/>
+        </w:rPr>
+        <w:t xml:space="preserve">git restore . </w:t>
+      </w:r>
+      <w:r>
+        <w:t>This command is for all files. Undo or discard all files.</w:t>
+      </w:r>
+    </w:p>
+    <w:p>
+      <w:pPr>
+        <w:pStyle w:val="ListParagraph"/>
+        <w:numPr>
+          <w:ilvl w:val="0"/>
+          <w:numId w:val="9"/>
+        </w:numPr>
+      </w:pPr>
+      <w:r>
+        <w:t xml:space="preserve">All </w:t>
+      </w:r>
+      <w:r>
+        <w:t xml:space="preserve">git restore commands are run before the </w:t>
+      </w:r>
+      <w:r>
+        <w:rPr>
+          <w:b/>
+          <w:bCs/>
+        </w:rPr>
+        <w:t xml:space="preserve">commit </w:t>
+      </w:r>
+      <w:r>
+        <w:rPr>
+          <w:b/>
+          <w:bCs/>
+        </w:rPr>
+        <w:t>command</w:t>
+      </w:r>
+      <w:r>
+        <w:t xml:space="preserve"> if you want to undo your code locally.</w:t>
+      </w:r>
+    </w:p>
+    <w:p>
+      <w:pPr>
+        <w:rPr>
+          <w:b/>
+          <w:bCs/>
+        </w:rPr>
+      </w:pPr>
+      <w:r>
+        <w:rPr>
+          <w:b/>
+          <w:bCs/>
+        </w:rPr>
+        <w:t>Use it when</w:t>
+      </w:r>
+      <w:r>
+        <w:rPr>
+          <w:b/>
+          <w:bCs/>
+        </w:rPr>
+        <w:t xml:space="preserve"> git restore</w:t>
+      </w:r>
+      <w:r>
+        <w:rPr>
+          <w:b/>
+          <w:bCs/>
+        </w:rPr>
+        <w:t>:</w:t>
+      </w:r>
+    </w:p>
+    <w:p>
+      <w:pPr>
+        <w:pStyle w:val="ListParagraph"/>
+        <w:numPr>
+          <w:ilvl w:val="0"/>
+          <w:numId w:val="11"/>
+        </w:numPr>
+      </w:pPr>
+      <w:r>
+        <w:lastRenderedPageBreak/>
+        <w:t xml:space="preserve">You edited a file </w:t>
+      </w:r>
+    </w:p>
+    <w:p>
+      <w:pPr>
+        <w:pStyle w:val="ListParagraph"/>
+        <w:numPr>
+          <w:ilvl w:val="0"/>
+          <w:numId w:val="11"/>
+        </w:numPr>
+      </w:pPr>
+      <w:r>
+        <w:t xml:space="preserve">You haven't committed yet </w:t>
+      </w:r>
+    </w:p>
+    <w:p>
+      <w:pPr>
+        <w:pStyle w:val="ListParagraph"/>
+        <w:numPr>
+          <w:ilvl w:val="0"/>
+          <w:numId w:val="11"/>
+        </w:numPr>
+      </w:pPr>
+      <w:r>
+        <w:t>You want to remove local changes</w:t>
+      </w:r>
+    </w:p>
+    <w:p>
+      <w:pPr>
+        <w:rPr>
+          <w:b/>
+          <w:bCs/>
+        </w:rPr>
+      </w:pPr>
+      <w:r>
+        <w:rPr>
+          <w:b/>
+          <w:bCs/>
+        </w:rPr>
+        <w:t>Wh</w:t>
+      </w:r>
+      <w:r>
+        <w:rPr>
+          <w:b/>
+          <w:bCs/>
+        </w:rPr>
+        <w:t>en your code is staging, how to discard?</w:t>
+      </w:r>
+    </w:p>
+    <w:p>
+      <w:r>
+        <w:rPr>
+          <w:b/>
+          <w:bCs/>
+        </w:rPr>
+        <w:tab/>
+      </w:r>
+      <w:r>
+        <w:t>When you code in the staging area, then 1</w:t>
+      </w:r>
+      <w:r>
+        <w:rPr>
+          <w:vertAlign w:val="superscript"/>
+        </w:rPr>
+        <w:t>st</w:t>
+      </w:r>
+      <w:r>
+        <w:t xml:space="preserve"> you undo from the staging area after you undo changes. Follow below workflow</w:t>
+      </w:r>
+    </w:p>
+    <w:p>
+      <w:pPr>
+        <w:pStyle w:val="ListParagraph"/>
+        <w:numPr>
+          <w:ilvl w:val="0"/>
+          <w:numId w:val="13"/>
+        </w:numPr>
+      </w:pPr>
+      <w:r>
+        <w:t>git restore . –staged: for all files</w:t>
+      </w:r>
+    </w:p>
+    <w:p>
+      <w:pPr>
+        <w:pStyle w:val="ListParagraph"/>
+        <w:numPr>
+          <w:ilvl w:val="0"/>
+          <w:numId w:val="13"/>
+        </w:numPr>
+      </w:pPr>
+      <w:r>
+        <w:t>git restore –staged file1 file2</w:t>
+      </w:r>
+    </w:p>
+    <w:p/>
+    <w:p>
+      <w:r>
+        <w:t>Modify file</w:t>
+      </w:r>
+    </w:p>
+    <w:p>
+      <w:r>
+        <w:t>↓</w:t>
+      </w:r>
+    </w:p>
+    <w:p>
+      <w:r>
+        <w:t>git add</w:t>
+      </w:r>
+    </w:p>
+    <w:p>
+      <w:r>
+        <w:t>↓</w:t>
+      </w:r>
+    </w:p>
+    <w:p>
+      <w:pPr>
+        <w:rPr>
+          <w:b/>
+          <w:bCs/>
+        </w:rPr>
+      </w:pPr>
+      <w:r>
+        <w:rPr>
+          <w:b/>
+          <w:bCs/>
+        </w:rPr>
+        <w:t>Staging Area</w:t>
+      </w:r>
+    </w:p>
+    <w:p>
+      <w:pPr>
+        <w:rPr>
+          <w:b/>
+          <w:bCs/>
+        </w:rPr>
+      </w:pPr>
+      <w:r>
+        <w:rPr>
+          <w:b/>
+          <w:bCs/>
+        </w:rPr>
+        <w:t>Undo staging:</w:t>
+      </w:r>
+    </w:p>
+    <w:p>
+      <w:r>
+        <w:t>git restore --staged file</w:t>
+      </w:r>
+    </w:p>
+    <w:p>
+      <w:pPr>
+        <w:rPr>
+          <w:b/>
+          <w:bCs/>
+        </w:rPr>
+      </w:pPr>
+      <w:r>
+        <w:rPr>
+          <w:b/>
+          <w:bCs/>
+        </w:rPr>
+        <w:t>Undo file changes:</w:t>
+      </w:r>
+    </w:p>
+    <w:p>
+      <w:r>
+        <w:t>git restore file</w:t>
+      </w:r>
+    </w:p>
+    <w:p>
+      <w:pPr>
+        <w:rPr>
+          <w:b/>
+          <w:bCs/>
+        </w:rPr>
+      </w:pPr>
+    </w:p>
+    <w:p>
+      <w:pPr>
+        <w:ind w:left="720"/>
+      </w:pPr>
+      <w:r>
+        <w:rPr>
+          <w:b/>
+          <w:bCs/>
+        </w:rPr>
+        <w:t>Git Revert</w:t>
+      </w:r>
+      <w:r>
+        <w:rPr>
+          <w:b/>
+          <w:bCs/>
+        </w:rPr>
+        <w:t xml:space="preserve">: </w:t>
+      </w:r>
+      <w:r>
+        <w:t xml:space="preserve">Git revert is undoing a commit. It does not delete history; it creates a </w:t>
+      </w:r>
+      <w:r>
+        <w:rPr>
+          <w:b/>
+          <w:bCs/>
+        </w:rPr>
+        <w:t>new commit</w:t>
+      </w:r>
+      <w:r>
+        <w:t xml:space="preserve"> that reverses the old commit.</w:t>
+      </w:r>
+    </w:p>
+    <w:p>
+      <w:pPr>
+        <w:ind w:left="720"/>
+      </w:pPr>
+      <w:r>
+        <w:t xml:space="preserve"> It undoes the remotely and locally.</w:t>
+      </w:r>
+    </w:p>
+    <w:p>
+      <w:pPr>
+        <w:ind w:left="720"/>
+      </w:pPr>
+      <w:r>
+        <w:rPr>
+          <w:b/>
+          <w:bCs/>
+        </w:rPr>
+        <w:t>Command:</w:t>
+      </w:r>
+      <w:r>
+        <w:t xml:space="preserve"> git revert last commit</w:t>
+      </w:r>
+    </w:p>
+    <w:p>
+      <w:pPr>
+        <w:ind w:left="720"/>
+        <w:rPr>
+          <w:b/>
+          <w:bCs/>
+        </w:rPr>
+      </w:pPr>
+      <w:r>
+        <w:rPr>
+          <w:b/>
+          <w:bCs/>
+        </w:rPr>
+        <w:lastRenderedPageBreak/>
+        <w:t>Use when:</w:t>
+      </w:r>
+    </w:p>
+    <w:p>
+      <w:pPr>
+        <w:pStyle w:val="ListParagraph"/>
+        <w:numPr>
+          <w:ilvl w:val="0"/>
+          <w:numId w:val="15"/>
+        </w:numPr>
+      </w:pPr>
+      <w:r>
+        <w:t xml:space="preserve">Commit already exists </w:t>
+      </w:r>
+    </w:p>
+    <w:p>
+      <w:pPr>
+        <w:pStyle w:val="ListParagraph"/>
+        <w:numPr>
+          <w:ilvl w:val="0"/>
+          <w:numId w:val="15"/>
+        </w:numPr>
+      </w:pPr>
+      <w:r>
+        <w:t xml:space="preserve">Commit may already be pushed </w:t>
+      </w:r>
+    </w:p>
+    <w:p>
+      <w:pPr>
+        <w:pStyle w:val="ListParagraph"/>
+        <w:numPr>
+          <w:ilvl w:val="0"/>
+          <w:numId w:val="15"/>
+        </w:numPr>
+      </w:pPr>
+      <w:r>
+        <w:t>Safe for team projects</w:t>
+      </w:r>
+    </w:p>
+    <w:p>
+      <w:r>
+        <w:t xml:space="preserve">Undo </w:t>
+      </w:r>
+      <w:r>
+        <w:t xml:space="preserve">the </w:t>
+      </w:r>
+      <w:r>
+        <w:t>most recent commit</w:t>
+      </w:r>
+      <w:r>
+        <w:t>.</w:t>
+      </w:r>
+    </w:p>
+    <w:p>
+      <w:pPr>
+        <w:rPr>
+          <w:b/>
+          <w:bCs/>
+        </w:rPr>
+      </w:pPr>
+      <w:r>
+        <w:rPr>
+          <w:b/>
+          <w:bCs/>
+        </w:rPr>
+        <w:t>Revert Without Opening Editor</w:t>
+      </w:r>
+      <w:r>
+        <w:rPr>
+          <w:b/>
+          <w:bCs/>
+        </w:rPr>
+        <w:t>:</w:t>
+      </w:r>
+    </w:p>
+    <w:p>
+      <w:r>
+        <w:t>git revert --no-edit HEAD</w:t>
+      </w:r>
+    </w:p>
+    <w:p/>
+    <w:p>
+      <w:pPr>
+        <w:pStyle w:val="Heading1"/>
+      </w:pPr>
+      <w:r>
+        <w:t>Git Reset</w:t>
+      </w:r>
+    </w:p>
+    <w:p>
+      <w:r>
+        <w:tab/>
+        <w:t>The Git reset command undoes the last changes, but it also deletes the commit or history from both the local repository and the remote repository.</w:t>
+      </w:r>
+    </w:p>
+    <w:p>
+      <w:r>
+        <w:t>It can affect:</w:t>
+      </w:r>
+    </w:p>
+    <w:p>
+      <w:pPr>
+        <w:pStyle w:val="ListParagraph"/>
+        <w:numPr>
+          <w:ilvl w:val="0"/>
+          <w:numId w:val="16"/>
+        </w:numPr>
+      </w:pPr>
+      <w:r>
+        <w:t>Commit history</w:t>
+      </w:r>
+    </w:p>
+    <w:p>
+      <w:pPr>
+        <w:pStyle w:val="ListParagraph"/>
+        <w:numPr>
+          <w:ilvl w:val="0"/>
+          <w:numId w:val="16"/>
+        </w:numPr>
+      </w:pPr>
+      <w:r>
+        <w:t>Staging Area</w:t>
+      </w:r>
+    </w:p>
+    <w:p>
+      <w:pPr>
+        <w:pStyle w:val="ListParagraph"/>
+        <w:numPr>
+          <w:ilvl w:val="0"/>
+          <w:numId w:val="16"/>
+        </w:numPr>
+      </w:pPr>
+      <w:r>
+        <w:t>Working Directory</w:t>
+      </w:r>
+    </w:p>
+    <w:p>
+      <w:pPr>
+        <w:rPr>
+          <w:b/>
+          <w:bCs/>
+        </w:rPr>
+      </w:pPr>
+      <w:r>
+        <w:rPr>
+          <w:b/>
+          <w:bCs/>
+        </w:rPr>
+        <w:t>Understand these 3 areas:</w:t>
+      </w:r>
+    </w:p>
+    <w:p>
+      <w:r>
+        <w:t>Working Directory(files)  →  Staging Area(git add)  →  Local Repository(commits)</w:t>
+      </w:r>
+    </w:p>
+    <w:p/>
+    <w:p>
+      <w:pPr>
+        <w:pStyle w:val="ListParagraph"/>
+        <w:numPr>
+          <w:ilvl w:val="0"/>
+          <w:numId w:val="17"/>
+        </w:numPr>
+        <w:rPr>
+          <w:b/>
+          <w:bCs/>
+        </w:rPr>
+      </w:pPr>
+      <w:r>
+        <w:rPr>
+          <w:b/>
+          <w:bCs/>
+        </w:rPr>
+        <w:t xml:space="preserve">git reset </w:t>
+      </w:r>
+      <w:r>
+        <w:rPr>
+          <w:b/>
+          <w:bCs/>
+        </w:rPr>
+        <w:t>–</w:t>
+      </w:r>
+      <w:r>
+        <w:rPr>
+          <w:b/>
+          <w:bCs/>
+        </w:rPr>
+        <w:t>soft</w:t>
+      </w:r>
+    </w:p>
+    <w:p>
+      <w:pPr>
+        <w:ind w:left="720"/>
+      </w:pPr>
+      <w:r>
+        <w:rPr>
+          <w:b/>
+          <w:bCs/>
+        </w:rPr>
+        <w:t xml:space="preserve">    </w:t>
+      </w:r>
+      <w:r>
+        <w:t>It is undo the commit but keep the changes staged.</w:t>
+      </w:r>
+    </w:p>
+    <w:p>
+      <w:pPr>
+        <w:ind w:left="720"/>
+      </w:pPr>
+      <w:r>
+        <w:t>Undo the last commit command:</w:t>
+      </w:r>
+    </w:p>
+    <w:p>
+      <w:pPr>
+        <w:ind w:left="720"/>
+      </w:pPr>
+      <w:r>
+        <w:t>git reset –soft HEAD~1</w:t>
+      </w:r>
+    </w:p>
+    <w:p>
+      <w:pPr>
+        <w:ind w:left="720"/>
+      </w:pPr>
+      <w:r>
+        <w:lastRenderedPageBreak/>
+        <w:t>The above command deletes the history of the commit, but changes remain in staging.</w:t>
+      </w:r>
+    </w:p>
+    <w:p>
+      <w:pPr>
+        <w:ind w:left="720"/>
+      </w:pPr>
+    </w:p>
+    <w:p>
+      <w:pPr>
+        <w:ind w:left="720"/>
+      </w:pPr>
+      <w:r>
+        <w:t>git log and git log –oneline:  Show the history on Git.</w:t>
+      </w:r>
+      <w:r>
+        <w:t>\</w:t>
+      </w:r>
+    </w:p>
+    <w:p>
+      <w:pPr>
+        <w:ind w:left="720"/>
+      </w:pPr>
+    </w:p>
+    <w:p>
+      <w:pPr>
+        <w:pStyle w:val="ListParagraph"/>
+        <w:numPr>
+          <w:ilvl w:val="0"/>
+          <w:numId w:val="17"/>
+        </w:numPr>
+        <w:rPr>
+          <w:b/>
+          <w:bCs/>
+        </w:rPr>
+      </w:pPr>
+      <w:r>
+        <w:rPr>
+          <w:b/>
+          <w:bCs/>
+        </w:rPr>
+        <w:t>git reset –mixed (Default)</w:t>
+      </w:r>
+    </w:p>
+    <w:p>
+      <w:pPr>
+        <w:ind w:left="1440"/>
+      </w:pPr>
+      <w:r>
+        <w:t xml:space="preserve">This is the default reset mode, undo the changes and </w:t>
+      </w:r>
+      <w:r>
+        <w:t>onstage</w:t>
+      </w:r>
+      <w:r>
+        <w:t xml:space="preserve"> </w:t>
+      </w:r>
+      <w:r>
+        <w:t>changes.</w:t>
+      </w:r>
+    </w:p>
+    <w:p>
+      <w:pPr>
+        <w:ind w:left="1440"/>
+      </w:pPr>
+      <w:r>
+        <w:t>git reset –mixed HEAD~1 or git reset HEAD~1</w:t>
+      </w:r>
+    </w:p>
+    <w:p>
+      <w:pPr>
+        <w:pStyle w:val="ListParagraph"/>
+        <w:numPr>
+          <w:ilvl w:val="0"/>
+          <w:numId w:val="17"/>
+        </w:numPr>
+        <w:rPr>
+          <w:b/>
+          <w:bCs/>
+        </w:rPr>
+      </w:pPr>
+      <w:r>
+        <w:rPr>
+          <w:b/>
+          <w:bCs/>
+        </w:rPr>
+        <w:t>git reset –hard</w:t>
+      </w:r>
+    </w:p>
+    <w:p>
+      <w:pPr>
+        <w:ind w:left="720" w:firstLine="720"/>
+        <w:rPr>
+          <w:b/>
+          <w:bCs/>
+        </w:rPr>
+      </w:pPr>
+      <w:r>
+        <w:rPr>
+          <w:rFonts w:ascii="Segoe UI Emoji" w:hAnsi="Segoe UI Emoji" w:cs="Segoe UI Emoji"/>
+        </w:rPr>
+        <w:t>⚠️</w:t>
+      </w:r>
+      <w:r>
+        <w:t xml:space="preserve"> Dangerous command.</w:t>
+      </w:r>
+      <w:r>
+        <w:rPr>
+          <w:b/>
+          <w:bCs/>
+        </w:rPr>
+        <w:tab/>
+      </w:r>
+    </w:p>
+    <w:p>
+      <w:pPr>
+        <w:ind w:left="720" w:firstLine="720"/>
+      </w:pPr>
+      <w:r>
+        <w:t>It is undoing the changes and deleting them completely.</w:t>
+      </w:r>
+    </w:p>
+    <w:p>
+      <w:pPr>
+        <w:ind w:left="720" w:firstLine="720"/>
+      </w:pPr>
+      <w:r>
+        <w:t>git reset –hard HEAD~1</w:t>
+      </w:r>
+    </w:p>
+    <w:p>
+      <w:pPr>
+        <w:ind w:left="720" w:firstLine="720"/>
+      </w:pPr>
+    </w:p>
+    <w:p>
+      <w:pPr>
+        <w:rPr>
+          <w:b/>
+          <w:bCs/>
+        </w:rPr>
+      </w:pPr>
+      <w:r>
+        <w:rPr>
+          <w:b/>
+          <w:bCs/>
+        </w:rPr>
+        <w:t>Changes deleted from:</w:t>
+      </w:r>
+    </w:p>
+    <w:p>
+      <w:pPr>
+        <w:pStyle w:val="ListParagraph"/>
+        <w:numPr>
+          <w:ilvl w:val="0"/>
+          <w:numId w:val="19"/>
+        </w:numPr>
+      </w:pPr>
+      <w:r>
+        <w:t xml:space="preserve">Local Repository </w:t>
+      </w:r>
+    </w:p>
+    <w:p>
+      <w:pPr>
+        <w:pStyle w:val="ListParagraph"/>
+        <w:numPr>
+          <w:ilvl w:val="0"/>
+          <w:numId w:val="19"/>
+        </w:numPr>
+      </w:pPr>
+      <w:r>
+        <w:t xml:space="preserve">Staging Area </w:t>
+      </w:r>
+    </w:p>
+    <w:p>
+      <w:pPr>
+        <w:pStyle w:val="ListParagraph"/>
+        <w:numPr>
+          <w:ilvl w:val="0"/>
+          <w:numId w:val="19"/>
+        </w:numPr>
+      </w:pPr>
+      <w:r>
+        <w:t>Working Directory</w:t>
+      </w:r>
+    </w:p>
+    <w:p>
+      <w:r>
+        <w:rPr>
+          <w:b/>
+          <w:bCs/>
+        </w:rPr>
+        <w:t>Head Mean</w:t>
+      </w:r>
+      <w:r>
+        <w:rPr>
+          <w:b/>
+          <w:bCs/>
+        </w:rPr>
+        <w:t xml:space="preserve">ing: </w:t>
+      </w:r>
+      <w:r>
+        <w:t xml:space="preserve">HEAD points to your </w:t>
+      </w:r>
+      <w:r>
+        <w:rPr>
+          <w:b/>
+          <w:bCs/>
+        </w:rPr>
+        <w:t>current commit</w:t>
+      </w:r>
+      <w:r>
+        <w:t>.</w:t>
+      </w:r>
+    </w:p>
+    <w:p/>
+    <w:p>
+      <w:pPr>
+        <w:pStyle w:val="Heading1"/>
+      </w:pPr>
+      <w:r>
+        <w:t>Git Aliases (Global &amp; Local)</w:t>
+      </w:r>
+    </w:p>
+    <w:p>
+      <w:r>
+        <w:tab/>
+        <w:t>With git aliases, we can write the short form of a command. We can make changes in .gitconfig file or with the command line.</w:t>
+      </w:r>
+    </w:p>
+    <w:p>
+      <w:r>
+        <w:rPr>
+          <w:b/>
+          <w:bCs/>
+        </w:rPr>
+        <w:lastRenderedPageBreak/>
+        <w:t>Git aliases</w:t>
+      </w:r>
+      <w:r>
+        <w:t xml:space="preserve"> are shortcuts for Git commands.</w:t>
+      </w:r>
+    </w:p>
+    <w:p>
+      <w:r>
+        <w:t>git config --global alias.</w:t>
+      </w:r>
+      <w:r>
+        <w:t>branch b (Work for globally)</w:t>
+      </w:r>
+    </w:p>
+    <w:p>
+      <w:r>
+        <w:t>git config alias.status st (Work for locally or specific branch)</w:t>
+      </w:r>
+    </w:p>
+    <w:p>
+      <w:pPr>
+        <w:ind w:left="720" w:firstLine="720"/>
+      </w:pPr>
+    </w:p>
+    <w:p>
+      <w:pPr>
+        <w:ind w:left="720" w:firstLine="720"/>
+      </w:pPr>
+    </w:p>
+    <w:p/>
+    <w:p>
+      <w:pPr>
+        <w:ind w:left="720"/>
+      </w:pPr>
+    </w:p>
+    <w:p>
+      <w:pPr>
+        <w:rPr>
+          <w:lang w:val="en-US"/>
+        </w:rPr>
+      </w:pPr>
     </w:p>
     <w:sectPr>
       <w:pgSz w:w="11906" w:h="16838"/>
@@ -572,6 +1997,354 @@
     </w:lvl>
   </w:abstractNum>
   <w:abstractNum w:abstractNumId="1" w15:restartNumberingAfterBreak="0">
+    <w:nsid w:val="01001E83"/>
+    <w:multiLevelType w:val="hybridMultilevel"/>
+    <w:tmpl w:val="9894029A"/>
+    <w:lvl w:ilvl="0" w:tplc="40090001">
+      <w:start w:val="1"/>
+      <w:numFmt w:val="bullet"/>
+      <w:lvlText w:val=""/>
+      <w:lvlJc w:val="left"/>
+      <w:pPr>
+        <w:ind w:left="1080" w:hanging="360"/>
+      </w:pPr>
+      <w:rPr>
+        <w:rFonts w:ascii="Symbol" w:hAnsi="Symbol" w:hint="default"/>
+      </w:rPr>
+    </w:lvl>
+    <w:lvl w:ilvl="1" w:tplc="40090003" w:tentative="1">
+      <w:start w:val="1"/>
+      <w:numFmt w:val="bullet"/>
+      <w:lvlText w:val="o"/>
+      <w:lvlJc w:val="left"/>
+      <w:pPr>
+        <w:ind w:left="1800" w:hanging="360"/>
+      </w:pPr>
+      <w:rPr>
+        <w:rFonts w:ascii="Courier New" w:hAnsi="Courier New" w:cs="Courier New" w:hint="default"/>
+      </w:rPr>
+    </w:lvl>
+    <w:lvl w:ilvl="2" w:tplc="40090005" w:tentative="1">
+      <w:start w:val="1"/>
+      <w:numFmt w:val="bullet"/>
+      <w:lvlText w:val=""/>
+      <w:lvlJc w:val="left"/>
+      <w:pPr>
+        <w:ind w:left="2520" w:hanging="360"/>
+      </w:pPr>
+      <w:rPr>
+        <w:rFonts w:ascii="Wingdings" w:hAnsi="Wingdings" w:hint="default"/>
+      </w:rPr>
+    </w:lvl>
+    <w:lvl w:ilvl="3" w:tplc="40090001" w:tentative="1">
+      <w:start w:val="1"/>
+      <w:numFmt w:val="bullet"/>
+      <w:lvlText w:val=""/>
+      <w:lvlJc w:val="left"/>
+      <w:pPr>
+        <w:ind w:left="3240" w:hanging="360"/>
+      </w:pPr>
+      <w:rPr>
+        <w:rFonts w:ascii="Symbol" w:hAnsi="Symbol" w:hint="default"/>
+      </w:rPr>
+    </w:lvl>
+    <w:lvl w:ilvl="4" w:tplc="40090003" w:tentative="1">
+      <w:start w:val="1"/>
+      <w:numFmt w:val="bullet"/>
+      <w:lvlText w:val="o"/>
+      <w:lvlJc w:val="left"/>
+      <w:pPr>
+        <w:ind w:left="3960" w:hanging="360"/>
+      </w:pPr>
+      <w:rPr>
+        <w:rFonts w:ascii="Courier New" w:hAnsi="Courier New" w:cs="Courier New" w:hint="default"/>
+      </w:rPr>
+    </w:lvl>
+    <w:lvl w:ilvl="5" w:tplc="40090005" w:tentative="1">
+      <w:start w:val="1"/>
+      <w:numFmt w:val="bullet"/>
+      <w:lvlText w:val=""/>
+      <w:lvlJc w:val="left"/>
+      <w:pPr>
+        <w:ind w:left="4680" w:hanging="360"/>
+      </w:pPr>
+      <w:rPr>
+        <w:rFonts w:ascii="Wingdings" w:hAnsi="Wingdings" w:hint="default"/>
+      </w:rPr>
+    </w:lvl>
+    <w:lvl w:ilvl="6" w:tplc="40090001" w:tentative="1">
+      <w:start w:val="1"/>
+      <w:numFmt w:val="bullet"/>
+      <w:lvlText w:val=""/>
+      <w:lvlJc w:val="left"/>
+      <w:pPr>
+        <w:ind w:left="5400" w:hanging="360"/>
+      </w:pPr>
+      <w:rPr>
+        <w:rFonts w:ascii="Symbol" w:hAnsi="Symbol" w:hint="default"/>
+      </w:rPr>
+    </w:lvl>
+    <w:lvl w:ilvl="7" w:tplc="40090003" w:tentative="1">
+      <w:start w:val="1"/>
+      <w:numFmt w:val="bullet"/>
+      <w:lvlText w:val="o"/>
+      <w:lvlJc w:val="left"/>
+      <w:pPr>
+        <w:ind w:left="6120" w:hanging="360"/>
+      </w:pPr>
+      <w:rPr>
+        <w:rFonts w:ascii="Courier New" w:hAnsi="Courier New" w:cs="Courier New" w:hint="default"/>
+      </w:rPr>
+    </w:lvl>
+    <w:lvl w:ilvl="8" w:tplc="40090005" w:tentative="1">
+      <w:start w:val="1"/>
+      <w:numFmt w:val="bullet"/>
+      <w:lvlText w:val=""/>
+      <w:lvlJc w:val="left"/>
+      <w:pPr>
+        <w:ind w:left="6840" w:hanging="360"/>
+      </w:pPr>
+      <w:rPr>
+        <w:rFonts w:ascii="Wingdings" w:hAnsi="Wingdings" w:hint="default"/>
+      </w:rPr>
+    </w:lvl>
+  </w:abstractNum>
+  <w:abstractNum w:abstractNumId="2" w15:restartNumberingAfterBreak="0">
+    <w:nsid w:val="11A34033"/>
+    <w:multiLevelType w:val="multilevel"/>
+    <w:tmpl w:val="71F4314C"/>
+    <w:lvl w:ilvl="0">
+      <w:start w:val="1"/>
+      <w:numFmt w:val="bullet"/>
+      <w:lvlText w:val=""/>
+      <w:lvlJc w:val="left"/>
+      <w:pPr>
+        <w:tabs>
+          <w:tab w:val="num" w:pos="720"/>
+        </w:tabs>
+        <w:ind w:left="720" w:hanging="360"/>
+      </w:pPr>
+      <w:rPr>
+        <w:rFonts w:ascii="Symbol" w:hAnsi="Symbol" w:hint="default"/>
+        <w:sz w:val="20"/>
+      </w:rPr>
+    </w:lvl>
+    <w:lvl w:ilvl="1" w:tentative="1">
+      <w:start w:val="1"/>
+      <w:numFmt w:val="bullet"/>
+      <w:lvlText w:val="o"/>
+      <w:lvlJc w:val="left"/>
+      <w:pPr>
+        <w:tabs>
+          <w:tab w:val="num" w:pos="1440"/>
+        </w:tabs>
+        <w:ind w:left="1440" w:hanging="360"/>
+      </w:pPr>
+      <w:rPr>
+        <w:rFonts w:ascii="Courier New" w:hAnsi="Courier New" w:hint="default"/>
+        <w:sz w:val="20"/>
+      </w:rPr>
+    </w:lvl>
+    <w:lvl w:ilvl="2" w:tentative="1">
+      <w:start w:val="1"/>
+      <w:numFmt w:val="bullet"/>
+      <w:lvlText w:val=""/>
+      <w:lvlJc w:val="left"/>
+      <w:pPr>
+        <w:tabs>
+          <w:tab w:val="num" w:pos="2160"/>
+        </w:tabs>
+        <w:ind w:left="2160" w:hanging="360"/>
+      </w:pPr>
+      <w:rPr>
+        <w:rFonts w:ascii="Wingdings" w:hAnsi="Wingdings" w:hint="default"/>
+        <w:sz w:val="20"/>
+      </w:rPr>
+    </w:lvl>
+    <w:lvl w:ilvl="3" w:tentative="1">
+      <w:start w:val="1"/>
+      <w:numFmt w:val="bullet"/>
+      <w:lvlText w:val=""/>
+      <w:lvlJc w:val="left"/>
+      <w:pPr>
+        <w:tabs>
+          <w:tab w:val="num" w:pos="2880"/>
+        </w:tabs>
+        <w:ind w:left="2880" w:hanging="360"/>
+      </w:pPr>
+      <w:rPr>
+        <w:rFonts w:ascii="Wingdings" w:hAnsi="Wingdings" w:hint="default"/>
+        <w:sz w:val="20"/>
+      </w:rPr>
+    </w:lvl>
+    <w:lvl w:ilvl="4" w:tentative="1">
+      <w:start w:val="1"/>
+      <w:numFmt w:val="bullet"/>
+      <w:lvlText w:val=""/>
+      <w:lvlJc w:val="left"/>
+      <w:pPr>
+        <w:tabs>
+          <w:tab w:val="num" w:pos="3600"/>
+        </w:tabs>
+        <w:ind w:left="3600" w:hanging="360"/>
+      </w:pPr>
+      <w:rPr>
+        <w:rFonts w:ascii="Wingdings" w:hAnsi="Wingdings" w:hint="default"/>
+        <w:sz w:val="20"/>
+      </w:rPr>
+    </w:lvl>
+    <w:lvl w:ilvl="5" w:tentative="1">
+      <w:start w:val="1"/>
+      <w:numFmt w:val="bullet"/>
+      <w:lvlText w:val=""/>
+      <w:lvlJc w:val="left"/>
+      <w:pPr>
+        <w:tabs>
+          <w:tab w:val="num" w:pos="4320"/>
+        </w:tabs>
+        <w:ind w:left="4320" w:hanging="360"/>
+      </w:pPr>
+      <w:rPr>
+        <w:rFonts w:ascii="Wingdings" w:hAnsi="Wingdings" w:hint="default"/>
+        <w:sz w:val="20"/>
+      </w:rPr>
+    </w:lvl>
+    <w:lvl w:ilvl="6" w:tentative="1">
+      <w:start w:val="1"/>
+      <w:numFmt w:val="bullet"/>
+      <w:lvlText w:val=""/>
+      <w:lvlJc w:val="left"/>
+      <w:pPr>
+        <w:tabs>
+          <w:tab w:val="num" w:pos="5040"/>
+        </w:tabs>
+        <w:ind w:left="5040" w:hanging="360"/>
+      </w:pPr>
+      <w:rPr>
+        <w:rFonts w:ascii="Wingdings" w:hAnsi="Wingdings" w:hint="default"/>
+        <w:sz w:val="20"/>
+      </w:rPr>
+    </w:lvl>
+    <w:lvl w:ilvl="7" w:tentative="1">
+      <w:start w:val="1"/>
+      <w:numFmt w:val="bullet"/>
+      <w:lvlText w:val=""/>
+      <w:lvlJc w:val="left"/>
+      <w:pPr>
+        <w:tabs>
+          <w:tab w:val="num" w:pos="5760"/>
+        </w:tabs>
+        <w:ind w:left="5760" w:hanging="360"/>
+      </w:pPr>
+      <w:rPr>
+        <w:rFonts w:ascii="Wingdings" w:hAnsi="Wingdings" w:hint="default"/>
+        <w:sz w:val="20"/>
+      </w:rPr>
+    </w:lvl>
+    <w:lvl w:ilvl="8" w:tentative="1">
+      <w:start w:val="1"/>
+      <w:numFmt w:val="bullet"/>
+      <w:lvlText w:val=""/>
+      <w:lvlJc w:val="left"/>
+      <w:pPr>
+        <w:tabs>
+          <w:tab w:val="num" w:pos="6480"/>
+        </w:tabs>
+        <w:ind w:left="6480" w:hanging="360"/>
+      </w:pPr>
+      <w:rPr>
+        <w:rFonts w:ascii="Wingdings" w:hAnsi="Wingdings" w:hint="default"/>
+        <w:sz w:val="20"/>
+      </w:rPr>
+    </w:lvl>
+  </w:abstractNum>
+  <w:abstractNum w:abstractNumId="3" w15:restartNumberingAfterBreak="0">
+    <w:nsid w:val="171A73AC"/>
+    <w:multiLevelType w:val="hybridMultilevel"/>
+    <w:tmpl w:val="ABD0D7D8"/>
+    <w:lvl w:ilvl="0" w:tplc="4009000F">
+      <w:start w:val="1"/>
+      <w:numFmt w:val="decimal"/>
+      <w:lvlText w:val="%1."/>
+      <w:lvlJc w:val="left"/>
+      <w:pPr>
+        <w:ind w:left="720" w:hanging="360"/>
+      </w:pPr>
+    </w:lvl>
+    <w:lvl w:ilvl="1" w:tplc="40090019" w:tentative="1">
+      <w:start w:val="1"/>
+      <w:numFmt w:val="lowerLetter"/>
+      <w:lvlText w:val="%2."/>
+      <w:lvlJc w:val="left"/>
+      <w:pPr>
+        <w:ind w:left="1440" w:hanging="360"/>
+      </w:pPr>
+    </w:lvl>
+    <w:lvl w:ilvl="2" w:tplc="4009001B" w:tentative="1">
+      <w:start w:val="1"/>
+      <w:numFmt w:val="lowerRoman"/>
+      <w:lvlText w:val="%3."/>
+      <w:lvlJc w:val="right"/>
+      <w:pPr>
+        <w:ind w:left="2160" w:hanging="180"/>
+      </w:pPr>
+    </w:lvl>
+    <w:lvl w:ilvl="3" w:tplc="4009000F" w:tentative="1">
+      <w:start w:val="1"/>
+      <w:numFmt w:val="decimal"/>
+      <w:lvlText w:val="%4."/>
+      <w:lvlJc w:val="left"/>
+      <w:pPr>
+        <w:ind w:left="2880" w:hanging="360"/>
+      </w:pPr>
+    </w:lvl>
+    <w:lvl w:ilvl="4" w:tplc="40090019" w:tentative="1">
+      <w:start w:val="1"/>
+      <w:numFmt w:val="lowerLetter"/>
+      <w:lvlText w:val="%5."/>
+      <w:lvlJc w:val="left"/>
+      <w:pPr>
+        <w:ind w:left="3600" w:hanging="360"/>
+      </w:pPr>
+    </w:lvl>
+    <w:lvl w:ilvl="5" w:tplc="4009001B" w:tentative="1">
+      <w:start w:val="1"/>
+      <w:numFmt w:val="lowerRoman"/>
+      <w:lvlText w:val="%6."/>
+      <w:lvlJc w:val="right"/>
+      <w:pPr>
+        <w:ind w:left="4320" w:hanging="180"/>
+      </w:pPr>
+    </w:lvl>
+    <w:lvl w:ilvl="6" w:tplc="4009000F" w:tentative="1">
+      <w:start w:val="1"/>
+      <w:numFmt w:val="decimal"/>
+      <w:lvlText w:val="%7."/>
+      <w:lvlJc w:val="left"/>
+      <w:pPr>
+        <w:ind w:left="5040" w:hanging="360"/>
+      </w:pPr>
+    </w:lvl>
+    <w:lvl w:ilvl="7" w:tplc="40090019" w:tentative="1">
+      <w:start w:val="1"/>
+      <w:numFmt w:val="lowerLetter"/>
+      <w:lvlText w:val="%8."/>
+      <w:lvlJc w:val="left"/>
+      <w:pPr>
+        <w:ind w:left="5760" w:hanging="360"/>
+      </w:pPr>
+    </w:lvl>
+    <w:lvl w:ilvl="8" w:tplc="4009001B" w:tentative="1">
+      <w:start w:val="1"/>
+      <w:numFmt w:val="lowerRoman"/>
+      <w:lvlText w:val="%9."/>
+      <w:lvlJc w:val="right"/>
+      <w:pPr>
+        <w:ind w:left="6480" w:hanging="180"/>
+      </w:pPr>
+    </w:lvl>
+  </w:abstractNum>
+  <w:abstractNum w:abstractNumId="4" w15:restartNumberingAfterBreak="0">
     <w:nsid w:val="1B3618B8"/>
     <w:multiLevelType w:val="hybridMultilevel"/>
     <w:tmpl w:val="0F9A08EA"/>
@@ -684,7 +2457,156 @@
       </w:rPr>
     </w:lvl>
   </w:abstractNum>
-  <w:abstractNum w:abstractNumId="2" w15:restartNumberingAfterBreak="0">
+  <w:abstractNum w:abstractNumId="5" w15:restartNumberingAfterBreak="0">
+    <w:nsid w:val="1F0373D9"/>
+    <w:multiLevelType w:val="multilevel"/>
+    <w:tmpl w:val="143E02B0"/>
+    <w:lvl w:ilvl="0">
+      <w:start w:val="1"/>
+      <w:numFmt w:val="bullet"/>
+      <w:lvlText w:val=""/>
+      <w:lvlJc w:val="left"/>
+      <w:pPr>
+        <w:tabs>
+          <w:tab w:val="num" w:pos="720"/>
+        </w:tabs>
+        <w:ind w:left="720" w:hanging="360"/>
+      </w:pPr>
+      <w:rPr>
+        <w:rFonts w:ascii="Symbol" w:hAnsi="Symbol" w:hint="default"/>
+        <w:sz w:val="20"/>
+      </w:rPr>
+    </w:lvl>
+    <w:lvl w:ilvl="1" w:tentative="1">
+      <w:start w:val="1"/>
+      <w:numFmt w:val="bullet"/>
+      <w:lvlText w:val="o"/>
+      <w:lvlJc w:val="left"/>
+      <w:pPr>
+        <w:tabs>
+          <w:tab w:val="num" w:pos="1440"/>
+        </w:tabs>
+        <w:ind w:left="1440" w:hanging="360"/>
+      </w:pPr>
+      <w:rPr>
+        <w:rFonts w:ascii="Courier New" w:hAnsi="Courier New" w:hint="default"/>
+        <w:sz w:val="20"/>
+      </w:rPr>
+    </w:lvl>
+    <w:lvl w:ilvl="2" w:tentative="1">
+      <w:start w:val="1"/>
+      <w:numFmt w:val="bullet"/>
+      <w:lvlText w:val=""/>
+      <w:lvlJc w:val="left"/>
+      <w:pPr>
+        <w:tabs>
+          <w:tab w:val="num" w:pos="2160"/>
+        </w:tabs>
+        <w:ind w:left="2160" w:hanging="360"/>
+      </w:pPr>
+      <w:rPr>
+        <w:rFonts w:ascii="Wingdings" w:hAnsi="Wingdings" w:hint="default"/>
+        <w:sz w:val="20"/>
+      </w:rPr>
+    </w:lvl>
+    <w:lvl w:ilvl="3" w:tentative="1">
+      <w:start w:val="1"/>
+      <w:numFmt w:val="bullet"/>
+      <w:lvlText w:val=""/>
+      <w:lvlJc w:val="left"/>
+      <w:pPr>
+        <w:tabs>
+          <w:tab w:val="num" w:pos="2880"/>
+        </w:tabs>
+        <w:ind w:left="2880" w:hanging="360"/>
+      </w:pPr>
+      <w:rPr>
+        <w:rFonts w:ascii="Wingdings" w:hAnsi="Wingdings" w:hint="default"/>
+        <w:sz w:val="20"/>
+      </w:rPr>
+    </w:lvl>
+    <w:lvl w:ilvl="4" w:tentative="1">
+      <w:start w:val="1"/>
+      <w:numFmt w:val="bullet"/>
+      <w:lvlText w:val=""/>
+      <w:lvlJc w:val="left"/>
+      <w:pPr>
+        <w:tabs>
+          <w:tab w:val="num" w:pos="3600"/>
+        </w:tabs>
+        <w:ind w:left="3600" w:hanging="360"/>
+      </w:pPr>
+      <w:rPr>
+        <w:rFonts w:ascii="Wingdings" w:hAnsi="Wingdings" w:hint="default"/>
+        <w:sz w:val="20"/>
+      </w:rPr>
+    </w:lvl>
+    <w:lvl w:ilvl="5" w:tentative="1">
+      <w:start w:val="1"/>
+      <w:numFmt w:val="bullet"/>
+      <w:lvlText w:val=""/>
+      <w:lvlJc w:val="left"/>
+      <w:pPr>
+        <w:tabs>
+          <w:tab w:val="num" w:pos="4320"/>
+        </w:tabs>
+        <w:ind w:left="4320" w:hanging="360"/>
+      </w:pPr>
+      <w:rPr>
+        <w:rFonts w:ascii="Wingdings" w:hAnsi="Wingdings" w:hint="default"/>
+        <w:sz w:val="20"/>
+      </w:rPr>
+    </w:lvl>
+    <w:lvl w:ilvl="6" w:tentative="1">
+      <w:start w:val="1"/>
+      <w:numFmt w:val="bullet"/>
+      <w:lvlText w:val=""/>
+      <w:lvlJc w:val="left"/>
+      <w:pPr>
+        <w:tabs>
+          <w:tab w:val="num" w:pos="5040"/>
+        </w:tabs>
+        <w:ind w:left="5040" w:hanging="360"/>
+      </w:pPr>
+      <w:rPr>
+        <w:rFonts w:ascii="Wingdings" w:hAnsi="Wingdings" w:hint="default"/>
+        <w:sz w:val="20"/>
+      </w:rPr>
+    </w:lvl>
+    <w:lvl w:ilvl="7" w:tentative="1">
+      <w:start w:val="1"/>
+      <w:numFmt w:val="bullet"/>
+      <w:lvlText w:val=""/>
+      <w:lvlJc w:val="left"/>
+      <w:pPr>
+        <w:tabs>
+          <w:tab w:val="num" w:pos="5760"/>
+        </w:tabs>
+        <w:ind w:left="5760" w:hanging="360"/>
+      </w:pPr>
+      <w:rPr>
+        <w:rFonts w:ascii="Wingdings" w:hAnsi="Wingdings" w:hint="default"/>
+        <w:sz w:val="20"/>
+      </w:rPr>
+    </w:lvl>
+    <w:lvl w:ilvl="8" w:tentative="1">
+      <w:start w:val="1"/>
+      <w:numFmt w:val="bullet"/>
+      <w:lvlText w:val=""/>
+      <w:lvlJc w:val="left"/>
+      <w:pPr>
+        <w:tabs>
+          <w:tab w:val="num" w:pos="6480"/>
+        </w:tabs>
+        <w:ind w:left="6480" w:hanging="360"/>
+      </w:pPr>
+      <w:rPr>
+        <w:rFonts w:ascii="Wingdings" w:hAnsi="Wingdings" w:hint="default"/>
+        <w:sz w:val="20"/>
+      </w:rPr>
+    </w:lvl>
+  </w:abstractNum>
+  <w:abstractNum w:abstractNumId="6" w15:restartNumberingAfterBreak="0">
     <w:nsid w:val="211C68EA"/>
     <w:multiLevelType w:val="hybridMultilevel"/>
     <w:tmpl w:val="50B6BB60"/>
@@ -797,7 +2719,269 @@
       </w:rPr>
     </w:lvl>
   </w:abstractNum>
-  <w:abstractNum w:abstractNumId="3" w15:restartNumberingAfterBreak="0">
+  <w:abstractNum w:abstractNumId="7" w15:restartNumberingAfterBreak="0">
+    <w:nsid w:val="289927EA"/>
+    <w:multiLevelType w:val="hybridMultilevel"/>
+    <w:tmpl w:val="0A165C9E"/>
+    <w:lvl w:ilvl="0" w:tplc="40090001">
+      <w:start w:val="1"/>
+      <w:numFmt w:val="bullet"/>
+      <w:lvlText w:val=""/>
+      <w:lvlJc w:val="left"/>
+      <w:pPr>
+        <w:ind w:left="1440" w:hanging="360"/>
+      </w:pPr>
+      <w:rPr>
+        <w:rFonts w:ascii="Symbol" w:hAnsi="Symbol" w:hint="default"/>
+      </w:rPr>
+    </w:lvl>
+    <w:lvl w:ilvl="1" w:tplc="40090003" w:tentative="1">
+      <w:start w:val="1"/>
+      <w:numFmt w:val="bullet"/>
+      <w:lvlText w:val="o"/>
+      <w:lvlJc w:val="left"/>
+      <w:pPr>
+        <w:ind w:left="2160" w:hanging="360"/>
+      </w:pPr>
+      <w:rPr>
+        <w:rFonts w:ascii="Courier New" w:hAnsi="Courier New" w:cs="Courier New" w:hint="default"/>
+      </w:rPr>
+    </w:lvl>
+    <w:lvl w:ilvl="2" w:tplc="40090005" w:tentative="1">
+      <w:start w:val="1"/>
+      <w:numFmt w:val="bullet"/>
+      <w:lvlText w:val=""/>
+      <w:lvlJc w:val="left"/>
+      <w:pPr>
+        <w:ind w:left="2880" w:hanging="360"/>
+      </w:pPr>
+      <w:rPr>
+        <w:rFonts w:ascii="Wingdings" w:hAnsi="Wingdings" w:hint="default"/>
+      </w:rPr>
+    </w:lvl>
+    <w:lvl w:ilvl="3" w:tplc="40090001" w:tentative="1">
+      <w:start w:val="1"/>
+      <w:numFmt w:val="bullet"/>
+      <w:lvlText w:val=""/>
+      <w:lvlJc w:val="left"/>
+      <w:pPr>
+        <w:ind w:left="3600" w:hanging="360"/>
+      </w:pPr>
+      <w:rPr>
+        <w:rFonts w:ascii="Symbol" w:hAnsi="Symbol" w:hint="default"/>
+      </w:rPr>
+    </w:lvl>
+    <w:lvl w:ilvl="4" w:tplc="40090003" w:tentative="1">
+      <w:start w:val="1"/>
+      <w:numFmt w:val="bullet"/>
+      <w:lvlText w:val="o"/>
+      <w:lvlJc w:val="left"/>
+      <w:pPr>
+        <w:ind w:left="4320" w:hanging="360"/>
+      </w:pPr>
+      <w:rPr>
+        <w:rFonts w:ascii="Courier New" w:hAnsi="Courier New" w:cs="Courier New" w:hint="default"/>
+      </w:rPr>
+    </w:lvl>
+    <w:lvl w:ilvl="5" w:tplc="40090005" w:tentative="1">
+      <w:start w:val="1"/>
+      <w:numFmt w:val="bullet"/>
+      <w:lvlText w:val=""/>
+      <w:lvlJc w:val="left"/>
+      <w:pPr>
+        <w:ind w:left="5040" w:hanging="360"/>
+      </w:pPr>
+      <w:rPr>
+        <w:rFonts w:ascii="Wingdings" w:hAnsi="Wingdings" w:hint="default"/>
+      </w:rPr>
+    </w:lvl>
+    <w:lvl w:ilvl="6" w:tplc="40090001" w:tentative="1">
+      <w:start w:val="1"/>
+      <w:numFmt w:val="bullet"/>
+      <w:lvlText w:val=""/>
+      <w:lvlJc w:val="left"/>
+      <w:pPr>
+        <w:ind w:left="5760" w:hanging="360"/>
+      </w:pPr>
+      <w:rPr>
+        <w:rFonts w:ascii="Symbol" w:hAnsi="Symbol" w:hint="default"/>
+      </w:rPr>
+    </w:lvl>
+    <w:lvl w:ilvl="7" w:tplc="40090003" w:tentative="1">
+      <w:start w:val="1"/>
+      <w:numFmt w:val="bullet"/>
+      <w:lvlText w:val="o"/>
+      <w:lvlJc w:val="left"/>
+      <w:pPr>
+        <w:ind w:left="6480" w:hanging="360"/>
+      </w:pPr>
+      <w:rPr>
+        <w:rFonts w:ascii="Courier New" w:hAnsi="Courier New" w:cs="Courier New" w:hint="default"/>
+      </w:rPr>
+    </w:lvl>
+    <w:lvl w:ilvl="8" w:tplc="40090005" w:tentative="1">
+      <w:start w:val="1"/>
+      <w:numFmt w:val="bullet"/>
+      <w:lvlText w:val=""/>
+      <w:lvlJc w:val="left"/>
+      <w:pPr>
+        <w:ind w:left="7200" w:hanging="360"/>
+      </w:pPr>
+      <w:rPr>
+        <w:rFonts w:ascii="Wingdings" w:hAnsi="Wingdings" w:hint="default"/>
+      </w:rPr>
+    </w:lvl>
+  </w:abstractNum>
+  <w:abstractNum w:abstractNumId="8" w15:restartNumberingAfterBreak="0">
+    <w:nsid w:val="2ABC349A"/>
+    <w:multiLevelType w:val="multilevel"/>
+    <w:tmpl w:val="65BE9852"/>
+    <w:lvl w:ilvl="0">
+      <w:start w:val="1"/>
+      <w:numFmt w:val="bullet"/>
+      <w:lvlText w:val=""/>
+      <w:lvlJc w:val="left"/>
+      <w:pPr>
+        <w:tabs>
+          <w:tab w:val="num" w:pos="720"/>
+        </w:tabs>
+        <w:ind w:left="720" w:hanging="360"/>
+      </w:pPr>
+      <w:rPr>
+        <w:rFonts w:ascii="Symbol" w:hAnsi="Symbol" w:hint="default"/>
+        <w:sz w:val="20"/>
+      </w:rPr>
+    </w:lvl>
+    <w:lvl w:ilvl="1" w:tentative="1">
+      <w:start w:val="1"/>
+      <w:numFmt w:val="bullet"/>
+      <w:lvlText w:val="o"/>
+      <w:lvlJc w:val="left"/>
+      <w:pPr>
+        <w:tabs>
+          <w:tab w:val="num" w:pos="1440"/>
+        </w:tabs>
+        <w:ind w:left="1440" w:hanging="360"/>
+      </w:pPr>
+      <w:rPr>
+        <w:rFonts w:ascii="Courier New" w:hAnsi="Courier New" w:hint="default"/>
+        <w:sz w:val="20"/>
+      </w:rPr>
+    </w:lvl>
+    <w:lvl w:ilvl="2" w:tentative="1">
+      <w:start w:val="1"/>
+      <w:numFmt w:val="bullet"/>
+      <w:lvlText w:val=""/>
+      <w:lvlJc w:val="left"/>
+      <w:pPr>
+        <w:tabs>
+          <w:tab w:val="num" w:pos="2160"/>
+        </w:tabs>
+        <w:ind w:left="2160" w:hanging="360"/>
+      </w:pPr>
+      <w:rPr>
+        <w:rFonts w:ascii="Wingdings" w:hAnsi="Wingdings" w:hint="default"/>
+        <w:sz w:val="20"/>
+      </w:rPr>
+    </w:lvl>
+    <w:lvl w:ilvl="3" w:tentative="1">
+      <w:start w:val="1"/>
+      <w:numFmt w:val="bullet"/>
+      <w:lvlText w:val=""/>
+      <w:lvlJc w:val="left"/>
+      <w:pPr>
+        <w:tabs>
+          <w:tab w:val="num" w:pos="2880"/>
+        </w:tabs>
+        <w:ind w:left="2880" w:hanging="360"/>
+      </w:pPr>
+      <w:rPr>
+        <w:rFonts w:ascii="Wingdings" w:hAnsi="Wingdings" w:hint="default"/>
+        <w:sz w:val="20"/>
+      </w:rPr>
+    </w:lvl>
+    <w:lvl w:ilvl="4" w:tentative="1">
+      <w:start w:val="1"/>
+      <w:numFmt w:val="bullet"/>
+      <w:lvlText w:val=""/>
+      <w:lvlJc w:val="left"/>
+      <w:pPr>
+        <w:tabs>
+          <w:tab w:val="num" w:pos="3600"/>
+        </w:tabs>
+        <w:ind w:left="3600" w:hanging="360"/>
+      </w:pPr>
+      <w:rPr>
+        <w:rFonts w:ascii="Wingdings" w:hAnsi="Wingdings" w:hint="default"/>
+        <w:sz w:val="20"/>
+      </w:rPr>
+    </w:lvl>
+    <w:lvl w:ilvl="5" w:tentative="1">
+      <w:start w:val="1"/>
+      <w:numFmt w:val="bullet"/>
+      <w:lvlText w:val=""/>
+      <w:lvlJc w:val="left"/>
+      <w:pPr>
+        <w:tabs>
+          <w:tab w:val="num" w:pos="4320"/>
+        </w:tabs>
+        <w:ind w:left="4320" w:hanging="360"/>
+      </w:pPr>
+      <w:rPr>
+        <w:rFonts w:ascii="Wingdings" w:hAnsi="Wingdings" w:hint="default"/>
+        <w:sz w:val="20"/>
+      </w:rPr>
+    </w:lvl>
+    <w:lvl w:ilvl="6" w:tentative="1">
+      <w:start w:val="1"/>
+      <w:numFmt w:val="bullet"/>
+      <w:lvlText w:val=""/>
+      <w:lvlJc w:val="left"/>
+      <w:pPr>
+        <w:tabs>
+          <w:tab w:val="num" w:pos="5040"/>
+        </w:tabs>
+        <w:ind w:left="5040" w:hanging="360"/>
+      </w:pPr>
+      <w:rPr>
+        <w:rFonts w:ascii="Wingdings" w:hAnsi="Wingdings" w:hint="default"/>
+        <w:sz w:val="20"/>
+      </w:rPr>
+    </w:lvl>
+    <w:lvl w:ilvl="7" w:tentative="1">
+      <w:start w:val="1"/>
+      <w:numFmt w:val="bullet"/>
+      <w:lvlText w:val=""/>
+      <w:lvlJc w:val="left"/>
+      <w:pPr>
+        <w:tabs>
+          <w:tab w:val="num" w:pos="5760"/>
+        </w:tabs>
+        <w:ind w:left="5760" w:hanging="360"/>
+      </w:pPr>
+      <w:rPr>
+        <w:rFonts w:ascii="Wingdings" w:hAnsi="Wingdings" w:hint="default"/>
+        <w:sz w:val="20"/>
+      </w:rPr>
+    </w:lvl>
+    <w:lvl w:ilvl="8" w:tentative="1">
+      <w:start w:val="1"/>
+      <w:numFmt w:val="bullet"/>
+      <w:lvlText w:val=""/>
+      <w:lvlJc w:val="left"/>
+      <w:pPr>
+        <w:tabs>
+          <w:tab w:val="num" w:pos="6480"/>
+        </w:tabs>
+        <w:ind w:left="6480" w:hanging="360"/>
+      </w:pPr>
+      <w:rPr>
+        <w:rFonts w:ascii="Wingdings" w:hAnsi="Wingdings" w:hint="default"/>
+        <w:sz w:val="20"/>
+      </w:rPr>
+    </w:lvl>
+  </w:abstractNum>
+  <w:abstractNum w:abstractNumId="9" w15:restartNumberingAfterBreak="0">
     <w:nsid w:val="2C586896"/>
     <w:multiLevelType w:val="hybridMultilevel"/>
     <w:tmpl w:val="29528D92"/>
@@ -910,17 +3094,1068 @@
       </w:rPr>
     </w:lvl>
   </w:abstractNum>
+  <w:abstractNum w:abstractNumId="10" w15:restartNumberingAfterBreak="0">
+    <w:nsid w:val="30F847E3"/>
+    <w:multiLevelType w:val="hybridMultilevel"/>
+    <w:tmpl w:val="0DF6E9BE"/>
+    <w:lvl w:ilvl="0" w:tplc="40090001">
+      <w:start w:val="1"/>
+      <w:numFmt w:val="bullet"/>
+      <w:lvlText w:val=""/>
+      <w:lvlJc w:val="left"/>
+      <w:pPr>
+        <w:ind w:left="1080" w:hanging="360"/>
+      </w:pPr>
+      <w:rPr>
+        <w:rFonts w:ascii="Symbol" w:hAnsi="Symbol" w:hint="default"/>
+      </w:rPr>
+    </w:lvl>
+    <w:lvl w:ilvl="1" w:tplc="40090003" w:tentative="1">
+      <w:start w:val="1"/>
+      <w:numFmt w:val="bullet"/>
+      <w:lvlText w:val="o"/>
+      <w:lvlJc w:val="left"/>
+      <w:pPr>
+        <w:ind w:left="1800" w:hanging="360"/>
+      </w:pPr>
+      <w:rPr>
+        <w:rFonts w:ascii="Courier New" w:hAnsi="Courier New" w:cs="Courier New" w:hint="default"/>
+      </w:rPr>
+    </w:lvl>
+    <w:lvl w:ilvl="2" w:tplc="40090005" w:tentative="1">
+      <w:start w:val="1"/>
+      <w:numFmt w:val="bullet"/>
+      <w:lvlText w:val=""/>
+      <w:lvlJc w:val="left"/>
+      <w:pPr>
+        <w:ind w:left="2520" w:hanging="360"/>
+      </w:pPr>
+      <w:rPr>
+        <w:rFonts w:ascii="Wingdings" w:hAnsi="Wingdings" w:hint="default"/>
+      </w:rPr>
+    </w:lvl>
+    <w:lvl w:ilvl="3" w:tplc="40090001" w:tentative="1">
+      <w:start w:val="1"/>
+      <w:numFmt w:val="bullet"/>
+      <w:lvlText w:val=""/>
+      <w:lvlJc w:val="left"/>
+      <w:pPr>
+        <w:ind w:left="3240" w:hanging="360"/>
+      </w:pPr>
+      <w:rPr>
+        <w:rFonts w:ascii="Symbol" w:hAnsi="Symbol" w:hint="default"/>
+      </w:rPr>
+    </w:lvl>
+    <w:lvl w:ilvl="4" w:tplc="40090003" w:tentative="1">
+      <w:start w:val="1"/>
+      <w:numFmt w:val="bullet"/>
+      <w:lvlText w:val="o"/>
+      <w:lvlJc w:val="left"/>
+      <w:pPr>
+        <w:ind w:left="3960" w:hanging="360"/>
+      </w:pPr>
+      <w:rPr>
+        <w:rFonts w:ascii="Courier New" w:hAnsi="Courier New" w:cs="Courier New" w:hint="default"/>
+      </w:rPr>
+    </w:lvl>
+    <w:lvl w:ilvl="5" w:tplc="40090005" w:tentative="1">
+      <w:start w:val="1"/>
+      <w:numFmt w:val="bullet"/>
+      <w:lvlText w:val=""/>
+      <w:lvlJc w:val="left"/>
+      <w:pPr>
+        <w:ind w:left="4680" w:hanging="360"/>
+      </w:pPr>
+      <w:rPr>
+        <w:rFonts w:ascii="Wingdings" w:hAnsi="Wingdings" w:hint="default"/>
+      </w:rPr>
+    </w:lvl>
+    <w:lvl w:ilvl="6" w:tplc="40090001" w:tentative="1">
+      <w:start w:val="1"/>
+      <w:numFmt w:val="bullet"/>
+      <w:lvlText w:val=""/>
+      <w:lvlJc w:val="left"/>
+      <w:pPr>
+        <w:ind w:left="5400" w:hanging="360"/>
+      </w:pPr>
+      <w:rPr>
+        <w:rFonts w:ascii="Symbol" w:hAnsi="Symbol" w:hint="default"/>
+      </w:rPr>
+    </w:lvl>
+    <w:lvl w:ilvl="7" w:tplc="40090003" w:tentative="1">
+      <w:start w:val="1"/>
+      <w:numFmt w:val="bullet"/>
+      <w:lvlText w:val="o"/>
+      <w:lvlJc w:val="left"/>
+      <w:pPr>
+        <w:ind w:left="6120" w:hanging="360"/>
+      </w:pPr>
+      <w:rPr>
+        <w:rFonts w:ascii="Courier New" w:hAnsi="Courier New" w:cs="Courier New" w:hint="default"/>
+      </w:rPr>
+    </w:lvl>
+    <w:lvl w:ilvl="8" w:tplc="40090005" w:tentative="1">
+      <w:start w:val="1"/>
+      <w:numFmt w:val="bullet"/>
+      <w:lvlText w:val=""/>
+      <w:lvlJc w:val="left"/>
+      <w:pPr>
+        <w:ind w:left="6840" w:hanging="360"/>
+      </w:pPr>
+      <w:rPr>
+        <w:rFonts w:ascii="Wingdings" w:hAnsi="Wingdings" w:hint="default"/>
+      </w:rPr>
+    </w:lvl>
+  </w:abstractNum>
+  <w:abstractNum w:abstractNumId="11" w15:restartNumberingAfterBreak="0">
+    <w:nsid w:val="39813AD7"/>
+    <w:multiLevelType w:val="hybridMultilevel"/>
+    <w:tmpl w:val="0B9CCFDC"/>
+    <w:lvl w:ilvl="0" w:tplc="40090001">
+      <w:start w:val="1"/>
+      <w:numFmt w:val="bullet"/>
+      <w:lvlText w:val=""/>
+      <w:lvlJc w:val="left"/>
+      <w:pPr>
+        <w:ind w:left="1080" w:hanging="360"/>
+      </w:pPr>
+      <w:rPr>
+        <w:rFonts w:ascii="Symbol" w:hAnsi="Symbol" w:hint="default"/>
+      </w:rPr>
+    </w:lvl>
+    <w:lvl w:ilvl="1" w:tplc="40090003" w:tentative="1">
+      <w:start w:val="1"/>
+      <w:numFmt w:val="bullet"/>
+      <w:lvlText w:val="o"/>
+      <w:lvlJc w:val="left"/>
+      <w:pPr>
+        <w:ind w:left="1800" w:hanging="360"/>
+      </w:pPr>
+      <w:rPr>
+        <w:rFonts w:ascii="Courier New" w:hAnsi="Courier New" w:cs="Courier New" w:hint="default"/>
+      </w:rPr>
+    </w:lvl>
+    <w:lvl w:ilvl="2" w:tplc="40090005" w:tentative="1">
+      <w:start w:val="1"/>
+      <w:numFmt w:val="bullet"/>
+      <w:lvlText w:val=""/>
+      <w:lvlJc w:val="left"/>
+      <w:pPr>
+        <w:ind w:left="2520" w:hanging="360"/>
+      </w:pPr>
+      <w:rPr>
+        <w:rFonts w:ascii="Wingdings" w:hAnsi="Wingdings" w:hint="default"/>
+      </w:rPr>
+    </w:lvl>
+    <w:lvl w:ilvl="3" w:tplc="40090001" w:tentative="1">
+      <w:start w:val="1"/>
+      <w:numFmt w:val="bullet"/>
+      <w:lvlText w:val=""/>
+      <w:lvlJc w:val="left"/>
+      <w:pPr>
+        <w:ind w:left="3240" w:hanging="360"/>
+      </w:pPr>
+      <w:rPr>
+        <w:rFonts w:ascii="Symbol" w:hAnsi="Symbol" w:hint="default"/>
+      </w:rPr>
+    </w:lvl>
+    <w:lvl w:ilvl="4" w:tplc="40090003" w:tentative="1">
+      <w:start w:val="1"/>
+      <w:numFmt w:val="bullet"/>
+      <w:lvlText w:val="o"/>
+      <w:lvlJc w:val="left"/>
+      <w:pPr>
+        <w:ind w:left="3960" w:hanging="360"/>
+      </w:pPr>
+      <w:rPr>
+        <w:rFonts w:ascii="Courier New" w:hAnsi="Courier New" w:cs="Courier New" w:hint="default"/>
+      </w:rPr>
+    </w:lvl>
+    <w:lvl w:ilvl="5" w:tplc="40090005" w:tentative="1">
+      <w:start w:val="1"/>
+      <w:numFmt w:val="bullet"/>
+      <w:lvlText w:val=""/>
+      <w:lvlJc w:val="left"/>
+      <w:pPr>
+        <w:ind w:left="4680" w:hanging="360"/>
+      </w:pPr>
+      <w:rPr>
+        <w:rFonts w:ascii="Wingdings" w:hAnsi="Wingdings" w:hint="default"/>
+      </w:rPr>
+    </w:lvl>
+    <w:lvl w:ilvl="6" w:tplc="40090001" w:tentative="1">
+      <w:start w:val="1"/>
+      <w:numFmt w:val="bullet"/>
+      <w:lvlText w:val=""/>
+      <w:lvlJc w:val="left"/>
+      <w:pPr>
+        <w:ind w:left="5400" w:hanging="360"/>
+      </w:pPr>
+      <w:rPr>
+        <w:rFonts w:ascii="Symbol" w:hAnsi="Symbol" w:hint="default"/>
+      </w:rPr>
+    </w:lvl>
+    <w:lvl w:ilvl="7" w:tplc="40090003" w:tentative="1">
+      <w:start w:val="1"/>
+      <w:numFmt w:val="bullet"/>
+      <w:lvlText w:val="o"/>
+      <w:lvlJc w:val="left"/>
+      <w:pPr>
+        <w:ind w:left="6120" w:hanging="360"/>
+      </w:pPr>
+      <w:rPr>
+        <w:rFonts w:ascii="Courier New" w:hAnsi="Courier New" w:cs="Courier New" w:hint="default"/>
+      </w:rPr>
+    </w:lvl>
+    <w:lvl w:ilvl="8" w:tplc="40090005" w:tentative="1">
+      <w:start w:val="1"/>
+      <w:numFmt w:val="bullet"/>
+      <w:lvlText w:val=""/>
+      <w:lvlJc w:val="left"/>
+      <w:pPr>
+        <w:ind w:left="6840" w:hanging="360"/>
+      </w:pPr>
+      <w:rPr>
+        <w:rFonts w:ascii="Wingdings" w:hAnsi="Wingdings" w:hint="default"/>
+      </w:rPr>
+    </w:lvl>
+  </w:abstractNum>
+  <w:abstractNum w:abstractNumId="12" w15:restartNumberingAfterBreak="0">
+    <w:nsid w:val="3FEF7FD3"/>
+    <w:multiLevelType w:val="multilevel"/>
+    <w:tmpl w:val="4BDC9CA8"/>
+    <w:lvl w:ilvl="0">
+      <w:start w:val="1"/>
+      <w:numFmt w:val="bullet"/>
+      <w:lvlText w:val=""/>
+      <w:lvlJc w:val="left"/>
+      <w:pPr>
+        <w:tabs>
+          <w:tab w:val="num" w:pos="720"/>
+        </w:tabs>
+        <w:ind w:left="720" w:hanging="360"/>
+      </w:pPr>
+      <w:rPr>
+        <w:rFonts w:ascii="Symbol" w:hAnsi="Symbol" w:hint="default"/>
+        <w:sz w:val="20"/>
+      </w:rPr>
+    </w:lvl>
+    <w:lvl w:ilvl="1" w:tentative="1">
+      <w:start w:val="1"/>
+      <w:numFmt w:val="bullet"/>
+      <w:lvlText w:val="o"/>
+      <w:lvlJc w:val="left"/>
+      <w:pPr>
+        <w:tabs>
+          <w:tab w:val="num" w:pos="1440"/>
+        </w:tabs>
+        <w:ind w:left="1440" w:hanging="360"/>
+      </w:pPr>
+      <w:rPr>
+        <w:rFonts w:ascii="Courier New" w:hAnsi="Courier New" w:hint="default"/>
+        <w:sz w:val="20"/>
+      </w:rPr>
+    </w:lvl>
+    <w:lvl w:ilvl="2" w:tentative="1">
+      <w:start w:val="1"/>
+      <w:numFmt w:val="bullet"/>
+      <w:lvlText w:val=""/>
+      <w:lvlJc w:val="left"/>
+      <w:pPr>
+        <w:tabs>
+          <w:tab w:val="num" w:pos="2160"/>
+        </w:tabs>
+        <w:ind w:left="2160" w:hanging="360"/>
+      </w:pPr>
+      <w:rPr>
+        <w:rFonts w:ascii="Wingdings" w:hAnsi="Wingdings" w:hint="default"/>
+        <w:sz w:val="20"/>
+      </w:rPr>
+    </w:lvl>
+    <w:lvl w:ilvl="3" w:tentative="1">
+      <w:start w:val="1"/>
+      <w:numFmt w:val="bullet"/>
+      <w:lvlText w:val=""/>
+      <w:lvlJc w:val="left"/>
+      <w:pPr>
+        <w:tabs>
+          <w:tab w:val="num" w:pos="2880"/>
+        </w:tabs>
+        <w:ind w:left="2880" w:hanging="360"/>
+      </w:pPr>
+      <w:rPr>
+        <w:rFonts w:ascii="Wingdings" w:hAnsi="Wingdings" w:hint="default"/>
+        <w:sz w:val="20"/>
+      </w:rPr>
+    </w:lvl>
+    <w:lvl w:ilvl="4" w:tentative="1">
+      <w:start w:val="1"/>
+      <w:numFmt w:val="bullet"/>
+      <w:lvlText w:val=""/>
+      <w:lvlJc w:val="left"/>
+      <w:pPr>
+        <w:tabs>
+          <w:tab w:val="num" w:pos="3600"/>
+        </w:tabs>
+        <w:ind w:left="3600" w:hanging="360"/>
+      </w:pPr>
+      <w:rPr>
+        <w:rFonts w:ascii="Wingdings" w:hAnsi="Wingdings" w:hint="default"/>
+        <w:sz w:val="20"/>
+      </w:rPr>
+    </w:lvl>
+    <w:lvl w:ilvl="5" w:tentative="1">
+      <w:start w:val="1"/>
+      <w:numFmt w:val="bullet"/>
+      <w:lvlText w:val=""/>
+      <w:lvlJc w:val="left"/>
+      <w:pPr>
+        <w:tabs>
+          <w:tab w:val="num" w:pos="4320"/>
+        </w:tabs>
+        <w:ind w:left="4320" w:hanging="360"/>
+      </w:pPr>
+      <w:rPr>
+        <w:rFonts w:ascii="Wingdings" w:hAnsi="Wingdings" w:hint="default"/>
+        <w:sz w:val="20"/>
+      </w:rPr>
+    </w:lvl>
+    <w:lvl w:ilvl="6" w:tentative="1">
+      <w:start w:val="1"/>
+      <w:numFmt w:val="bullet"/>
+      <w:lvlText w:val=""/>
+      <w:lvlJc w:val="left"/>
+      <w:pPr>
+        <w:tabs>
+          <w:tab w:val="num" w:pos="5040"/>
+        </w:tabs>
+        <w:ind w:left="5040" w:hanging="360"/>
+      </w:pPr>
+      <w:rPr>
+        <w:rFonts w:ascii="Wingdings" w:hAnsi="Wingdings" w:hint="default"/>
+        <w:sz w:val="20"/>
+      </w:rPr>
+    </w:lvl>
+    <w:lvl w:ilvl="7" w:tentative="1">
+      <w:start w:val="1"/>
+      <w:numFmt w:val="bullet"/>
+      <w:lvlText w:val=""/>
+      <w:lvlJc w:val="left"/>
+      <w:pPr>
+        <w:tabs>
+          <w:tab w:val="num" w:pos="5760"/>
+        </w:tabs>
+        <w:ind w:left="5760" w:hanging="360"/>
+      </w:pPr>
+      <w:rPr>
+        <w:rFonts w:ascii="Wingdings" w:hAnsi="Wingdings" w:hint="default"/>
+        <w:sz w:val="20"/>
+      </w:rPr>
+    </w:lvl>
+    <w:lvl w:ilvl="8" w:tentative="1">
+      <w:start w:val="1"/>
+      <w:numFmt w:val="bullet"/>
+      <w:lvlText w:val=""/>
+      <w:lvlJc w:val="left"/>
+      <w:pPr>
+        <w:tabs>
+          <w:tab w:val="num" w:pos="6480"/>
+        </w:tabs>
+        <w:ind w:left="6480" w:hanging="360"/>
+      </w:pPr>
+      <w:rPr>
+        <w:rFonts w:ascii="Wingdings" w:hAnsi="Wingdings" w:hint="default"/>
+        <w:sz w:val="20"/>
+      </w:rPr>
+    </w:lvl>
+  </w:abstractNum>
+  <w:abstractNum w:abstractNumId="13" w15:restartNumberingAfterBreak="0">
+    <w:nsid w:val="45546783"/>
+    <w:multiLevelType w:val="hybridMultilevel"/>
+    <w:tmpl w:val="C29A1E90"/>
+    <w:lvl w:ilvl="0" w:tplc="40090001">
+      <w:start w:val="1"/>
+      <w:numFmt w:val="bullet"/>
+      <w:lvlText w:val=""/>
+      <w:lvlJc w:val="left"/>
+      <w:pPr>
+        <w:ind w:left="720" w:hanging="360"/>
+      </w:pPr>
+      <w:rPr>
+        <w:rFonts w:ascii="Symbol" w:hAnsi="Symbol" w:hint="default"/>
+      </w:rPr>
+    </w:lvl>
+    <w:lvl w:ilvl="1" w:tplc="40090003" w:tentative="1">
+      <w:start w:val="1"/>
+      <w:numFmt w:val="bullet"/>
+      <w:lvlText w:val="o"/>
+      <w:lvlJc w:val="left"/>
+      <w:pPr>
+        <w:ind w:left="1440" w:hanging="360"/>
+      </w:pPr>
+      <w:rPr>
+        <w:rFonts w:ascii="Courier New" w:hAnsi="Courier New" w:cs="Courier New" w:hint="default"/>
+      </w:rPr>
+    </w:lvl>
+    <w:lvl w:ilvl="2" w:tplc="40090005" w:tentative="1">
+      <w:start w:val="1"/>
+      <w:numFmt w:val="bullet"/>
+      <w:lvlText w:val=""/>
+      <w:lvlJc w:val="left"/>
+      <w:pPr>
+        <w:ind w:left="2160" w:hanging="360"/>
+      </w:pPr>
+      <w:rPr>
+        <w:rFonts w:ascii="Wingdings" w:hAnsi="Wingdings" w:hint="default"/>
+      </w:rPr>
+    </w:lvl>
+    <w:lvl w:ilvl="3" w:tplc="40090001" w:tentative="1">
+      <w:start w:val="1"/>
+      <w:numFmt w:val="bullet"/>
+      <w:lvlText w:val=""/>
+      <w:lvlJc w:val="left"/>
+      <w:pPr>
+        <w:ind w:left="2880" w:hanging="360"/>
+      </w:pPr>
+      <w:rPr>
+        <w:rFonts w:ascii="Symbol" w:hAnsi="Symbol" w:hint="default"/>
+      </w:rPr>
+    </w:lvl>
+    <w:lvl w:ilvl="4" w:tplc="40090003" w:tentative="1">
+      <w:start w:val="1"/>
+      <w:numFmt w:val="bullet"/>
+      <w:lvlText w:val="o"/>
+      <w:lvlJc w:val="left"/>
+      <w:pPr>
+        <w:ind w:left="3600" w:hanging="360"/>
+      </w:pPr>
+      <w:rPr>
+        <w:rFonts w:ascii="Courier New" w:hAnsi="Courier New" w:cs="Courier New" w:hint="default"/>
+      </w:rPr>
+    </w:lvl>
+    <w:lvl w:ilvl="5" w:tplc="40090005" w:tentative="1">
+      <w:start w:val="1"/>
+      <w:numFmt w:val="bullet"/>
+      <w:lvlText w:val=""/>
+      <w:lvlJc w:val="left"/>
+      <w:pPr>
+        <w:ind w:left="4320" w:hanging="360"/>
+      </w:pPr>
+      <w:rPr>
+        <w:rFonts w:ascii="Wingdings" w:hAnsi="Wingdings" w:hint="default"/>
+      </w:rPr>
+    </w:lvl>
+    <w:lvl w:ilvl="6" w:tplc="40090001" w:tentative="1">
+      <w:start w:val="1"/>
+      <w:numFmt w:val="bullet"/>
+      <w:lvlText w:val=""/>
+      <w:lvlJc w:val="left"/>
+      <w:pPr>
+        <w:ind w:left="5040" w:hanging="360"/>
+      </w:pPr>
+      <w:rPr>
+        <w:rFonts w:ascii="Symbol" w:hAnsi="Symbol" w:hint="default"/>
+      </w:rPr>
+    </w:lvl>
+    <w:lvl w:ilvl="7" w:tplc="40090003" w:tentative="1">
+      <w:start w:val="1"/>
+      <w:numFmt w:val="bullet"/>
+      <w:lvlText w:val="o"/>
+      <w:lvlJc w:val="left"/>
+      <w:pPr>
+        <w:ind w:left="5760" w:hanging="360"/>
+      </w:pPr>
+      <w:rPr>
+        <w:rFonts w:ascii="Courier New" w:hAnsi="Courier New" w:cs="Courier New" w:hint="default"/>
+      </w:rPr>
+    </w:lvl>
+    <w:lvl w:ilvl="8" w:tplc="40090005" w:tentative="1">
+      <w:start w:val="1"/>
+      <w:numFmt w:val="bullet"/>
+      <w:lvlText w:val=""/>
+      <w:lvlJc w:val="left"/>
+      <w:pPr>
+        <w:ind w:left="6480" w:hanging="360"/>
+      </w:pPr>
+      <w:rPr>
+        <w:rFonts w:ascii="Wingdings" w:hAnsi="Wingdings" w:hint="default"/>
+      </w:rPr>
+    </w:lvl>
+  </w:abstractNum>
+  <w:abstractNum w:abstractNumId="14" w15:restartNumberingAfterBreak="0">
+    <w:nsid w:val="488B50F9"/>
+    <w:multiLevelType w:val="hybridMultilevel"/>
+    <w:tmpl w:val="4AF4E1B2"/>
+    <w:lvl w:ilvl="0" w:tplc="40090001">
+      <w:start w:val="1"/>
+      <w:numFmt w:val="bullet"/>
+      <w:lvlText w:val=""/>
+      <w:lvlJc w:val="left"/>
+      <w:pPr>
+        <w:ind w:left="1080" w:hanging="360"/>
+      </w:pPr>
+      <w:rPr>
+        <w:rFonts w:ascii="Symbol" w:hAnsi="Symbol" w:hint="default"/>
+      </w:rPr>
+    </w:lvl>
+    <w:lvl w:ilvl="1" w:tplc="40090003" w:tentative="1">
+      <w:start w:val="1"/>
+      <w:numFmt w:val="bullet"/>
+      <w:lvlText w:val="o"/>
+      <w:lvlJc w:val="left"/>
+      <w:pPr>
+        <w:ind w:left="1800" w:hanging="360"/>
+      </w:pPr>
+      <w:rPr>
+        <w:rFonts w:ascii="Courier New" w:hAnsi="Courier New" w:cs="Courier New" w:hint="default"/>
+      </w:rPr>
+    </w:lvl>
+    <w:lvl w:ilvl="2" w:tplc="40090005" w:tentative="1">
+      <w:start w:val="1"/>
+      <w:numFmt w:val="bullet"/>
+      <w:lvlText w:val=""/>
+      <w:lvlJc w:val="left"/>
+      <w:pPr>
+        <w:ind w:left="2520" w:hanging="360"/>
+      </w:pPr>
+      <w:rPr>
+        <w:rFonts w:ascii="Wingdings" w:hAnsi="Wingdings" w:hint="default"/>
+      </w:rPr>
+    </w:lvl>
+    <w:lvl w:ilvl="3" w:tplc="40090001" w:tentative="1">
+      <w:start w:val="1"/>
+      <w:numFmt w:val="bullet"/>
+      <w:lvlText w:val=""/>
+      <w:lvlJc w:val="left"/>
+      <w:pPr>
+        <w:ind w:left="3240" w:hanging="360"/>
+      </w:pPr>
+      <w:rPr>
+        <w:rFonts w:ascii="Symbol" w:hAnsi="Symbol" w:hint="default"/>
+      </w:rPr>
+    </w:lvl>
+    <w:lvl w:ilvl="4" w:tplc="40090003" w:tentative="1">
+      <w:start w:val="1"/>
+      <w:numFmt w:val="bullet"/>
+      <w:lvlText w:val="o"/>
+      <w:lvlJc w:val="left"/>
+      <w:pPr>
+        <w:ind w:left="3960" w:hanging="360"/>
+      </w:pPr>
+      <w:rPr>
+        <w:rFonts w:ascii="Courier New" w:hAnsi="Courier New" w:cs="Courier New" w:hint="default"/>
+      </w:rPr>
+    </w:lvl>
+    <w:lvl w:ilvl="5" w:tplc="40090005" w:tentative="1">
+      <w:start w:val="1"/>
+      <w:numFmt w:val="bullet"/>
+      <w:lvlText w:val=""/>
+      <w:lvlJc w:val="left"/>
+      <w:pPr>
+        <w:ind w:left="4680" w:hanging="360"/>
+      </w:pPr>
+      <w:rPr>
+        <w:rFonts w:ascii="Wingdings" w:hAnsi="Wingdings" w:hint="default"/>
+      </w:rPr>
+    </w:lvl>
+    <w:lvl w:ilvl="6" w:tplc="40090001" w:tentative="1">
+      <w:start w:val="1"/>
+      <w:numFmt w:val="bullet"/>
+      <w:lvlText w:val=""/>
+      <w:lvlJc w:val="left"/>
+      <w:pPr>
+        <w:ind w:left="5400" w:hanging="360"/>
+      </w:pPr>
+      <w:rPr>
+        <w:rFonts w:ascii="Symbol" w:hAnsi="Symbol" w:hint="default"/>
+      </w:rPr>
+    </w:lvl>
+    <w:lvl w:ilvl="7" w:tplc="40090003" w:tentative="1">
+      <w:start w:val="1"/>
+      <w:numFmt w:val="bullet"/>
+      <w:lvlText w:val="o"/>
+      <w:lvlJc w:val="left"/>
+      <w:pPr>
+        <w:ind w:left="6120" w:hanging="360"/>
+      </w:pPr>
+      <w:rPr>
+        <w:rFonts w:ascii="Courier New" w:hAnsi="Courier New" w:cs="Courier New" w:hint="default"/>
+      </w:rPr>
+    </w:lvl>
+    <w:lvl w:ilvl="8" w:tplc="40090005" w:tentative="1">
+      <w:start w:val="1"/>
+      <w:numFmt w:val="bullet"/>
+      <w:lvlText w:val=""/>
+      <w:lvlJc w:val="left"/>
+      <w:pPr>
+        <w:ind w:left="6840" w:hanging="360"/>
+      </w:pPr>
+      <w:rPr>
+        <w:rFonts w:ascii="Wingdings" w:hAnsi="Wingdings" w:hint="default"/>
+      </w:rPr>
+    </w:lvl>
+  </w:abstractNum>
+  <w:abstractNum w:abstractNumId="15" w15:restartNumberingAfterBreak="0">
+    <w:nsid w:val="665E6836"/>
+    <w:multiLevelType w:val="hybridMultilevel"/>
+    <w:tmpl w:val="327C1B88"/>
+    <w:lvl w:ilvl="0" w:tplc="4009000F">
+      <w:start w:val="1"/>
+      <w:numFmt w:val="decimal"/>
+      <w:lvlText w:val="%1."/>
+      <w:lvlJc w:val="left"/>
+      <w:pPr>
+        <w:ind w:left="720" w:hanging="360"/>
+      </w:pPr>
+      <w:rPr>
+        <w:rFonts w:hint="default"/>
+      </w:rPr>
+    </w:lvl>
+    <w:lvl w:ilvl="1" w:tplc="40090019">
+      <w:start w:val="1"/>
+      <w:numFmt w:val="lowerLetter"/>
+      <w:lvlText w:val="%2."/>
+      <w:lvlJc w:val="left"/>
+      <w:pPr>
+        <w:ind w:left="1440" w:hanging="360"/>
+      </w:pPr>
+    </w:lvl>
+    <w:lvl w:ilvl="2" w:tplc="4009001B">
+      <w:start w:val="1"/>
+      <w:numFmt w:val="lowerRoman"/>
+      <w:lvlText w:val="%3."/>
+      <w:lvlJc w:val="right"/>
+      <w:pPr>
+        <w:ind w:left="2160" w:hanging="180"/>
+      </w:pPr>
+    </w:lvl>
+    <w:lvl w:ilvl="3" w:tplc="4009000F">
+      <w:start w:val="1"/>
+      <w:numFmt w:val="decimal"/>
+      <w:lvlText w:val="%4."/>
+      <w:lvlJc w:val="left"/>
+      <w:pPr>
+        <w:ind w:left="2880" w:hanging="360"/>
+      </w:pPr>
+    </w:lvl>
+    <w:lvl w:ilvl="4" w:tplc="40090019">
+      <w:start w:val="1"/>
+      <w:numFmt w:val="lowerLetter"/>
+      <w:lvlText w:val="%5."/>
+      <w:lvlJc w:val="left"/>
+      <w:pPr>
+        <w:ind w:left="3600" w:hanging="360"/>
+      </w:pPr>
+    </w:lvl>
+    <w:lvl w:ilvl="5" w:tplc="4009001B">
+      <w:start w:val="1"/>
+      <w:numFmt w:val="lowerRoman"/>
+      <w:lvlText w:val="%6."/>
+      <w:lvlJc w:val="right"/>
+      <w:pPr>
+        <w:ind w:left="4320" w:hanging="180"/>
+      </w:pPr>
+    </w:lvl>
+    <w:lvl w:ilvl="6" w:tplc="4009000F" w:tentative="1">
+      <w:start w:val="1"/>
+      <w:numFmt w:val="decimal"/>
+      <w:lvlText w:val="%7."/>
+      <w:lvlJc w:val="left"/>
+      <w:pPr>
+        <w:ind w:left="5040" w:hanging="360"/>
+      </w:pPr>
+    </w:lvl>
+    <w:lvl w:ilvl="7" w:tplc="40090019" w:tentative="1">
+      <w:start w:val="1"/>
+      <w:numFmt w:val="lowerLetter"/>
+      <w:lvlText w:val="%8."/>
+      <w:lvlJc w:val="left"/>
+      <w:pPr>
+        <w:ind w:left="5760" w:hanging="360"/>
+      </w:pPr>
+    </w:lvl>
+    <w:lvl w:ilvl="8" w:tplc="4009001B" w:tentative="1">
+      <w:start w:val="1"/>
+      <w:numFmt w:val="lowerRoman"/>
+      <w:lvlText w:val="%9."/>
+      <w:lvlJc w:val="right"/>
+      <w:pPr>
+        <w:ind w:left="6480" w:hanging="180"/>
+      </w:pPr>
+    </w:lvl>
+  </w:abstractNum>
+  <w:abstractNum w:abstractNumId="16" w15:restartNumberingAfterBreak="0">
+    <w:nsid w:val="6E5462A5"/>
+    <w:multiLevelType w:val="hybridMultilevel"/>
+    <w:tmpl w:val="39D4D97E"/>
+    <w:lvl w:ilvl="0" w:tplc="40090001">
+      <w:start w:val="1"/>
+      <w:numFmt w:val="bullet"/>
+      <w:lvlText w:val=""/>
+      <w:lvlJc w:val="left"/>
+      <w:pPr>
+        <w:ind w:left="1446" w:hanging="360"/>
+      </w:pPr>
+      <w:rPr>
+        <w:rFonts w:ascii="Symbol" w:hAnsi="Symbol" w:hint="default"/>
+      </w:rPr>
+    </w:lvl>
+    <w:lvl w:ilvl="1" w:tplc="40090003" w:tentative="1">
+      <w:start w:val="1"/>
+      <w:numFmt w:val="bullet"/>
+      <w:lvlText w:val="o"/>
+      <w:lvlJc w:val="left"/>
+      <w:pPr>
+        <w:ind w:left="2166" w:hanging="360"/>
+      </w:pPr>
+      <w:rPr>
+        <w:rFonts w:ascii="Courier New" w:hAnsi="Courier New" w:cs="Courier New" w:hint="default"/>
+      </w:rPr>
+    </w:lvl>
+    <w:lvl w:ilvl="2" w:tplc="40090005" w:tentative="1">
+      <w:start w:val="1"/>
+      <w:numFmt w:val="bullet"/>
+      <w:lvlText w:val=""/>
+      <w:lvlJc w:val="left"/>
+      <w:pPr>
+        <w:ind w:left="2886" w:hanging="360"/>
+      </w:pPr>
+      <w:rPr>
+        <w:rFonts w:ascii="Wingdings" w:hAnsi="Wingdings" w:hint="default"/>
+      </w:rPr>
+    </w:lvl>
+    <w:lvl w:ilvl="3" w:tplc="40090001" w:tentative="1">
+      <w:start w:val="1"/>
+      <w:numFmt w:val="bullet"/>
+      <w:lvlText w:val=""/>
+      <w:lvlJc w:val="left"/>
+      <w:pPr>
+        <w:ind w:left="3606" w:hanging="360"/>
+      </w:pPr>
+      <w:rPr>
+        <w:rFonts w:ascii="Symbol" w:hAnsi="Symbol" w:hint="default"/>
+      </w:rPr>
+    </w:lvl>
+    <w:lvl w:ilvl="4" w:tplc="40090003" w:tentative="1">
+      <w:start w:val="1"/>
+      <w:numFmt w:val="bullet"/>
+      <w:lvlText w:val="o"/>
+      <w:lvlJc w:val="left"/>
+      <w:pPr>
+        <w:ind w:left="4326" w:hanging="360"/>
+      </w:pPr>
+      <w:rPr>
+        <w:rFonts w:ascii="Courier New" w:hAnsi="Courier New" w:cs="Courier New" w:hint="default"/>
+      </w:rPr>
+    </w:lvl>
+    <w:lvl w:ilvl="5" w:tplc="40090005" w:tentative="1">
+      <w:start w:val="1"/>
+      <w:numFmt w:val="bullet"/>
+      <w:lvlText w:val=""/>
+      <w:lvlJc w:val="left"/>
+      <w:pPr>
+        <w:ind w:left="5046" w:hanging="360"/>
+      </w:pPr>
+      <w:rPr>
+        <w:rFonts w:ascii="Wingdings" w:hAnsi="Wingdings" w:hint="default"/>
+      </w:rPr>
+    </w:lvl>
+    <w:lvl w:ilvl="6" w:tplc="40090001" w:tentative="1">
+      <w:start w:val="1"/>
+      <w:numFmt w:val="bullet"/>
+      <w:lvlText w:val=""/>
+      <w:lvlJc w:val="left"/>
+      <w:pPr>
+        <w:ind w:left="5766" w:hanging="360"/>
+      </w:pPr>
+      <w:rPr>
+        <w:rFonts w:ascii="Symbol" w:hAnsi="Symbol" w:hint="default"/>
+      </w:rPr>
+    </w:lvl>
+    <w:lvl w:ilvl="7" w:tplc="40090003" w:tentative="1">
+      <w:start w:val="1"/>
+      <w:numFmt w:val="bullet"/>
+      <w:lvlText w:val="o"/>
+      <w:lvlJc w:val="left"/>
+      <w:pPr>
+        <w:ind w:left="6486" w:hanging="360"/>
+      </w:pPr>
+      <w:rPr>
+        <w:rFonts w:ascii="Courier New" w:hAnsi="Courier New" w:cs="Courier New" w:hint="default"/>
+      </w:rPr>
+    </w:lvl>
+    <w:lvl w:ilvl="8" w:tplc="40090005" w:tentative="1">
+      <w:start w:val="1"/>
+      <w:numFmt w:val="bullet"/>
+      <w:lvlText w:val=""/>
+      <w:lvlJc w:val="left"/>
+      <w:pPr>
+        <w:ind w:left="7206" w:hanging="360"/>
+      </w:pPr>
+      <w:rPr>
+        <w:rFonts w:ascii="Wingdings" w:hAnsi="Wingdings" w:hint="default"/>
+      </w:rPr>
+    </w:lvl>
+  </w:abstractNum>
+  <w:abstractNum w:abstractNumId="17" w15:restartNumberingAfterBreak="0">
+    <w:nsid w:val="73E97109"/>
+    <w:multiLevelType w:val="hybridMultilevel"/>
+    <w:tmpl w:val="5F549056"/>
+    <w:lvl w:ilvl="0" w:tplc="40090001">
+      <w:start w:val="1"/>
+      <w:numFmt w:val="bullet"/>
+      <w:lvlText w:val=""/>
+      <w:lvlJc w:val="left"/>
+      <w:pPr>
+        <w:ind w:left="720" w:hanging="360"/>
+      </w:pPr>
+      <w:rPr>
+        <w:rFonts w:ascii="Symbol" w:hAnsi="Symbol" w:hint="default"/>
+      </w:rPr>
+    </w:lvl>
+    <w:lvl w:ilvl="1" w:tplc="40090003" w:tentative="1">
+      <w:start w:val="1"/>
+      <w:numFmt w:val="bullet"/>
+      <w:lvlText w:val="o"/>
+      <w:lvlJc w:val="left"/>
+      <w:pPr>
+        <w:ind w:left="1440" w:hanging="360"/>
+      </w:pPr>
+      <w:rPr>
+        <w:rFonts w:ascii="Courier New" w:hAnsi="Courier New" w:cs="Courier New" w:hint="default"/>
+      </w:rPr>
+    </w:lvl>
+    <w:lvl w:ilvl="2" w:tplc="40090005" w:tentative="1">
+      <w:start w:val="1"/>
+      <w:numFmt w:val="bullet"/>
+      <w:lvlText w:val=""/>
+      <w:lvlJc w:val="left"/>
+      <w:pPr>
+        <w:ind w:left="2160" w:hanging="360"/>
+      </w:pPr>
+      <w:rPr>
+        <w:rFonts w:ascii="Wingdings" w:hAnsi="Wingdings" w:hint="default"/>
+      </w:rPr>
+    </w:lvl>
+    <w:lvl w:ilvl="3" w:tplc="40090001" w:tentative="1">
+      <w:start w:val="1"/>
+      <w:numFmt w:val="bullet"/>
+      <w:lvlText w:val=""/>
+      <w:lvlJc w:val="left"/>
+      <w:pPr>
+        <w:ind w:left="2880" w:hanging="360"/>
+      </w:pPr>
+      <w:rPr>
+        <w:rFonts w:ascii="Symbol" w:hAnsi="Symbol" w:hint="default"/>
+      </w:rPr>
+    </w:lvl>
+    <w:lvl w:ilvl="4" w:tplc="40090003" w:tentative="1">
+      <w:start w:val="1"/>
+      <w:numFmt w:val="bullet"/>
+      <w:lvlText w:val="o"/>
+      <w:lvlJc w:val="left"/>
+      <w:pPr>
+        <w:ind w:left="3600" w:hanging="360"/>
+      </w:pPr>
+      <w:rPr>
+        <w:rFonts w:ascii="Courier New" w:hAnsi="Courier New" w:cs="Courier New" w:hint="default"/>
+      </w:rPr>
+    </w:lvl>
+    <w:lvl w:ilvl="5" w:tplc="40090005" w:tentative="1">
+      <w:start w:val="1"/>
+      <w:numFmt w:val="bullet"/>
+      <w:lvlText w:val=""/>
+      <w:lvlJc w:val="left"/>
+      <w:pPr>
+        <w:ind w:left="4320" w:hanging="360"/>
+      </w:pPr>
+      <w:rPr>
+        <w:rFonts w:ascii="Wingdings" w:hAnsi="Wingdings" w:hint="default"/>
+      </w:rPr>
+    </w:lvl>
+    <w:lvl w:ilvl="6" w:tplc="40090001" w:tentative="1">
+      <w:start w:val="1"/>
+      <w:numFmt w:val="bullet"/>
+      <w:lvlText w:val=""/>
+      <w:lvlJc w:val="left"/>
+      <w:pPr>
+        <w:ind w:left="5040" w:hanging="360"/>
+      </w:pPr>
+      <w:rPr>
+        <w:rFonts w:ascii="Symbol" w:hAnsi="Symbol" w:hint="default"/>
+      </w:rPr>
+    </w:lvl>
+    <w:lvl w:ilvl="7" w:tplc="40090003" w:tentative="1">
+      <w:start w:val="1"/>
+      <w:numFmt w:val="bullet"/>
+      <w:lvlText w:val="o"/>
+      <w:lvlJc w:val="left"/>
+      <w:pPr>
+        <w:ind w:left="5760" w:hanging="360"/>
+      </w:pPr>
+      <w:rPr>
+        <w:rFonts w:ascii="Courier New" w:hAnsi="Courier New" w:cs="Courier New" w:hint="default"/>
+      </w:rPr>
+    </w:lvl>
+    <w:lvl w:ilvl="8" w:tplc="40090005" w:tentative="1">
+      <w:start w:val="1"/>
+      <w:numFmt w:val="bullet"/>
+      <w:lvlText w:val=""/>
+      <w:lvlJc w:val="left"/>
+      <w:pPr>
+        <w:ind w:left="6480" w:hanging="360"/>
+      </w:pPr>
+      <w:rPr>
+        <w:rFonts w:ascii="Wingdings" w:hAnsi="Wingdings" w:hint="default"/>
+      </w:rPr>
+    </w:lvl>
+  </w:abstractNum>
+  <w:abstractNum w:abstractNumId="18" w15:restartNumberingAfterBreak="0">
+    <w:nsid w:val="7F400690"/>
+    <w:multiLevelType w:val="hybridMultilevel"/>
+    <w:tmpl w:val="96FE2352"/>
+    <w:lvl w:ilvl="0" w:tplc="5A3E9614">
+      <w:start w:val="1"/>
+      <w:numFmt w:val="decimal"/>
+      <w:lvlText w:val="%1."/>
+      <w:lvlJc w:val="left"/>
+      <w:pPr>
+        <w:ind w:left="720" w:hanging="360"/>
+      </w:pPr>
+      <w:rPr>
+        <w:b/>
+        <w:bCs/>
+      </w:rPr>
+    </w:lvl>
+    <w:lvl w:ilvl="1" w:tplc="40090019">
+      <w:start w:val="1"/>
+      <w:numFmt w:val="lowerLetter"/>
+      <w:lvlText w:val="%2."/>
+      <w:lvlJc w:val="left"/>
+      <w:pPr>
+        <w:ind w:left="1440" w:hanging="360"/>
+      </w:pPr>
+    </w:lvl>
+    <w:lvl w:ilvl="2" w:tplc="4009001B" w:tentative="1">
+      <w:start w:val="1"/>
+      <w:numFmt w:val="lowerRoman"/>
+      <w:lvlText w:val="%3."/>
+      <w:lvlJc w:val="right"/>
+      <w:pPr>
+        <w:ind w:left="2160" w:hanging="180"/>
+      </w:pPr>
+    </w:lvl>
+    <w:lvl w:ilvl="3" w:tplc="4009000F" w:tentative="1">
+      <w:start w:val="1"/>
+      <w:numFmt w:val="decimal"/>
+      <w:lvlText w:val="%4."/>
+      <w:lvlJc w:val="left"/>
+      <w:pPr>
+        <w:ind w:left="2880" w:hanging="360"/>
+      </w:pPr>
+    </w:lvl>
+    <w:lvl w:ilvl="4" w:tplc="40090019" w:tentative="1">
+      <w:start w:val="1"/>
+      <w:numFmt w:val="lowerLetter"/>
+      <w:lvlText w:val="%5."/>
+      <w:lvlJc w:val="left"/>
+      <w:pPr>
+        <w:ind w:left="3600" w:hanging="360"/>
+      </w:pPr>
+    </w:lvl>
+    <w:lvl w:ilvl="5" w:tplc="4009001B" w:tentative="1">
+      <w:start w:val="1"/>
+      <w:numFmt w:val="lowerRoman"/>
+      <w:lvlText w:val="%6."/>
+      <w:lvlJc w:val="right"/>
+      <w:pPr>
+        <w:ind w:left="4320" w:hanging="180"/>
+      </w:pPr>
+    </w:lvl>
+    <w:lvl w:ilvl="6" w:tplc="4009000F" w:tentative="1">
+      <w:start w:val="1"/>
+      <w:numFmt w:val="decimal"/>
+      <w:lvlText w:val="%7."/>
+      <w:lvlJc w:val="left"/>
+      <w:pPr>
+        <w:ind w:left="5040" w:hanging="360"/>
+      </w:pPr>
+    </w:lvl>
+    <w:lvl w:ilvl="7" w:tplc="40090019" w:tentative="1">
+      <w:start w:val="1"/>
+      <w:numFmt w:val="lowerLetter"/>
+      <w:lvlText w:val="%8."/>
+      <w:lvlJc w:val="left"/>
+      <w:pPr>
+        <w:ind w:left="5760" w:hanging="360"/>
+      </w:pPr>
+    </w:lvl>
+    <w:lvl w:ilvl="8" w:tplc="4009001B" w:tentative="1">
+      <w:start w:val="1"/>
+      <w:numFmt w:val="lowerRoman"/>
+      <w:lvlText w:val="%9."/>
+      <w:lvlJc w:val="right"/>
+      <w:pPr>
+        <w:ind w:left="6480" w:hanging="180"/>
+      </w:pPr>
+    </w:lvl>
+  </w:abstractNum>
   <w:num w:numId="1" w16cid:durableId="967128401">
-    <w:abstractNumId w:val="1"/>
+    <w:abstractNumId w:val="4"/>
   </w:num>
   <w:num w:numId="2" w16cid:durableId="394010046">
-    <w:abstractNumId w:val="3"/>
+    <w:abstractNumId w:val="9"/>
   </w:num>
   <w:num w:numId="3" w16cid:durableId="1219584200">
-    <w:abstractNumId w:val="2"/>
+    <w:abstractNumId w:val="6"/>
   </w:num>
   <w:num w:numId="4" w16cid:durableId="1482426334">
     <w:abstractNumId w:val="0"/>
+  </w:num>
+  <w:num w:numId="5" w16cid:durableId="51586480">
+    <w:abstractNumId w:val="18"/>
+  </w:num>
+  <w:num w:numId="6" w16cid:durableId="291400334">
+    <w:abstractNumId w:val="7"/>
+  </w:num>
+  <w:num w:numId="7" w16cid:durableId="1242831358">
+    <w:abstractNumId w:val="5"/>
+  </w:num>
+  <w:num w:numId="8" w16cid:durableId="2141605364">
+    <w:abstractNumId w:val="14"/>
+  </w:num>
+  <w:num w:numId="9" w16cid:durableId="39060268">
+    <w:abstractNumId w:val="16"/>
+  </w:num>
+  <w:num w:numId="10" w16cid:durableId="1033075945">
+    <w:abstractNumId w:val="12"/>
+  </w:num>
+  <w:num w:numId="11" w16cid:durableId="1170943159">
+    <w:abstractNumId w:val="10"/>
+  </w:num>
+  <w:num w:numId="12" w16cid:durableId="383456835">
+    <w:abstractNumId w:val="13"/>
+  </w:num>
+  <w:num w:numId="13" w16cid:durableId="73555556">
+    <w:abstractNumId w:val="17"/>
+  </w:num>
+  <w:num w:numId="14" w16cid:durableId="265115548">
+    <w:abstractNumId w:val="8"/>
+  </w:num>
+  <w:num w:numId="15" w16cid:durableId="273295478">
+    <w:abstractNumId w:val="1"/>
+  </w:num>
+  <w:num w:numId="16" w16cid:durableId="760297462">
+    <w:abstractNumId w:val="3"/>
+  </w:num>
+  <w:num w:numId="17" w16cid:durableId="127431838">
+    <w:abstractNumId w:val="15"/>
+  </w:num>
+  <w:num w:numId="18" w16cid:durableId="1252928967">
+    <w:abstractNumId w:val="2"/>
+  </w:num>
+  <w:num w:numId="19" w16cid:durableId="330182803">
+    <w:abstractNumId w:val="11"/>
   </w:num>
 </w:numbering>
 </file>
@@ -932,7 +4167,7 @@
       <w:rPr>
         <w:rFonts w:asciiTheme="minorHAnsi" w:eastAsiaTheme="minorHAnsi" w:hAnsiTheme="minorHAnsi" w:cstheme="minorBidi"/>
         <w:kern w:val="2"/>
-        <w:sz w:val="24"/>
+        <w:sz w:val="32"/>
         <w:szCs w:val="24"/>
         <w:lang w:val="en-IN" w:eastAsia="en-US" w:bidi="ar-SA"/>
         <w14:ligatures w14:val="standardContextual"/>
@@ -1366,7 +4601,6 @@
     <w:rPr>
       <w:rFonts w:asciiTheme="majorHAnsi" w:eastAsiaTheme="majorEastAsia" w:hAnsiTheme="majorHAnsi" w:cstheme="majorBidi"/>
       <w:color w:val="0F4761" w:themeColor="accent1" w:themeShade="BF"/>
-      <w:sz w:val="32"/>
       <w:szCs w:val="32"/>
     </w:rPr>
   </w:style>
@@ -1528,7 +4762,6 @@
   <w:style w:type="character" w:default="1" w:styleId="DefaultParagraphFont">
     <w:name w:val="Default Paragraph Font"/>
     <w:uiPriority w:val="1"/>
-    <w:semiHidden/>
     <w:unhideWhenUsed/>
   </w:style>
   <w:style w:type="table" w:default="1" w:styleId="TableNormal">

</xml_diff>

<commit_message>
Linux notes + github
</commit_message>
<xml_diff>
--- a/Git_Github.docx
+++ b/Git_Github.docx
@@ -34,7 +34,7 @@
           <w:szCs w:val="32"/>
           <w:lang w:val="en-US"/>
         </w:rPr>
-        <w:t>Git is a software for a Version Control System (VCS).</w:t>
+        <w:t>Git is software for a Version Control System (VCS).</w:t>
       </w:r>
     </w:p>
     <w:p>
@@ -63,7 +63,21 @@
           <w:szCs w:val="32"/>
           <w:lang w:val="en-US"/>
         </w:rPr>
-        <w:t>: Who made, what change, when, and why.</w:t>
+        <w:t>: Who made</w:t>
+      </w:r>
+      <w:r>
+        <w:rPr>
+          <w:szCs w:val="32"/>
+          <w:lang w:val="en-US"/>
+        </w:rPr>
+        <w:t xml:space="preserve"> the change</w:t>
+      </w:r>
+      <w:r>
+        <w:rPr>
+          <w:szCs w:val="32"/>
+          <w:lang w:val="en-US"/>
+        </w:rPr>
+        <w:t>, what change, when, and why.</w:t>
       </w:r>
     </w:p>
     <w:p>
@@ -83,7 +97,7 @@
           <w:szCs w:val="32"/>
           <w:lang w:val="en-US"/>
         </w:rPr>
-        <w:t>Share across the team members</w:t>
+        <w:t>Share across team members</w:t>
       </w:r>
     </w:p>
     <w:p>
@@ -298,7 +312,14 @@
           <w:szCs w:val="32"/>
           <w:lang w:val="en-US"/>
         </w:rPr>
-        <w:t>Store the Git repos on the cloud.</w:t>
+        <w:t>Stores</w:t>
+      </w:r>
+      <w:r>
+        <w:rPr>
+          <w:szCs w:val="32"/>
+          <w:lang w:val="en-US"/>
+        </w:rPr>
+        <w:t xml:space="preserve"> the Git repos on the cloud.</w:t>
       </w:r>
     </w:p>
     <w:p>
@@ -723,7 +744,7 @@
           <w:lang w:val="en-US"/>
         </w:rPr>
         <w:drawing>
-          <wp:inline distT="0" distB="0" distL="0" distR="0" wp14:anchorId="1D65E668" wp14:editId="67BA9C09">
+          <wp:inline distT="0" distB="0" distL="0" distR="0" wp14:anchorId="1D65E668" wp14:editId="4B7966D6">
             <wp:extent cx="5731510" cy="3136265"/>
             <wp:effectExtent l="0" t="0" r="2540" b="6985"/>
             <wp:docPr id="1615480579" name="Picture 1"/>
@@ -784,16 +805,7 @@
           <w:bCs/>
           <w:lang w:val="en-US"/>
         </w:rPr>
-        <w:t xml:space="preserve">Git </w:t>
-      </w:r>
-      <w:proofErr w:type="gramStart"/>
-      <w:r>
-        <w:rPr>
-          <w:b/>
-          <w:bCs/>
-          <w:lang w:val="en-US"/>
-        </w:rPr>
-        <w:t>add</w:t>
+        <w:t>Git add</w:t>
       </w:r>
       <w:r>
         <w:rPr>
@@ -811,12 +823,47 @@
         </w:rPr>
         <w:t>.</w:t>
       </w:r>
-      <w:proofErr w:type="gramEnd"/>
-      <w:r>
-        <w:rPr>
-          <w:lang w:val="en-US"/>
-        </w:rPr>
-        <w:t xml:space="preserve"> The command is to track the changes on the local. Or we can say staging area.</w:t>
+      <w:r>
+        <w:rPr>
+          <w:lang w:val="en-US"/>
+        </w:rPr>
+        <w:t xml:space="preserve"> The command is </w:t>
+      </w:r>
+      <w:r>
+        <w:rPr>
+          <w:lang w:val="en-US"/>
+        </w:rPr>
+        <w:t xml:space="preserve">used </w:t>
+      </w:r>
+      <w:r>
+        <w:rPr>
+          <w:lang w:val="en-US"/>
+        </w:rPr>
+        <w:t xml:space="preserve">to track changes </w:t>
+      </w:r>
+      <w:r>
+        <w:rPr>
+          <w:lang w:val="en-US"/>
+        </w:rPr>
+        <w:t>locally</w:t>
+      </w:r>
+      <w:r>
+        <w:rPr>
+          <w:lang w:val="en-US"/>
+        </w:rPr>
+        <w:t xml:space="preserve">. Or we can say </w:t>
+      </w:r>
+      <w:r>
+        <w:rPr>
+          <w:lang w:val="en-US"/>
+        </w:rPr>
+        <w:t xml:space="preserve">the </w:t>
+      </w:r>
+      <w:r>
+        <w:rPr>
+          <w:lang w:val="en-US"/>
+        </w:rPr>
+        <w:t>staging area.</w:t>
       </w:r>
     </w:p>
     <w:p>
@@ -846,7 +893,19 @@
         <w:rPr>
           <w:lang w:val="en-US"/>
         </w:rPr>
-        <w:t>Commit saves the snapshot of your code.</w:t>
+        <w:t xml:space="preserve">Commit saves </w:t>
+      </w:r>
+      <w:r>
+        <w:rPr>
+          <w:lang w:val="en-US"/>
+        </w:rPr>
+        <w:t>a</w:t>
+      </w:r>
+      <w:r>
+        <w:rPr>
+          <w:lang w:val="en-US"/>
+        </w:rPr>
+        <w:t xml:space="preserve"> snapshot of your code.</w:t>
       </w:r>
       <w:r>
         <w:rPr>
@@ -941,24 +1000,13 @@
     </w:p>
     <w:p/>
     <w:p>
-      <w:proofErr w:type="gramStart"/>
-      <w:r>
-        <w:rPr>
-          <w:b/>
-          <w:bCs/>
-        </w:rPr>
-        <w:t>.</w:t>
-      </w:r>
-      <w:proofErr w:type="spellStart"/>
-      <w:r>
-        <w:rPr>
-          <w:b/>
-          <w:bCs/>
-        </w:rPr>
-        <w:t>gitignore</w:t>
-      </w:r>
-      <w:proofErr w:type="spellEnd"/>
-      <w:proofErr w:type="gramEnd"/>
+      <w:r>
+        <w:rPr>
+          <w:b/>
+          <w:bCs/>
+        </w:rPr>
+        <w:t>.gitignore</w:t>
+      </w:r>
       <w:r>
         <w:rPr>
           <w:b/>
@@ -966,18 +1014,8 @@
         </w:rPr>
         <w:t xml:space="preserve">: </w:t>
       </w:r>
-      <w:proofErr w:type="gramStart"/>
-      <w:r>
-        <w:t>A .</w:t>
-      </w:r>
-      <w:proofErr w:type="spellStart"/>
-      <w:r>
-        <w:t>gitignore</w:t>
-      </w:r>
-      <w:proofErr w:type="spellEnd"/>
-      <w:proofErr w:type="gramEnd"/>
-      <w:r>
-        <w:t xml:space="preserve"> file tells</w:t>
+      <w:r>
+        <w:t>A .gitignore file tells</w:t>
       </w:r>
       <w:r>
         <w:t xml:space="preserve"> Git which files or folders should not be tracked.</w:t>
@@ -1027,23 +1065,7 @@
           <w:b/>
           <w:bCs/>
         </w:rPr>
-        <w:t xml:space="preserve">git restore </w:t>
-      </w:r>
-      <w:proofErr w:type="spellStart"/>
-      <w:r>
-        <w:rPr>
-          <w:b/>
-          <w:bCs/>
-        </w:rPr>
-        <w:t>file_name</w:t>
-      </w:r>
-      <w:proofErr w:type="spellEnd"/>
-      <w:r>
-        <w:rPr>
-          <w:b/>
-          <w:bCs/>
-        </w:rPr>
-        <w:t>:</w:t>
+        <w:t>git restore file_name:</w:t>
       </w:r>
       <w:r>
         <w:t xml:space="preserve"> this command is for a specific file. Undo or discard a single file. </w:t>
@@ -1081,23 +1103,7 @@
           <w:b/>
           <w:bCs/>
         </w:rPr>
-        <w:t xml:space="preserve">git </w:t>
-      </w:r>
-      <w:proofErr w:type="gramStart"/>
-      <w:r>
-        <w:rPr>
-          <w:b/>
-          <w:bCs/>
-        </w:rPr>
-        <w:t>restore .</w:t>
-      </w:r>
-      <w:proofErr w:type="gramEnd"/>
-      <w:r>
-        <w:rPr>
-          <w:b/>
-          <w:bCs/>
-        </w:rPr>
-        <w:t xml:space="preserve"> </w:t>
+        <w:t xml:space="preserve">git restore . </w:t>
       </w:r>
       <w:r>
         <w:t>This command is for all files. Undo or discard all files.</w:t>
@@ -1253,15 +1259,13 @@
         </w:numPr>
       </w:pPr>
       <w:r>
-        <w:t xml:space="preserve">git </w:t>
-      </w:r>
-      <w:proofErr w:type="gramStart"/>
-      <w:r>
-        <w:t>restore .</w:t>
-      </w:r>
-      <w:proofErr w:type="gramEnd"/>
-      <w:r>
-        <w:t xml:space="preserve"> –staged: for all files</w:t>
+        <w:t xml:space="preserve">git restore . </w:t>
+      </w:r>
+      <w:r>
+        <w:t>--</w:t>
+      </w:r>
+      <w:r>
+        <w:t>staged: for all files</w:t>
       </w:r>
     </w:p>
     <w:p>
@@ -1273,7 +1277,13 @@
         </w:numPr>
       </w:pPr>
       <w:r>
-        <w:t>git restore –staged file1 file2</w:t>
+        <w:t>git restore</w:t>
+      </w:r>
+      <w:r>
+        <w:t xml:space="preserve"> --</w:t>
+      </w:r>
+      <w:r>
+        <w:t>staged file1 file2</w:t>
       </w:r>
     </w:p>
     <w:p/>
@@ -1289,13 +1299,8 @@
     </w:p>
     <w:p>
       <w:r>
-        <w:t xml:space="preserve">git </w:t>
-      </w:r>
-      <w:proofErr w:type="gramStart"/>
-      <w:r>
-        <w:t>add</w:t>
-      </w:r>
-      <w:proofErr w:type="gramEnd"/>
+        <w:t>git add</w:t>
+      </w:r>
     </w:p>
     <w:p>
       <w:r>
@@ -1599,31 +1604,7 @@
     </w:p>
     <w:p>
       <w:r>
-        <w:t>Working Directory(</w:t>
-      </w:r>
-      <w:proofErr w:type="gramStart"/>
-      <w:r>
-        <w:t>files)  →</w:t>
-      </w:r>
-      <w:proofErr w:type="gramEnd"/>
-      <w:r>
-        <w:t xml:space="preserve">  Staging </w:t>
-      </w:r>
-      <w:proofErr w:type="gramStart"/>
-      <w:r>
-        <w:t>Area(</w:t>
-      </w:r>
-      <w:proofErr w:type="gramEnd"/>
-      <w:r>
-        <w:t xml:space="preserve">git </w:t>
-      </w:r>
-      <w:proofErr w:type="gramStart"/>
-      <w:r>
-        <w:t>add)  →</w:t>
-      </w:r>
-      <w:proofErr w:type="gramEnd"/>
-      <w:r>
-        <w:t xml:space="preserve">  Local Repository(commits)</w:t>
+        <w:t>Working Directory(files)  →  Staging Area(git add)  →  Local Repository(commits)</w:t>
       </w:r>
     </w:p>
     <w:p/>
@@ -1651,7 +1632,7 @@
           <w:b/>
           <w:bCs/>
         </w:rPr>
-        <w:t>–</w:t>
+        <w:t>--</w:t>
       </w:r>
       <w:r>
         <w:rPr>
@@ -1673,15 +1654,7 @@
         <w:t xml:space="preserve">    </w:t>
       </w:r>
       <w:r>
-        <w:t xml:space="preserve">It is </w:t>
-      </w:r>
-      <w:proofErr w:type="gramStart"/>
-      <w:r>
-        <w:t>undo</w:t>
-      </w:r>
-      <w:proofErr w:type="gramEnd"/>
-      <w:r>
-        <w:t xml:space="preserve"> the commit but keep the changes staged.</w:t>
+        <w:t>It is undo the commit but keep the changes staged.</w:t>
       </w:r>
     </w:p>
     <w:p>
@@ -1719,15 +1692,13 @@
         <w:ind w:left="720"/>
       </w:pPr>
       <w:r>
-        <w:t>git log and git log –</w:t>
-      </w:r>
-      <w:proofErr w:type="spellStart"/>
-      <w:r>
-        <w:t>oneline</w:t>
-      </w:r>
-      <w:proofErr w:type="spellEnd"/>
-      <w:r>
-        <w:t>:  Show the history on Git.</w:t>
+        <w:t xml:space="preserve">git log and git log </w:t>
+      </w:r>
+      <w:r>
+        <w:t>--</w:t>
+      </w:r>
+      <w:r>
+        <w:t>oneline:  Show the history on Git.</w:t>
       </w:r>
       <w:r>
         <w:t>\</w:t>
@@ -1755,7 +1726,21 @@
           <w:b/>
           <w:bCs/>
         </w:rPr>
-        <w:t>git reset –mixed (Default)</w:t>
+        <w:t xml:space="preserve">git reset </w:t>
+      </w:r>
+      <w:r>
+        <w:rPr>
+          <w:b/>
+          <w:bCs/>
+        </w:rPr>
+        <w:t>--</w:t>
+      </w:r>
+      <w:r>
+        <w:rPr>
+          <w:b/>
+          <w:bCs/>
+        </w:rPr>
+        <w:t>mixed (Default)</w:t>
       </w:r>
     </w:p>
     <w:p>
@@ -1938,20 +1923,7 @@
     <w:p>
       <w:r>
         <w:tab/>
-        <w:t xml:space="preserve">With git aliases, we can write the short form of a command. We can make changes </w:t>
-      </w:r>
-      <w:proofErr w:type="gramStart"/>
-      <w:r>
-        <w:t>in .</w:t>
-      </w:r>
-      <w:proofErr w:type="spellStart"/>
-      <w:r>
-        <w:t>gitconfig</w:t>
-      </w:r>
-      <w:proofErr w:type="spellEnd"/>
-      <w:proofErr w:type="gramEnd"/>
-      <w:r>
-        <w:t xml:space="preserve"> file or with the command line.</w:t>
+        <w:t>With git aliases, we can write the short form of a command. We can make changes in .gitconfig file or with the command line.</w:t>
       </w:r>
     </w:p>
     <w:p>
@@ -1969,20 +1941,10 @@
     </w:p>
     <w:p>
       <w:r>
-        <w:t xml:space="preserve">git config --global </w:t>
-      </w:r>
-      <w:proofErr w:type="spellStart"/>
-      <w:proofErr w:type="gramStart"/>
-      <w:r>
-        <w:t>alias.</w:t>
-      </w:r>
-      <w:r>
-        <w:t>branch</w:t>
-      </w:r>
-      <w:proofErr w:type="spellEnd"/>
-      <w:proofErr w:type="gramEnd"/>
-      <w:r>
-        <w:t xml:space="preserve"> b (</w:t>
+        <w:t>git config --global alias.</w:t>
+      </w:r>
+      <w:r>
+        <w:t>branch b (</w:t>
       </w:r>
       <w:r>
         <w:t>Works</w:t>
@@ -1993,17 +1955,7 @@
     </w:p>
     <w:p>
       <w:r>
-        <w:t xml:space="preserve">git config </w:t>
-      </w:r>
-      <w:proofErr w:type="spellStart"/>
-      <w:proofErr w:type="gramStart"/>
-      <w:r>
-        <w:t>alias.status</w:t>
-      </w:r>
-      <w:proofErr w:type="spellEnd"/>
-      <w:proofErr w:type="gramEnd"/>
-      <w:r>
-        <w:t xml:space="preserve"> st (</w:t>
+        <w:t>git config alias.status st (</w:t>
       </w:r>
       <w:r>
         <w:t>Works</w:t>
@@ -2118,23 +2070,13 @@
     </w:p>
     <w:p>
       <w:r>
-        <w:t xml:space="preserve">git switch </w:t>
-      </w:r>
-      <w:proofErr w:type="spellStart"/>
-      <w:r>
-        <w:t>branch_name</w:t>
-      </w:r>
-      <w:proofErr w:type="spellEnd"/>
-    </w:p>
-    <w:p>
-      <w:r>
-        <w:t xml:space="preserve">git switch -c </w:t>
-      </w:r>
-      <w:proofErr w:type="spellStart"/>
-      <w:r>
-        <w:t>new_branch</w:t>
-      </w:r>
-      <w:proofErr w:type="spellEnd"/>
+        <w:t>git switch branch_name</w:t>
+      </w:r>
+    </w:p>
+    <w:p>
+      <w:r>
+        <w:t>git switch -c new_branch</w:t>
+      </w:r>
     </w:p>
     <w:p/>
     <w:p>
@@ -2154,15 +2096,7 @@
     </w:p>
     <w:p>
       <w:r>
-        <w:t>git clone &lt;repository-</w:t>
-      </w:r>
-      <w:proofErr w:type="spellStart"/>
-      <w:r>
-        <w:t>url</w:t>
-      </w:r>
-      <w:proofErr w:type="spellEnd"/>
-      <w:r>
-        <w:t>&gt;</w:t>
+        <w:t>git clone &lt;repository-url&gt;</w:t>
       </w:r>
     </w:p>
     <w:p/>
@@ -2281,29 +2215,13 @@
     <w:p>
       <w:r>
         <w:tab/>
-        <w:t xml:space="preserve">git switch -c </w:t>
-      </w:r>
-      <w:proofErr w:type="spellStart"/>
-      <w:r>
-        <w:t>new_branch_name</w:t>
-      </w:r>
-      <w:proofErr w:type="spellEnd"/>
-      <w:r>
-        <w:t>: It create new branch</w:t>
+        <w:t>git switch -c new_branch_name: It create new branch</w:t>
       </w:r>
     </w:p>
     <w:p>
       <w:r>
         <w:tab/>
-        <w:t xml:space="preserve">git switch </w:t>
-      </w:r>
-      <w:proofErr w:type="spellStart"/>
-      <w:r>
-        <w:t>branch_name</w:t>
-      </w:r>
-      <w:proofErr w:type="spellEnd"/>
-      <w:r>
-        <w:t>: Changes to another branch</w:t>
+        <w:t>git switch branch_name: Changes to another branch</w:t>
       </w:r>
     </w:p>
     <w:p/>
@@ -2466,23 +2384,7 @@
           <w:b/>
           <w:bCs/>
         </w:rPr>
-        <w:t>git diff –</w:t>
-      </w:r>
-      <w:proofErr w:type="spellStart"/>
-      <w:r>
-        <w:rPr>
-          <w:b/>
-          <w:bCs/>
-        </w:rPr>
-        <w:t>file_name</w:t>
-      </w:r>
-      <w:proofErr w:type="spellEnd"/>
-      <w:r>
-        <w:rPr>
-          <w:b/>
-          <w:bCs/>
-        </w:rPr>
-        <w:t xml:space="preserve">: </w:t>
+        <w:t xml:space="preserve">git diff –file_name: </w:t>
       </w:r>
       <w:r>
         <w:t>Compare specific file only.</w:t>
@@ -2505,17 +2407,8 @@
           <w:b/>
           <w:bCs/>
         </w:rPr>
-        <w:t xml:space="preserve">git diff commit1 commit2 -- </w:t>
-      </w:r>
-      <w:proofErr w:type="spellStart"/>
-      <w:r>
-        <w:rPr>
-          <w:b/>
-          <w:bCs/>
-        </w:rPr>
-        <w:t>file_name</w:t>
-      </w:r>
-      <w:proofErr w:type="spellEnd"/>
+        <w:t>git diff commit1 commit2 -- file_name</w:t>
+      </w:r>
       <w:r>
         <w:rPr>
           <w:b/>
@@ -2574,29 +2467,8 @@
           <w:numId w:val="22"/>
         </w:numPr>
       </w:pPr>
-      <w:proofErr w:type="spellStart"/>
-      <w:r>
-        <w:t>npm</w:t>
-      </w:r>
-      <w:proofErr w:type="spellEnd"/>
-      <w:r>
-        <w:t xml:space="preserve"> </w:t>
-      </w:r>
-      <w:proofErr w:type="spellStart"/>
-      <w:r>
-        <w:t>i</w:t>
-      </w:r>
-      <w:proofErr w:type="spellEnd"/>
-      <w:r>
-        <w:t xml:space="preserve"> </w:t>
-      </w:r>
-      <w:proofErr w:type="spellStart"/>
-      <w:r>
-        <w:t>gh</w:t>
-      </w:r>
-      <w:proofErr w:type="spellEnd"/>
-      <w:r>
-        <w:t>-pages</w:t>
+      <w:r>
+        <w:t>npm i gh-pages</w:t>
       </w:r>
     </w:p>
     <w:p>
@@ -2608,15 +2480,7 @@
         </w:numPr>
       </w:pPr>
       <w:r>
-        <w:t>vite.config.js =&gt; base:/</w:t>
-      </w:r>
-      <w:proofErr w:type="spellStart"/>
-      <w:r>
-        <w:t>repo_name</w:t>
-      </w:r>
-      <w:proofErr w:type="spellEnd"/>
-      <w:r>
-        <w:t>/</w:t>
+        <w:t>vite.config.js =&gt; base:/repo_name/</w:t>
       </w:r>
     </w:p>
     <w:p>
@@ -2627,21 +2491,9 @@
           <w:numId w:val="22"/>
         </w:numPr>
       </w:pPr>
-      <w:proofErr w:type="spellStart"/>
-      <w:proofErr w:type="gramStart"/>
-      <w:r>
-        <w:t>package.json</w:t>
-      </w:r>
-      <w:proofErr w:type="spellEnd"/>
-      <w:proofErr w:type="gramEnd"/>
-      <w:r>
-        <w:t xml:space="preserve"> =&gt; homepage: </w:t>
-      </w:r>
-      <w:proofErr w:type="spellStart"/>
-      <w:r>
-        <w:t>repo_url</w:t>
-      </w:r>
-      <w:proofErr w:type="spellEnd"/>
+      <w:r>
+        <w:t>package.json =&gt; homepage: repo_url</w:t>
+      </w:r>
     </w:p>
     <w:p>
       <w:pPr>
@@ -2652,23 +2504,7 @@
         </w:numPr>
       </w:pPr>
       <w:r>
-        <w:t>“deploy”: “</w:t>
-      </w:r>
-      <w:proofErr w:type="spellStart"/>
-      <w:r>
-        <w:t>gh</w:t>
-      </w:r>
-      <w:proofErr w:type="spellEnd"/>
-      <w:r>
-        <w:t xml:space="preserve">-pages -d </w:t>
-      </w:r>
-      <w:proofErr w:type="spellStart"/>
-      <w:r>
-        <w:t>dist</w:t>
-      </w:r>
-      <w:proofErr w:type="spellEnd"/>
-      <w:r>
-        <w:t>”</w:t>
+        <w:t>“deploy”: “gh-pages -d dist”</w:t>
       </w:r>
     </w:p>
     <w:p>
@@ -2679,13 +2515,8 @@
           <w:numId w:val="22"/>
         </w:numPr>
       </w:pPr>
-      <w:proofErr w:type="spellStart"/>
-      <w:r>
-        <w:t>npm</w:t>
-      </w:r>
-      <w:proofErr w:type="spellEnd"/>
-      <w:r>
-        <w:t xml:space="preserve"> run build</w:t>
+      <w:r>
+        <w:t>npm run build</w:t>
       </w:r>
     </w:p>
     <w:p>
@@ -2696,13 +2527,8 @@
           <w:numId w:val="22"/>
         </w:numPr>
       </w:pPr>
-      <w:proofErr w:type="spellStart"/>
-      <w:r>
-        <w:t>npm</w:t>
-      </w:r>
-      <w:proofErr w:type="spellEnd"/>
-      <w:r>
-        <w:t xml:space="preserve"> run deploy</w:t>
+      <w:r>
+        <w:t>npm run deploy</w:t>
       </w:r>
     </w:p>
     <w:p/>
@@ -2720,15 +2546,7 @@
         <w:t>Git stash temporarily saves your uncommitted changes.</w:t>
       </w:r>
       <w:r>
-        <w:t xml:space="preserve"> </w:t>
-      </w:r>
-      <w:proofErr w:type="gramStart"/>
-      <w:r>
-        <w:t>So</w:t>
-      </w:r>
-      <w:proofErr w:type="gramEnd"/>
-      <w:r>
-        <w:t xml:space="preserve"> you can switch tasks or branches and restore those changes later.</w:t>
+        <w:t xml:space="preserve"> So you can switch tasks or branches and restore those changes later.</w:t>
       </w:r>
     </w:p>
     <w:p>
@@ -2752,21 +2570,11 @@
         <w:tab/>
         <w:t xml:space="preserve">Changes in </w:t>
       </w:r>
-      <w:proofErr w:type="spellStart"/>
       <w:r>
         <w:t>LoginController.php</w:t>
       </w:r>
-      <w:proofErr w:type="spellEnd"/>
-      <w:r>
-        <w:t xml:space="preserve"> and </w:t>
-      </w:r>
-      <w:proofErr w:type="spellStart"/>
-      <w:r>
-        <w:t>User.php</w:t>
-      </w:r>
-      <w:proofErr w:type="spellEnd"/>
-      <w:r>
-        <w:t xml:space="preserve"> files</w:t>
+      <w:r>
+        <w:t xml:space="preserve"> and User.php files</w:t>
       </w:r>
     </w:p>
     <w:p>
@@ -3036,17 +2844,33 @@
           <w:b/>
           <w:bCs/>
         </w:rPr>
-        <w:t xml:space="preserve">git stash </w:t>
-      </w:r>
-      <w:proofErr w:type="gramStart"/>
-      <w:r>
-        <w:rPr>
-          <w:b/>
-          <w:bCs/>
-        </w:rPr>
-        <w:t>apply</w:t>
-      </w:r>
-      <w:proofErr w:type="gramEnd"/>
+        <w:t xml:space="preserve">git stash apply: </w:t>
+      </w:r>
+      <w:r>
+        <w:t>Restore the latest stash.</w:t>
+      </w:r>
+      <w:r>
+        <w:t xml:space="preserve"> And </w:t>
+      </w:r>
+      <w:r>
+        <w:t xml:space="preserve">Stash remains in </w:t>
+      </w:r>
+      <w:r>
+        <w:t xml:space="preserve">the </w:t>
+      </w:r>
+      <w:r>
+        <w:t>stash list</w:t>
+      </w:r>
+      <w:r>
+        <w:t xml:space="preserve">. </w:t>
+      </w:r>
+      <w:r>
+        <w:rPr>
+          <w:b/>
+          <w:bCs/>
+        </w:rPr>
+        <w:t>Apply Specific Stash</w:t>
+      </w:r>
       <w:r>
         <w:rPr>
           <w:b/>
@@ -3055,47 +2879,7 @@
         <w:t xml:space="preserve">: </w:t>
       </w:r>
       <w:r>
-        <w:t>Restore the latest stash.</w:t>
-      </w:r>
-      <w:r>
-        <w:t xml:space="preserve"> And </w:t>
-      </w:r>
-      <w:r>
-        <w:t xml:space="preserve">Stash remains in </w:t>
-      </w:r>
-      <w:r>
-        <w:t xml:space="preserve">the </w:t>
-      </w:r>
-      <w:r>
-        <w:t>stash list</w:t>
-      </w:r>
-      <w:r>
-        <w:t xml:space="preserve">. </w:t>
-      </w:r>
-      <w:r>
-        <w:rPr>
-          <w:b/>
-          <w:bCs/>
-        </w:rPr>
-        <w:t>Apply Specific Stash</w:t>
-      </w:r>
-      <w:r>
-        <w:rPr>
-          <w:b/>
-          <w:bCs/>
-        </w:rPr>
-        <w:t xml:space="preserve">: </w:t>
-      </w:r>
-      <w:r>
-        <w:t>git stash apply stash</w:t>
-      </w:r>
-      <w:proofErr w:type="gramStart"/>
-      <w:r>
-        <w:t>@{</w:t>
-      </w:r>
-      <w:proofErr w:type="gramEnd"/>
-      <w:r>
-        <w:t>1}</w:t>
+        <w:t>git stash apply stash@{1}</w:t>
       </w:r>
     </w:p>
     <w:p>
@@ -3138,23 +2922,7 @@
           <w:b/>
           <w:bCs/>
         </w:rPr>
-        <w:t>git stash drop stash</w:t>
-      </w:r>
-      <w:proofErr w:type="gramStart"/>
-      <w:r>
-        <w:rPr>
-          <w:b/>
-          <w:bCs/>
-        </w:rPr>
-        <w:t>@{</w:t>
-      </w:r>
-      <w:proofErr w:type="gramEnd"/>
-      <w:r>
-        <w:rPr>
-          <w:b/>
-          <w:bCs/>
-        </w:rPr>
-        <w:t xml:space="preserve">1}: </w:t>
+        <w:t xml:space="preserve">git stash drop stash@{1}: </w:t>
       </w:r>
       <w:r>
         <w:t>Delete specific stash.</w:t>
@@ -3600,29 +3368,8 @@
       </w:r>
       <w:r>
         <w:tab/>
-        <w:t>.</w:t>
-      </w:r>
-      <w:proofErr w:type="spellStart"/>
-      <w:r>
-        <w:t>github</w:t>
-      </w:r>
-      <w:proofErr w:type="spellEnd"/>
-      <w:r>
-        <w:t>/</w:t>
-      </w:r>
-      <w:proofErr w:type="spellStart"/>
-      <w:r>
-        <w:t>workFlows</w:t>
-      </w:r>
-      <w:proofErr w:type="spellEnd"/>
-      <w:r>
-        <w:t>/</w:t>
-      </w:r>
-      <w:proofErr w:type="spellStart"/>
-      <w:r>
-        <w:t>files.yml</w:t>
-      </w:r>
-      <w:proofErr w:type="spellEnd"/>
+        <w:t>.github/workFlows/files.yml</w:t>
+      </w:r>
     </w:p>
     <w:p>
       <w:r>
@@ -3779,13 +3526,8 @@
     </w:p>
     <w:p>
       <w:r>
-        <w:t xml:space="preserve">    branches: [ </w:t>
-      </w:r>
-      <w:proofErr w:type="gramStart"/>
-      <w:r>
-        <w:t>main ]</w:t>
-      </w:r>
-      <w:proofErr w:type="gramEnd"/>
+        <w:t xml:space="preserve">    branches: [ main ]</w:t>
+      </w:r>
     </w:p>
     <w:p/>
     <w:p>
@@ -3822,13 +3564,8 @@
     </w:p>
     <w:p>
       <w:r>
-        <w:t xml:space="preserve">    - name: </w:t>
-      </w:r>
-      <w:proofErr w:type="spellStart"/>
-      <w:r>
-        <w:t>Greatings</w:t>
-      </w:r>
-      <w:proofErr w:type="spellEnd"/>
+        <w:t xml:space="preserve">    - name: Greatings</w:t>
+      </w:r>
     </w:p>
     <w:p>
       <w:r>
@@ -3876,6 +3613,90 @@
         <w:t>└────────── Minute (0-59)</w:t>
       </w:r>
     </w:p>
+    <w:p/>
+    <w:p>
+      <w:pPr>
+        <w:pStyle w:val="Heading1"/>
+      </w:pPr>
+      <w:r>
+        <w:t>Artifact vs Cache in GitHub Action</w:t>
+      </w:r>
+    </w:p>
+    <w:p/>
+    <w:p/>
+    <w:p>
+      <w:pPr>
+        <w:pStyle w:val="Heading1"/>
+      </w:pPr>
+      <w:r>
+        <w:lastRenderedPageBreak/>
+        <w:t>Git SSH Key</w:t>
+      </w:r>
+    </w:p>
+    <w:p>
+      <w:r>
+        <w:tab/>
+        <w:t xml:space="preserve">A </w:t>
+      </w:r>
+      <w:r>
+        <w:rPr>
+          <w:b/>
+          <w:bCs/>
+        </w:rPr>
+        <w:t>secure shell key</w:t>
+      </w:r>
+      <w:r>
+        <w:t xml:space="preserve"> is a secure way to authenticate your computer with GitHub without entering your username and password every time</w:t>
+      </w:r>
+      <w:r>
+        <w:t>.</w:t>
+      </w:r>
+    </w:p>
+    <w:p/>
+    <w:p>
+      <w:r>
+        <w:t>SSH uses two keys:</w:t>
+      </w:r>
+    </w:p>
+    <w:p>
+      <w:r>
+        <w:t>1. Private Key (Keep it secret)</w:t>
+      </w:r>
+    </w:p>
+    <w:p>
+      <w:r>
+        <w:t>2. Public Key (Share with GitHub)</w:t>
+      </w:r>
+    </w:p>
+    <w:p/>
+    <w:p>
+      <w:r>
+        <w:t>Check SSH key has already been generated or not:</w:t>
+      </w:r>
+    </w:p>
+    <w:p>
+      <w:r>
+        <w:tab/>
+        <w:t>ls -al ~/.ssh</w:t>
+      </w:r>
+    </w:p>
+    <w:p>
+      <w:r>
+        <w:t>Generate SSH Key</w:t>
+      </w:r>
+    </w:p>
+    <w:p>
+      <w:r>
+        <w:tab/>
+        <w:t>ssh-keygen -t ed25519 -C “sanjaybeniwal99925@gmail.com”</w:t>
+      </w:r>
+    </w:p>
+    <w:p>
+      <w:r>
+        <w:t xml:space="preserve"> </w:t>
+      </w:r>
+    </w:p>
+    <w:p/>
     <w:p>
       <w:pPr>
         <w:ind w:left="720" w:firstLine="720"/>

</xml_diff>

<commit_message>
GitLab Runner & Linux command
</commit_message>
<xml_diff>
--- a/Git_Github.docx
+++ b/Git_Github.docx
@@ -744,7 +744,7 @@
           <w:lang w:val="en-US"/>
         </w:rPr>
         <w:drawing>
-          <wp:inline distT="0" distB="0" distL="0" distR="0" wp14:anchorId="1D65E668" wp14:editId="4B7966D6">
+          <wp:inline distT="0" distB="0" distL="0" distR="0" wp14:anchorId="1D65E668" wp14:editId="19CA1E8B">
             <wp:extent cx="5731510" cy="3136265"/>
             <wp:effectExtent l="0" t="0" r="2540" b="6985"/>
             <wp:docPr id="1615480579" name="Picture 1"/>
@@ -1670,7 +1670,13 @@
         <w:ind w:left="720"/>
       </w:pPr>
       <w:r>
-        <w:t>git reset –soft HEAD~1</w:t>
+        <w:t xml:space="preserve">git reset </w:t>
+      </w:r>
+      <w:r>
+        <w:t>--</w:t>
+      </w:r>
+      <w:r>
+        <w:t>soft HEAD~1</w:t>
       </w:r>
     </w:p>
     <w:p>
@@ -1762,7 +1768,13 @@
         <w:ind w:left="1440"/>
       </w:pPr>
       <w:r>
-        <w:t>git reset –mixed HEAD~1 or git reset HEAD~1</w:t>
+        <w:t>git reset</w:t>
+      </w:r>
+      <w:r>
+        <w:t xml:space="preserve"> --</w:t>
+      </w:r>
+      <w:r>
+        <w:t>mixed HEAD~1 or git reset HEAD~1</w:t>
       </w:r>
     </w:p>
     <w:p>
@@ -1782,7 +1794,21 @@
           <w:b/>
           <w:bCs/>
         </w:rPr>
-        <w:t>git reset –hard</w:t>
+        <w:t xml:space="preserve">git reset </w:t>
+      </w:r>
+      <w:r>
+        <w:rPr>
+          <w:b/>
+          <w:bCs/>
+        </w:rPr>
+        <w:t>--</w:t>
+      </w:r>
+      <w:r>
+        <w:rPr>
+          <w:b/>
+          <w:bCs/>
+        </w:rPr>
+        <w:t>hard</w:t>
       </w:r>
     </w:p>
     <w:p>
@@ -1823,7 +1849,13 @@
         <w:ind w:left="720" w:firstLine="720"/>
       </w:pPr>
       <w:r>
-        <w:t>git reset –hard HEAD~1</w:t>
+        <w:t xml:space="preserve">git reset </w:t>
+      </w:r>
+      <w:r>
+        <w:t>--</w:t>
+      </w:r>
+      <w:r>
+        <w:t>hard HEAD~1</w:t>
       </w:r>
     </w:p>
     <w:p>
@@ -2033,11 +2065,23 @@
     </w:p>
     <w:p>
       <w:r>
-        <w:t>git commit –amend</w:t>
+        <w:t xml:space="preserve">git commit </w:t>
+      </w:r>
+      <w:r>
+        <w:t>--</w:t>
+      </w:r>
+      <w:r>
+        <w:t>amend</w:t>
       </w:r>
       <w:r>
         <w:br/>
-        <w:t>or git commit –amend -m ‘Message…’</w:t>
+        <w:t xml:space="preserve">or git commit </w:t>
+      </w:r>
+      <w:r>
+        <w:t>--</w:t>
+      </w:r>
+      <w:r>
+        <w:t>amend -m ‘Message…’</w:t>
       </w:r>
     </w:p>
     <w:p>
@@ -2050,7 +2094,19 @@
     </w:p>
     <w:p>
       <w:r>
-        <w:t>git commit –amend –no-edit</w:t>
+        <w:t xml:space="preserve">git commit </w:t>
+      </w:r>
+      <w:r>
+        <w:t>--</w:t>
+      </w:r>
+      <w:r>
+        <w:t xml:space="preserve">amend </w:t>
+      </w:r>
+      <w:r>
+        <w:t>--</w:t>
+      </w:r>
+      <w:r>
+        <w:t>no-edit</w:t>
       </w:r>
     </w:p>
     <w:p/>
@@ -3622,6 +3678,273 @@
         <w:t>Artifact vs Cache in GitHub Action</w:t>
       </w:r>
     </w:p>
+    <w:p>
+      <w:r>
+        <w:tab/>
+        <w:t>Both artifacts and cache store the files</w:t>
+      </w:r>
+    </w:p>
+    <w:p>
+      <w:r>
+        <w:rPr>
+          <w:b/>
+          <w:bCs/>
+        </w:rPr>
+        <w:t>Artifact</w:t>
+      </w:r>
+      <w:r>
+        <w:rPr>
+          <w:b/>
+          <w:bCs/>
+        </w:rPr>
+        <w:t>s</w:t>
+      </w:r>
+      <w:r>
+        <w:t xml:space="preserve">: </w:t>
+      </w:r>
+      <w:r>
+        <w:t>Artifacts are files that are stored and saved during a GitHub Actions workflow so they can be downloaded or used later</w:t>
+      </w:r>
+      <w:r>
+        <w:t xml:space="preserve"> or </w:t>
+      </w:r>
+      <w:r>
+        <w:t>used by other jobs</w:t>
+      </w:r>
+      <w:r>
+        <w:t>.</w:t>
+      </w:r>
+      <w:r>
+        <w:t xml:space="preserve"> </w:t>
+      </w:r>
+    </w:p>
+    <w:p/>
+    <w:p>
+      <w:r>
+        <w:lastRenderedPageBreak/>
+        <w:t>Examples:</w:t>
+      </w:r>
+    </w:p>
+    <w:p>
+      <w:pPr>
+        <w:numPr>
+          <w:ilvl w:val="0"/>
+          <w:numId w:val="27"/>
+        </w:numPr>
+        <w:spacing w:line="240" w:lineRule="auto"/>
+      </w:pPr>
+      <w:r>
+        <w:t xml:space="preserve">React build folder (dist) </w:t>
+      </w:r>
+    </w:p>
+    <w:p>
+      <w:pPr>
+        <w:numPr>
+          <w:ilvl w:val="0"/>
+          <w:numId w:val="27"/>
+        </w:numPr>
+        <w:spacing w:line="240" w:lineRule="auto"/>
+      </w:pPr>
+      <w:r>
+        <w:t xml:space="preserve">Test reports </w:t>
+      </w:r>
+    </w:p>
+    <w:p>
+      <w:pPr>
+        <w:numPr>
+          <w:ilvl w:val="0"/>
+          <w:numId w:val="27"/>
+        </w:numPr>
+        <w:spacing w:line="240" w:lineRule="auto"/>
+      </w:pPr>
+      <w:r>
+        <w:t xml:space="preserve">Log files </w:t>
+      </w:r>
+    </w:p>
+    <w:p>
+      <w:pPr>
+        <w:numPr>
+          <w:ilvl w:val="0"/>
+          <w:numId w:val="27"/>
+        </w:numPr>
+        <w:spacing w:line="240" w:lineRule="auto"/>
+      </w:pPr>
+      <w:r>
+        <w:t>Coverage rep</w:t>
+      </w:r>
+    </w:p>
+    <w:p>
+      <w:pPr>
+        <w:spacing w:line="240" w:lineRule="auto"/>
+      </w:pPr>
+    </w:p>
+    <w:p>
+      <w:pPr>
+        <w:spacing w:line="240" w:lineRule="auto"/>
+      </w:pPr>
+      <w:r>
+        <w:rPr>
+          <w:b/>
+          <w:bCs/>
+        </w:rPr>
+        <w:t>Cache</w:t>
+      </w:r>
+      <w:r>
+        <w:t>: A cache stores dependencies to make future workflow runs faster.</w:t>
+      </w:r>
+    </w:p>
+    <w:p>
+      <w:pPr>
+        <w:spacing w:line="240" w:lineRule="auto"/>
+        <w:rPr>
+          <w:b/>
+          <w:bCs/>
+        </w:rPr>
+      </w:pPr>
+      <w:r>
+        <w:rPr>
+          <w:b/>
+          <w:bCs/>
+        </w:rPr>
+        <w:t>Problem Without Cache</w:t>
+      </w:r>
+    </w:p>
+    <w:p>
+      <w:pPr>
+        <w:spacing w:line="240" w:lineRule="auto"/>
+      </w:pPr>
+      <w:r>
+        <w:t>Every workflow run:</w:t>
+      </w:r>
+    </w:p>
+    <w:p>
+      <w:pPr>
+        <w:spacing w:line="240" w:lineRule="auto"/>
+        <w:ind w:firstLine="720"/>
+      </w:pPr>
+      <w:r>
+        <w:t>npm install</w:t>
+      </w:r>
+    </w:p>
+    <w:p>
+      <w:pPr>
+        <w:spacing w:line="240" w:lineRule="auto"/>
+      </w:pPr>
+      <w:r>
+        <w:t>downloads:</w:t>
+      </w:r>
+    </w:p>
+    <w:p>
+      <w:pPr>
+        <w:spacing w:line="240" w:lineRule="auto"/>
+        <w:ind w:left="720"/>
+      </w:pPr>
+      <w:r>
+        <w:t>react</w:t>
+      </w:r>
+      <w:r>
+        <w:br/>
+        <w:t>vite</w:t>
+      </w:r>
+      <w:r>
+        <w:br/>
+        <w:t>axios</w:t>
+      </w:r>
+      <w:r>
+        <w:br/>
+        <w:t>redux</w:t>
+      </w:r>
+      <w:r>
+        <w:br/>
+        <w:t>...</w:t>
+      </w:r>
+    </w:p>
+    <w:p>
+      <w:pPr>
+        <w:spacing w:line="240" w:lineRule="auto"/>
+      </w:pPr>
+      <w:r>
+        <w:t>again and again.</w:t>
+      </w:r>
+    </w:p>
+    <w:p>
+      <w:pPr>
+        <w:spacing w:line="240" w:lineRule="auto"/>
+      </w:pPr>
+    </w:p>
+    <w:p>
+      <w:pPr>
+        <w:spacing w:line="240" w:lineRule="auto"/>
+      </w:pPr>
+    </w:p>
+    <w:p/>
+    <w:p>
+      <w:pPr>
+        <w:pStyle w:val="Heading1"/>
+      </w:pPr>
+      <w:r>
+        <w:t>Git SSH Key</w:t>
+      </w:r>
+    </w:p>
+    <w:p>
+      <w:r>
+        <w:tab/>
+        <w:t xml:space="preserve">A </w:t>
+      </w:r>
+      <w:r>
+        <w:rPr>
+          <w:b/>
+          <w:bCs/>
+        </w:rPr>
+        <w:t>secure shell key</w:t>
+      </w:r>
+      <w:r>
+        <w:t xml:space="preserve"> is a secure way to authenticate your computer with GitHub without entering your username and password every time</w:t>
+      </w:r>
+      <w:r>
+        <w:t>.</w:t>
+      </w:r>
+    </w:p>
+    <w:p/>
+    <w:p>
+      <w:r>
+        <w:lastRenderedPageBreak/>
+        <w:t>SSH uses two keys:</w:t>
+      </w:r>
+    </w:p>
+    <w:p>
+      <w:r>
+        <w:t>1. Private Key (Keep it secret)</w:t>
+      </w:r>
+    </w:p>
+    <w:p>
+      <w:r>
+        <w:t>2. Public Key (Share with GitHub)</w:t>
+      </w:r>
+    </w:p>
+    <w:p/>
+    <w:p>
+      <w:r>
+        <w:t>Check SSH key has already been generated or not:</w:t>
+      </w:r>
+    </w:p>
+    <w:p>
+      <w:r>
+        <w:tab/>
+        <w:t>ls -al ~/.ssh</w:t>
+      </w:r>
+    </w:p>
+    <w:p>
+      <w:r>
+        <w:t>Generate SSH Key</w:t>
+      </w:r>
+    </w:p>
+    <w:p>
+      <w:r>
+        <w:tab/>
+        <w:t>ssh-keygen -t ed25519 -C “sanjaybeniwal99925@gmail.com”</w:t>
+      </w:r>
+    </w:p>
     <w:p/>
     <w:p/>
     <w:p>
@@ -3629,78 +3952,565 @@
         <w:pStyle w:val="Heading1"/>
       </w:pPr>
       <w:r>
+        <w:t>GitLab Runner</w:t>
+      </w:r>
+    </w:p>
+    <w:p>
+      <w:r>
+        <w:tab/>
+        <w:t>A GitLab Runner executes the job that is defined in .gitlab-ci.yml file. Or execute the CI/CD pipeline.</w:t>
+      </w:r>
+    </w:p>
+    <w:p>
+      <w:pPr>
+        <w:spacing w:line="240" w:lineRule="auto"/>
+      </w:pPr>
+      <w:r>
+        <w:t>Developer Pushes Code</w:t>
+      </w:r>
+    </w:p>
+    <w:p>
+      <w:pPr>
+        <w:spacing w:line="240" w:lineRule="auto"/>
+      </w:pPr>
+      <w:r>
+        <w:t xml:space="preserve">        │</w:t>
+      </w:r>
+    </w:p>
+    <w:p>
+      <w:pPr>
+        <w:spacing w:line="240" w:lineRule="auto"/>
+      </w:pPr>
+      <w:r>
+        <w:t xml:space="preserve">        </w:t>
+      </w:r>
+      <w:r>
+        <w:rPr>
+          <w:rFonts w:ascii="Arial" w:hAnsi="Arial" w:cs="Arial"/>
+        </w:rPr>
+        <w:t>▼</w:t>
+      </w:r>
+    </w:p>
+    <w:p>
+      <w:pPr>
+        <w:spacing w:line="240" w:lineRule="auto"/>
+      </w:pPr>
+      <w:r>
+        <w:t>GitLab</w:t>
+      </w:r>
+    </w:p>
+    <w:p>
+      <w:pPr>
+        <w:spacing w:line="240" w:lineRule="auto"/>
+      </w:pPr>
+      <w:r>
+        <w:t xml:space="preserve">        │</w:t>
+      </w:r>
+    </w:p>
+    <w:p>
+      <w:pPr>
+        <w:spacing w:line="240" w:lineRule="auto"/>
+      </w:pPr>
+      <w:r>
+        <w:t xml:space="preserve">        </w:t>
+      </w:r>
+      <w:r>
+        <w:rPr>
+          <w:rFonts w:ascii="Arial" w:hAnsi="Arial" w:cs="Arial"/>
+        </w:rPr>
+        <w:t>▼</w:t>
+      </w:r>
+    </w:p>
+    <w:p>
+      <w:pPr>
+        <w:spacing w:line="240" w:lineRule="auto"/>
+      </w:pPr>
+      <w:r>
+        <w:t>GitLab Runner</w:t>
+      </w:r>
+    </w:p>
+    <w:p>
+      <w:pPr>
+        <w:spacing w:line="240" w:lineRule="auto"/>
+      </w:pPr>
+      <w:r>
+        <w:t xml:space="preserve">        │</w:t>
+      </w:r>
+    </w:p>
+    <w:p>
+      <w:pPr>
+        <w:spacing w:line="240" w:lineRule="auto"/>
+      </w:pPr>
+      <w:r>
+        <w:t xml:space="preserve">        </w:t>
+      </w:r>
+      <w:r>
+        <w:rPr>
+          <w:rFonts w:ascii="MS Gothic" w:eastAsia="MS Gothic" w:hAnsi="MS Gothic" w:cs="MS Gothic" w:hint="eastAsia"/>
+        </w:rPr>
+        <w:t>├</w:t>
+      </w:r>
+      <w:r>
+        <w:rPr>
+          <w:rFonts w:ascii="Aptos" w:hAnsi="Aptos" w:cs="Aptos"/>
+        </w:rPr>
+        <w:t>──</w:t>
+      </w:r>
+      <w:r>
+        <w:t xml:space="preserve"> Install Dependencies</w:t>
+      </w:r>
+    </w:p>
+    <w:p>
+      <w:pPr>
+        <w:spacing w:line="240" w:lineRule="auto"/>
+      </w:pPr>
+      <w:r>
+        <w:t xml:space="preserve">        </w:t>
+      </w:r>
+      <w:r>
+        <w:rPr>
+          <w:rFonts w:ascii="MS Gothic" w:eastAsia="MS Gothic" w:hAnsi="MS Gothic" w:cs="MS Gothic" w:hint="eastAsia"/>
+        </w:rPr>
+        <w:t>├</w:t>
+      </w:r>
+      <w:r>
+        <w:rPr>
+          <w:rFonts w:ascii="Aptos" w:hAnsi="Aptos" w:cs="Aptos"/>
+        </w:rPr>
+        <w:t>──</w:t>
+      </w:r>
+      <w:r>
+        <w:t xml:space="preserve"> Run Tests</w:t>
+      </w:r>
+    </w:p>
+    <w:p>
+      <w:pPr>
+        <w:spacing w:line="240" w:lineRule="auto"/>
+      </w:pPr>
+      <w:r>
         <w:lastRenderedPageBreak/>
-        <w:t>Git SSH Key</w:t>
-      </w:r>
-    </w:p>
-    <w:p>
-      <w:r>
-        <w:tab/>
-        <w:t xml:space="preserve">A </w:t>
-      </w:r>
-      <w:r>
-        <w:rPr>
-          <w:b/>
-          <w:bCs/>
-        </w:rPr>
-        <w:t>secure shell key</w:t>
-      </w:r>
-      <w:r>
-        <w:t xml:space="preserve"> is a secure way to authenticate your computer with GitHub without entering your username and password every time</w:t>
-      </w:r>
-      <w:r>
-        <w:t>.</w:t>
+        <w:t xml:space="preserve">        </w:t>
+      </w:r>
+      <w:r>
+        <w:rPr>
+          <w:rFonts w:ascii="MS Gothic" w:eastAsia="MS Gothic" w:hAnsi="MS Gothic" w:cs="MS Gothic" w:hint="eastAsia"/>
+        </w:rPr>
+        <w:t>├</w:t>
+      </w:r>
+      <w:r>
+        <w:rPr>
+          <w:rFonts w:ascii="Aptos" w:hAnsi="Aptos" w:cs="Aptos"/>
+        </w:rPr>
+        <w:t>──</w:t>
+      </w:r>
+      <w:r>
+        <w:t xml:space="preserve"> Build Application</w:t>
+      </w:r>
+    </w:p>
+    <w:p>
+      <w:pPr>
+        <w:spacing w:line="240" w:lineRule="auto"/>
+      </w:pPr>
+      <w:r>
+        <w:t xml:space="preserve">        └── Deploy</w:t>
+      </w:r>
+    </w:p>
+    <w:p>
+      <w:pPr>
+        <w:spacing w:line="240" w:lineRule="auto"/>
+      </w:pPr>
+    </w:p>
+    <w:p>
+      <w:pPr>
+        <w:spacing w:line="240" w:lineRule="auto"/>
+        <w:rPr>
+          <w:b/>
+          <w:bCs/>
+        </w:rPr>
+      </w:pPr>
+      <w:r>
+        <w:rPr>
+          <w:b/>
+          <w:bCs/>
+        </w:rPr>
+        <w:t>Real-Life Analogy</w:t>
+      </w:r>
+    </w:p>
+    <w:p>
+      <w:pPr>
+        <w:spacing w:line="240" w:lineRule="auto"/>
+      </w:pPr>
+      <w:r>
+        <w:t>Imagine a restaurant.</w:t>
+      </w:r>
+    </w:p>
+    <w:p>
+      <w:pPr>
+        <w:numPr>
+          <w:ilvl w:val="0"/>
+          <w:numId w:val="28"/>
+        </w:numPr>
+        <w:spacing w:line="240" w:lineRule="auto"/>
+      </w:pPr>
+      <w:r>
+        <w:rPr>
+          <w:b/>
+          <w:bCs/>
+        </w:rPr>
+        <w:t>Customer</w:t>
+      </w:r>
+      <w:r>
+        <w:t xml:space="preserve"> → Developer </w:t>
+      </w:r>
+    </w:p>
+    <w:p>
+      <w:pPr>
+        <w:numPr>
+          <w:ilvl w:val="0"/>
+          <w:numId w:val="28"/>
+        </w:numPr>
+        <w:spacing w:line="240" w:lineRule="auto"/>
+      </w:pPr>
+      <w:r>
+        <w:rPr>
+          <w:b/>
+          <w:bCs/>
+        </w:rPr>
+        <w:t>Order</w:t>
+      </w:r>
+      <w:r>
+        <w:t xml:space="preserve"> → Git push </w:t>
+      </w:r>
+    </w:p>
+    <w:p>
+      <w:pPr>
+        <w:numPr>
+          <w:ilvl w:val="0"/>
+          <w:numId w:val="28"/>
+        </w:numPr>
+        <w:spacing w:line="240" w:lineRule="auto"/>
+      </w:pPr>
+      <w:r>
+        <w:rPr>
+          <w:b/>
+          <w:bCs/>
+        </w:rPr>
+        <w:t>Kitchen</w:t>
+      </w:r>
+      <w:r>
+        <w:t xml:space="preserve"> → GitLab Runner </w:t>
+      </w:r>
+    </w:p>
+    <w:p>
+      <w:pPr>
+        <w:numPr>
+          <w:ilvl w:val="0"/>
+          <w:numId w:val="28"/>
+        </w:numPr>
+        <w:spacing w:line="240" w:lineRule="auto"/>
+      </w:pPr>
+      <w:r>
+        <w:rPr>
+          <w:b/>
+          <w:bCs/>
+        </w:rPr>
+        <w:t>Food</w:t>
+      </w:r>
+      <w:r>
+        <w:t xml:space="preserve"> → Build/Deploy</w:t>
+      </w:r>
+    </w:p>
+    <w:p>
+      <w:pPr>
+        <w:pStyle w:val="Heading1"/>
+      </w:pPr>
+      <w:r>
+        <w:t>GitLab CI/CD Workflow</w:t>
+      </w:r>
+    </w:p>
+    <w:p>
+      <w:r>
+        <w:t>Developer</w:t>
+      </w:r>
+    </w:p>
+    <w:p>
+      <w:r>
+        <w:t xml:space="preserve">    │</w:t>
+      </w:r>
+    </w:p>
+    <w:p>
+      <w:r>
+        <w:t>git push</w:t>
+      </w:r>
+    </w:p>
+    <w:p>
+      <w:r>
+        <w:t xml:space="preserve">    │</w:t>
+      </w:r>
+    </w:p>
+    <w:p>
+      <w:r>
+        <w:t>GitLab Repository</w:t>
+      </w:r>
+    </w:p>
+    <w:p>
+      <w:r>
+        <w:t xml:space="preserve">    │</w:t>
+      </w:r>
+    </w:p>
+    <w:p>
+      <w:r>
+        <w:t>Reads .gitlab-ci.yml</w:t>
+      </w:r>
+    </w:p>
+    <w:p>
+      <w:r>
+        <w:t xml:space="preserve">    │</w:t>
+      </w:r>
+    </w:p>
+    <w:p>
+      <w:r>
+        <w:t>GitLab Runner</w:t>
+      </w:r>
+    </w:p>
+    <w:p>
+      <w:r>
+        <w:t xml:space="preserve">    │</w:t>
+      </w:r>
+    </w:p>
+    <w:p>
+      <w:r>
+        <w:t>Executes Jobs</w:t>
+      </w:r>
+    </w:p>
+    <w:p>
+      <w:r>
+        <w:t xml:space="preserve">    │</w:t>
+      </w:r>
+    </w:p>
+    <w:p>
+      <w:r>
+        <w:t>Pipeline Success</w:t>
+      </w:r>
+    </w:p>
+    <w:p>
+      <w:pPr>
+        <w:pStyle w:val="Heading1"/>
+      </w:pPr>
+      <w:r>
+        <w:lastRenderedPageBreak/>
+        <w:t>Types of GitLab Runner</w:t>
+      </w:r>
+    </w:p>
+    <w:p>
+      <w:pPr>
+        <w:pStyle w:val="ListParagraph"/>
+        <w:numPr>
+          <w:ilvl w:val="0"/>
+          <w:numId w:val="29"/>
+        </w:numPr>
+      </w:pPr>
+      <w:r>
+        <w:t>Shared Runner</w:t>
+      </w:r>
+    </w:p>
+    <w:p>
+      <w:pPr>
+        <w:pStyle w:val="ListParagraph"/>
+        <w:numPr>
+          <w:ilvl w:val="0"/>
+          <w:numId w:val="29"/>
+        </w:numPr>
+      </w:pPr>
+      <w:r>
+        <w:t>Specific Runner</w:t>
+      </w:r>
+    </w:p>
+    <w:p>
+      <w:pPr>
+        <w:pStyle w:val="ListParagraph"/>
+        <w:numPr>
+          <w:ilvl w:val="0"/>
+          <w:numId w:val="29"/>
+        </w:numPr>
+      </w:pPr>
+      <w:r>
+        <w:t>Group Runner</w:t>
+      </w:r>
+    </w:p>
+    <w:p>
+      <w:pPr>
+        <w:rPr>
+          <w:b/>
+          <w:bCs/>
+        </w:rPr>
+      </w:pPr>
+      <w:r>
+        <w:rPr>
+          <w:b/>
+          <w:bCs/>
+        </w:rPr>
+        <w:t xml:space="preserve">Shared Runner: </w:t>
+      </w:r>
+    </w:p>
+    <w:p>
+      <w:pPr>
+        <w:pStyle w:val="ListParagraph"/>
+        <w:numPr>
+          <w:ilvl w:val="0"/>
+          <w:numId w:val="30"/>
+        </w:numPr>
+      </w:pPr>
+      <w:r>
+        <w:t>Managed by GitLab</w:t>
+      </w:r>
+    </w:p>
+    <w:p>
+      <w:pPr>
+        <w:pStyle w:val="ListParagraph"/>
+        <w:numPr>
+          <w:ilvl w:val="0"/>
+          <w:numId w:val="30"/>
+        </w:numPr>
+      </w:pPr>
+      <w:r>
+        <w:t>Easy to use</w:t>
+      </w:r>
+    </w:p>
+    <w:p>
+      <w:pPr>
+        <w:pStyle w:val="ListParagraph"/>
+        <w:numPr>
+          <w:ilvl w:val="0"/>
+          <w:numId w:val="30"/>
+        </w:numPr>
+      </w:pPr>
+      <w:r>
+        <w:t>No installation required</w:t>
+      </w:r>
+    </w:p>
+    <w:p>
+      <w:pPr>
+        <w:pStyle w:val="ListParagraph"/>
+        <w:numPr>
+          <w:ilvl w:val="0"/>
+          <w:numId w:val="30"/>
+        </w:numPr>
+      </w:pPr>
+      <w:r>
+        <w:t>Shared with other users</w:t>
+      </w:r>
+    </w:p>
+    <w:p>
+      <w:pPr>
+        <w:pStyle w:val="ListParagraph"/>
+        <w:numPr>
+          <w:ilvl w:val="0"/>
+          <w:numId w:val="30"/>
+        </w:numPr>
+      </w:pPr>
+      <w:r>
+        <w:t>Best for small projects, open-source repositories, and learning</w:t>
+      </w:r>
+    </w:p>
+    <w:p>
+      <w:r>
+        <w:t xml:space="preserve"> </w:t>
+      </w:r>
+    </w:p>
+    <w:p>
+      <w:pPr>
+        <w:rPr>
+          <w:b/>
+          <w:bCs/>
+        </w:rPr>
+      </w:pPr>
+      <w:r>
+        <w:rPr>
+          <w:b/>
+          <w:bCs/>
+        </w:rPr>
+        <w:t>Special Runner</w:t>
+      </w:r>
+      <w:r>
+        <w:rPr>
+          <w:b/>
+          <w:bCs/>
+        </w:rPr>
+        <w:t>:</w:t>
+      </w:r>
+    </w:p>
+    <w:p>
+      <w:pPr>
+        <w:pStyle w:val="ListParagraph"/>
+        <w:numPr>
+          <w:ilvl w:val="0"/>
+          <w:numId w:val="31"/>
+        </w:numPr>
+      </w:pPr>
+      <w:r>
+        <w:t>Only for your project</w:t>
+      </w:r>
+    </w:p>
+    <w:p>
+      <w:pPr>
+        <w:pStyle w:val="ListParagraph"/>
+        <w:numPr>
+          <w:ilvl w:val="0"/>
+          <w:numId w:val="31"/>
+        </w:numPr>
+      </w:pPr>
+      <w:r>
+        <w:t>Faster</w:t>
+      </w:r>
+    </w:p>
+    <w:p>
+      <w:pPr>
+        <w:pStyle w:val="ListParagraph"/>
+        <w:numPr>
+          <w:ilvl w:val="0"/>
+          <w:numId w:val="31"/>
+        </w:numPr>
+      </w:pPr>
+      <w:r>
+        <w:t>More secure</w:t>
+      </w:r>
+    </w:p>
+    <w:p>
+      <w:pPr>
+        <w:pStyle w:val="ListParagraph"/>
+        <w:numPr>
+          <w:ilvl w:val="0"/>
+          <w:numId w:val="31"/>
+        </w:numPr>
+      </w:pPr>
+      <w:r>
+        <w:t>Best for company projects and private repositories</w:t>
       </w:r>
     </w:p>
     <w:p/>
     <w:p>
-      <w:r>
-        <w:t>SSH uses two keys:</w:t>
-      </w:r>
-    </w:p>
-    <w:p>
-      <w:r>
-        <w:t>1. Private Key (Keep it secret)</w:t>
-      </w:r>
-    </w:p>
-    <w:p>
-      <w:r>
-        <w:t>2. Public Key (Share with GitHub)</w:t>
-      </w:r>
-    </w:p>
-    <w:p/>
-    <w:p>
-      <w:r>
-        <w:t>Check SSH key has already been generated or not:</w:t>
-      </w:r>
-    </w:p>
-    <w:p>
-      <w:r>
-        <w:tab/>
-        <w:t>ls -al ~/.ssh</w:t>
-      </w:r>
-    </w:p>
-    <w:p>
-      <w:r>
-        <w:t>Generate SSH Key</w:t>
-      </w:r>
-    </w:p>
-    <w:p>
-      <w:r>
-        <w:tab/>
-        <w:t>ssh-keygen -t ed25519 -C “sanjaybeniwal99925@gmail.com”</w:t>
-      </w:r>
-    </w:p>
-    <w:p>
-      <w:r>
-        <w:t xml:space="preserve"> </w:t>
-      </w:r>
-    </w:p>
-    <w:p/>
+      <w:pPr>
+        <w:rPr>
+          <w:b/>
+          <w:bCs/>
+        </w:rPr>
+      </w:pPr>
+      <w:r>
+        <w:rPr>
+          <w:b/>
+          <w:bCs/>
+        </w:rPr>
+        <w:t>Group Runner:</w:t>
+      </w:r>
+    </w:p>
     <w:p>
       <w:pPr>
         <w:ind w:left="720" w:firstLine="720"/>
       </w:pPr>
+      <w:r>
+        <w:t>This runner for all group projects</w:t>
+      </w:r>
     </w:p>
     <w:p>
       <w:pPr>
@@ -4197,6 +5007,92 @@
     </w:lvl>
   </w:abstractNum>
   <w:abstractNum w:abstractNumId="4" w15:restartNumberingAfterBreak="0">
+    <w:nsid w:val="15CC7169"/>
+    <w:multiLevelType w:val="hybridMultilevel"/>
+    <w:tmpl w:val="439647A2"/>
+    <w:lvl w:ilvl="0" w:tplc="4009000F">
+      <w:start w:val="1"/>
+      <w:numFmt w:val="decimal"/>
+      <w:lvlText w:val="%1."/>
+      <w:lvlJc w:val="left"/>
+      <w:pPr>
+        <w:ind w:left="720" w:hanging="360"/>
+      </w:pPr>
+    </w:lvl>
+    <w:lvl w:ilvl="1" w:tplc="40090019" w:tentative="1">
+      <w:start w:val="1"/>
+      <w:numFmt w:val="lowerLetter"/>
+      <w:lvlText w:val="%2."/>
+      <w:lvlJc w:val="left"/>
+      <w:pPr>
+        <w:ind w:left="1440" w:hanging="360"/>
+      </w:pPr>
+    </w:lvl>
+    <w:lvl w:ilvl="2" w:tplc="4009001B" w:tentative="1">
+      <w:start w:val="1"/>
+      <w:numFmt w:val="lowerRoman"/>
+      <w:lvlText w:val="%3."/>
+      <w:lvlJc w:val="right"/>
+      <w:pPr>
+        <w:ind w:left="2160" w:hanging="180"/>
+      </w:pPr>
+    </w:lvl>
+    <w:lvl w:ilvl="3" w:tplc="4009000F" w:tentative="1">
+      <w:start w:val="1"/>
+      <w:numFmt w:val="decimal"/>
+      <w:lvlText w:val="%4."/>
+      <w:lvlJc w:val="left"/>
+      <w:pPr>
+        <w:ind w:left="2880" w:hanging="360"/>
+      </w:pPr>
+    </w:lvl>
+    <w:lvl w:ilvl="4" w:tplc="40090019" w:tentative="1">
+      <w:start w:val="1"/>
+      <w:numFmt w:val="lowerLetter"/>
+      <w:lvlText w:val="%5."/>
+      <w:lvlJc w:val="left"/>
+      <w:pPr>
+        <w:ind w:left="3600" w:hanging="360"/>
+      </w:pPr>
+    </w:lvl>
+    <w:lvl w:ilvl="5" w:tplc="4009001B" w:tentative="1">
+      <w:start w:val="1"/>
+      <w:numFmt w:val="lowerRoman"/>
+      <w:lvlText w:val="%6."/>
+      <w:lvlJc w:val="right"/>
+      <w:pPr>
+        <w:ind w:left="4320" w:hanging="180"/>
+      </w:pPr>
+    </w:lvl>
+    <w:lvl w:ilvl="6" w:tplc="4009000F" w:tentative="1">
+      <w:start w:val="1"/>
+      <w:numFmt w:val="decimal"/>
+      <w:lvlText w:val="%7."/>
+      <w:lvlJc w:val="left"/>
+      <w:pPr>
+        <w:ind w:left="5040" w:hanging="360"/>
+      </w:pPr>
+    </w:lvl>
+    <w:lvl w:ilvl="7" w:tplc="40090019" w:tentative="1">
+      <w:start w:val="1"/>
+      <w:numFmt w:val="lowerLetter"/>
+      <w:lvlText w:val="%8."/>
+      <w:lvlJc w:val="left"/>
+      <w:pPr>
+        <w:ind w:left="5760" w:hanging="360"/>
+      </w:pPr>
+    </w:lvl>
+    <w:lvl w:ilvl="8" w:tplc="4009001B" w:tentative="1">
+      <w:start w:val="1"/>
+      <w:numFmt w:val="lowerRoman"/>
+      <w:lvlText w:val="%9."/>
+      <w:lvlJc w:val="right"/>
+      <w:pPr>
+        <w:ind w:left="6480" w:hanging="180"/>
+      </w:pPr>
+    </w:lvl>
+  </w:abstractNum>
+  <w:abstractNum w:abstractNumId="5" w15:restartNumberingAfterBreak="0">
     <w:nsid w:val="171A73AC"/>
     <w:multiLevelType w:val="hybridMultilevel"/>
     <w:tmpl w:val="ABD0D7D8"/>
@@ -4282,7 +5178,7 @@
       </w:pPr>
     </w:lvl>
   </w:abstractNum>
-  <w:abstractNum w:abstractNumId="5" w15:restartNumberingAfterBreak="0">
+  <w:abstractNum w:abstractNumId="6" w15:restartNumberingAfterBreak="0">
     <w:nsid w:val="1B3618B8"/>
     <w:multiLevelType w:val="hybridMultilevel"/>
     <w:tmpl w:val="0F9A08EA"/>
@@ -4395,7 +5291,120 @@
       </w:rPr>
     </w:lvl>
   </w:abstractNum>
-  <w:abstractNum w:abstractNumId="6" w15:restartNumberingAfterBreak="0">
+  <w:abstractNum w:abstractNumId="7" w15:restartNumberingAfterBreak="0">
+    <w:nsid w:val="1B890B2D"/>
+    <w:multiLevelType w:val="hybridMultilevel"/>
+    <w:tmpl w:val="C28C0368"/>
+    <w:lvl w:ilvl="0" w:tplc="40090001">
+      <w:start w:val="1"/>
+      <w:numFmt w:val="bullet"/>
+      <w:lvlText w:val=""/>
+      <w:lvlJc w:val="left"/>
+      <w:pPr>
+        <w:ind w:left="720" w:hanging="360"/>
+      </w:pPr>
+      <w:rPr>
+        <w:rFonts w:ascii="Symbol" w:hAnsi="Symbol" w:hint="default"/>
+      </w:rPr>
+    </w:lvl>
+    <w:lvl w:ilvl="1" w:tplc="40090003" w:tentative="1">
+      <w:start w:val="1"/>
+      <w:numFmt w:val="bullet"/>
+      <w:lvlText w:val="o"/>
+      <w:lvlJc w:val="left"/>
+      <w:pPr>
+        <w:ind w:left="1440" w:hanging="360"/>
+      </w:pPr>
+      <w:rPr>
+        <w:rFonts w:ascii="Courier New" w:hAnsi="Courier New" w:cs="Courier New" w:hint="default"/>
+      </w:rPr>
+    </w:lvl>
+    <w:lvl w:ilvl="2" w:tplc="40090005" w:tentative="1">
+      <w:start w:val="1"/>
+      <w:numFmt w:val="bullet"/>
+      <w:lvlText w:val=""/>
+      <w:lvlJc w:val="left"/>
+      <w:pPr>
+        <w:ind w:left="2160" w:hanging="360"/>
+      </w:pPr>
+      <w:rPr>
+        <w:rFonts w:ascii="Wingdings" w:hAnsi="Wingdings" w:hint="default"/>
+      </w:rPr>
+    </w:lvl>
+    <w:lvl w:ilvl="3" w:tplc="40090001" w:tentative="1">
+      <w:start w:val="1"/>
+      <w:numFmt w:val="bullet"/>
+      <w:lvlText w:val=""/>
+      <w:lvlJc w:val="left"/>
+      <w:pPr>
+        <w:ind w:left="2880" w:hanging="360"/>
+      </w:pPr>
+      <w:rPr>
+        <w:rFonts w:ascii="Symbol" w:hAnsi="Symbol" w:hint="default"/>
+      </w:rPr>
+    </w:lvl>
+    <w:lvl w:ilvl="4" w:tplc="40090003" w:tentative="1">
+      <w:start w:val="1"/>
+      <w:numFmt w:val="bullet"/>
+      <w:lvlText w:val="o"/>
+      <w:lvlJc w:val="left"/>
+      <w:pPr>
+        <w:ind w:left="3600" w:hanging="360"/>
+      </w:pPr>
+      <w:rPr>
+        <w:rFonts w:ascii="Courier New" w:hAnsi="Courier New" w:cs="Courier New" w:hint="default"/>
+      </w:rPr>
+    </w:lvl>
+    <w:lvl w:ilvl="5" w:tplc="40090005" w:tentative="1">
+      <w:start w:val="1"/>
+      <w:numFmt w:val="bullet"/>
+      <w:lvlText w:val=""/>
+      <w:lvlJc w:val="left"/>
+      <w:pPr>
+        <w:ind w:left="4320" w:hanging="360"/>
+      </w:pPr>
+      <w:rPr>
+        <w:rFonts w:ascii="Wingdings" w:hAnsi="Wingdings" w:hint="default"/>
+      </w:rPr>
+    </w:lvl>
+    <w:lvl w:ilvl="6" w:tplc="40090001" w:tentative="1">
+      <w:start w:val="1"/>
+      <w:numFmt w:val="bullet"/>
+      <w:lvlText w:val=""/>
+      <w:lvlJc w:val="left"/>
+      <w:pPr>
+        <w:ind w:left="5040" w:hanging="360"/>
+      </w:pPr>
+      <w:rPr>
+        <w:rFonts w:ascii="Symbol" w:hAnsi="Symbol" w:hint="default"/>
+      </w:rPr>
+    </w:lvl>
+    <w:lvl w:ilvl="7" w:tplc="40090003" w:tentative="1">
+      <w:start w:val="1"/>
+      <w:numFmt w:val="bullet"/>
+      <w:lvlText w:val="o"/>
+      <w:lvlJc w:val="left"/>
+      <w:pPr>
+        <w:ind w:left="5760" w:hanging="360"/>
+      </w:pPr>
+      <w:rPr>
+        <w:rFonts w:ascii="Courier New" w:hAnsi="Courier New" w:cs="Courier New" w:hint="default"/>
+      </w:rPr>
+    </w:lvl>
+    <w:lvl w:ilvl="8" w:tplc="40090005" w:tentative="1">
+      <w:start w:val="1"/>
+      <w:numFmt w:val="bullet"/>
+      <w:lvlText w:val=""/>
+      <w:lvlJc w:val="left"/>
+      <w:pPr>
+        <w:ind w:left="6480" w:hanging="360"/>
+      </w:pPr>
+      <w:rPr>
+        <w:rFonts w:ascii="Wingdings" w:hAnsi="Wingdings" w:hint="default"/>
+      </w:rPr>
+    </w:lvl>
+  </w:abstractNum>
+  <w:abstractNum w:abstractNumId="8" w15:restartNumberingAfterBreak="0">
     <w:nsid w:val="1F0373D9"/>
     <w:multiLevelType w:val="multilevel"/>
     <w:tmpl w:val="143E02B0"/>
@@ -4544,7 +5553,7 @@
       </w:rPr>
     </w:lvl>
   </w:abstractNum>
-  <w:abstractNum w:abstractNumId="7" w15:restartNumberingAfterBreak="0">
+  <w:abstractNum w:abstractNumId="9" w15:restartNumberingAfterBreak="0">
     <w:nsid w:val="211C68EA"/>
     <w:multiLevelType w:val="hybridMultilevel"/>
     <w:tmpl w:val="50B6BB60"/>
@@ -4657,7 +5666,156 @@
       </w:rPr>
     </w:lvl>
   </w:abstractNum>
-  <w:abstractNum w:abstractNumId="8" w15:restartNumberingAfterBreak="0">
+  <w:abstractNum w:abstractNumId="10" w15:restartNumberingAfterBreak="0">
+    <w:nsid w:val="267A4530"/>
+    <w:multiLevelType w:val="multilevel"/>
+    <w:tmpl w:val="2806E274"/>
+    <w:lvl w:ilvl="0">
+      <w:start w:val="1"/>
+      <w:numFmt w:val="bullet"/>
+      <w:lvlText w:val=""/>
+      <w:lvlJc w:val="left"/>
+      <w:pPr>
+        <w:tabs>
+          <w:tab w:val="num" w:pos="720"/>
+        </w:tabs>
+        <w:ind w:left="720" w:hanging="360"/>
+      </w:pPr>
+      <w:rPr>
+        <w:rFonts w:ascii="Symbol" w:hAnsi="Symbol" w:hint="default"/>
+        <w:sz w:val="20"/>
+      </w:rPr>
+    </w:lvl>
+    <w:lvl w:ilvl="1" w:tentative="1">
+      <w:start w:val="1"/>
+      <w:numFmt w:val="bullet"/>
+      <w:lvlText w:val="o"/>
+      <w:lvlJc w:val="left"/>
+      <w:pPr>
+        <w:tabs>
+          <w:tab w:val="num" w:pos="1440"/>
+        </w:tabs>
+        <w:ind w:left="1440" w:hanging="360"/>
+      </w:pPr>
+      <w:rPr>
+        <w:rFonts w:ascii="Courier New" w:hAnsi="Courier New" w:hint="default"/>
+        <w:sz w:val="20"/>
+      </w:rPr>
+    </w:lvl>
+    <w:lvl w:ilvl="2" w:tentative="1">
+      <w:start w:val="1"/>
+      <w:numFmt w:val="bullet"/>
+      <w:lvlText w:val=""/>
+      <w:lvlJc w:val="left"/>
+      <w:pPr>
+        <w:tabs>
+          <w:tab w:val="num" w:pos="2160"/>
+        </w:tabs>
+        <w:ind w:left="2160" w:hanging="360"/>
+      </w:pPr>
+      <w:rPr>
+        <w:rFonts w:ascii="Wingdings" w:hAnsi="Wingdings" w:hint="default"/>
+        <w:sz w:val="20"/>
+      </w:rPr>
+    </w:lvl>
+    <w:lvl w:ilvl="3" w:tentative="1">
+      <w:start w:val="1"/>
+      <w:numFmt w:val="bullet"/>
+      <w:lvlText w:val=""/>
+      <w:lvlJc w:val="left"/>
+      <w:pPr>
+        <w:tabs>
+          <w:tab w:val="num" w:pos="2880"/>
+        </w:tabs>
+        <w:ind w:left="2880" w:hanging="360"/>
+      </w:pPr>
+      <w:rPr>
+        <w:rFonts w:ascii="Wingdings" w:hAnsi="Wingdings" w:hint="default"/>
+        <w:sz w:val="20"/>
+      </w:rPr>
+    </w:lvl>
+    <w:lvl w:ilvl="4" w:tentative="1">
+      <w:start w:val="1"/>
+      <w:numFmt w:val="bullet"/>
+      <w:lvlText w:val=""/>
+      <w:lvlJc w:val="left"/>
+      <w:pPr>
+        <w:tabs>
+          <w:tab w:val="num" w:pos="3600"/>
+        </w:tabs>
+        <w:ind w:left="3600" w:hanging="360"/>
+      </w:pPr>
+      <w:rPr>
+        <w:rFonts w:ascii="Wingdings" w:hAnsi="Wingdings" w:hint="default"/>
+        <w:sz w:val="20"/>
+      </w:rPr>
+    </w:lvl>
+    <w:lvl w:ilvl="5" w:tentative="1">
+      <w:start w:val="1"/>
+      <w:numFmt w:val="bullet"/>
+      <w:lvlText w:val=""/>
+      <w:lvlJc w:val="left"/>
+      <w:pPr>
+        <w:tabs>
+          <w:tab w:val="num" w:pos="4320"/>
+        </w:tabs>
+        <w:ind w:left="4320" w:hanging="360"/>
+      </w:pPr>
+      <w:rPr>
+        <w:rFonts w:ascii="Wingdings" w:hAnsi="Wingdings" w:hint="default"/>
+        <w:sz w:val="20"/>
+      </w:rPr>
+    </w:lvl>
+    <w:lvl w:ilvl="6" w:tentative="1">
+      <w:start w:val="1"/>
+      <w:numFmt w:val="bullet"/>
+      <w:lvlText w:val=""/>
+      <w:lvlJc w:val="left"/>
+      <w:pPr>
+        <w:tabs>
+          <w:tab w:val="num" w:pos="5040"/>
+        </w:tabs>
+        <w:ind w:left="5040" w:hanging="360"/>
+      </w:pPr>
+      <w:rPr>
+        <w:rFonts w:ascii="Wingdings" w:hAnsi="Wingdings" w:hint="default"/>
+        <w:sz w:val="20"/>
+      </w:rPr>
+    </w:lvl>
+    <w:lvl w:ilvl="7" w:tentative="1">
+      <w:start w:val="1"/>
+      <w:numFmt w:val="bullet"/>
+      <w:lvlText w:val=""/>
+      <w:lvlJc w:val="left"/>
+      <w:pPr>
+        <w:tabs>
+          <w:tab w:val="num" w:pos="5760"/>
+        </w:tabs>
+        <w:ind w:left="5760" w:hanging="360"/>
+      </w:pPr>
+      <w:rPr>
+        <w:rFonts w:ascii="Wingdings" w:hAnsi="Wingdings" w:hint="default"/>
+        <w:sz w:val="20"/>
+      </w:rPr>
+    </w:lvl>
+    <w:lvl w:ilvl="8" w:tentative="1">
+      <w:start w:val="1"/>
+      <w:numFmt w:val="bullet"/>
+      <w:lvlText w:val=""/>
+      <w:lvlJc w:val="left"/>
+      <w:pPr>
+        <w:tabs>
+          <w:tab w:val="num" w:pos="6480"/>
+        </w:tabs>
+        <w:ind w:left="6480" w:hanging="360"/>
+      </w:pPr>
+      <w:rPr>
+        <w:rFonts w:ascii="Wingdings" w:hAnsi="Wingdings" w:hint="default"/>
+        <w:sz w:val="20"/>
+      </w:rPr>
+    </w:lvl>
+  </w:abstractNum>
+  <w:abstractNum w:abstractNumId="11" w15:restartNumberingAfterBreak="0">
     <w:nsid w:val="282707DB"/>
     <w:multiLevelType w:val="hybridMultilevel"/>
     <w:tmpl w:val="F7BA6662"/>
@@ -4770,7 +5928,156 @@
       </w:rPr>
     </w:lvl>
   </w:abstractNum>
-  <w:abstractNum w:abstractNumId="9" w15:restartNumberingAfterBreak="0">
+  <w:abstractNum w:abstractNumId="12" w15:restartNumberingAfterBreak="0">
+    <w:nsid w:val="284F1A02"/>
+    <w:multiLevelType w:val="multilevel"/>
+    <w:tmpl w:val="C62AB64E"/>
+    <w:lvl w:ilvl="0">
+      <w:start w:val="1"/>
+      <w:numFmt w:val="bullet"/>
+      <w:lvlText w:val=""/>
+      <w:lvlJc w:val="left"/>
+      <w:pPr>
+        <w:tabs>
+          <w:tab w:val="num" w:pos="720"/>
+        </w:tabs>
+        <w:ind w:left="720" w:hanging="360"/>
+      </w:pPr>
+      <w:rPr>
+        <w:rFonts w:ascii="Symbol" w:hAnsi="Symbol" w:hint="default"/>
+        <w:sz w:val="20"/>
+      </w:rPr>
+    </w:lvl>
+    <w:lvl w:ilvl="1" w:tentative="1">
+      <w:start w:val="1"/>
+      <w:numFmt w:val="bullet"/>
+      <w:lvlText w:val="o"/>
+      <w:lvlJc w:val="left"/>
+      <w:pPr>
+        <w:tabs>
+          <w:tab w:val="num" w:pos="1440"/>
+        </w:tabs>
+        <w:ind w:left="1440" w:hanging="360"/>
+      </w:pPr>
+      <w:rPr>
+        <w:rFonts w:ascii="Courier New" w:hAnsi="Courier New" w:hint="default"/>
+        <w:sz w:val="20"/>
+      </w:rPr>
+    </w:lvl>
+    <w:lvl w:ilvl="2" w:tentative="1">
+      <w:start w:val="1"/>
+      <w:numFmt w:val="bullet"/>
+      <w:lvlText w:val=""/>
+      <w:lvlJc w:val="left"/>
+      <w:pPr>
+        <w:tabs>
+          <w:tab w:val="num" w:pos="2160"/>
+        </w:tabs>
+        <w:ind w:left="2160" w:hanging="360"/>
+      </w:pPr>
+      <w:rPr>
+        <w:rFonts w:ascii="Wingdings" w:hAnsi="Wingdings" w:hint="default"/>
+        <w:sz w:val="20"/>
+      </w:rPr>
+    </w:lvl>
+    <w:lvl w:ilvl="3" w:tentative="1">
+      <w:start w:val="1"/>
+      <w:numFmt w:val="bullet"/>
+      <w:lvlText w:val=""/>
+      <w:lvlJc w:val="left"/>
+      <w:pPr>
+        <w:tabs>
+          <w:tab w:val="num" w:pos="2880"/>
+        </w:tabs>
+        <w:ind w:left="2880" w:hanging="360"/>
+      </w:pPr>
+      <w:rPr>
+        <w:rFonts w:ascii="Wingdings" w:hAnsi="Wingdings" w:hint="default"/>
+        <w:sz w:val="20"/>
+      </w:rPr>
+    </w:lvl>
+    <w:lvl w:ilvl="4" w:tentative="1">
+      <w:start w:val="1"/>
+      <w:numFmt w:val="bullet"/>
+      <w:lvlText w:val=""/>
+      <w:lvlJc w:val="left"/>
+      <w:pPr>
+        <w:tabs>
+          <w:tab w:val="num" w:pos="3600"/>
+        </w:tabs>
+        <w:ind w:left="3600" w:hanging="360"/>
+      </w:pPr>
+      <w:rPr>
+        <w:rFonts w:ascii="Wingdings" w:hAnsi="Wingdings" w:hint="default"/>
+        <w:sz w:val="20"/>
+      </w:rPr>
+    </w:lvl>
+    <w:lvl w:ilvl="5" w:tentative="1">
+      <w:start w:val="1"/>
+      <w:numFmt w:val="bullet"/>
+      <w:lvlText w:val=""/>
+      <w:lvlJc w:val="left"/>
+      <w:pPr>
+        <w:tabs>
+          <w:tab w:val="num" w:pos="4320"/>
+        </w:tabs>
+        <w:ind w:left="4320" w:hanging="360"/>
+      </w:pPr>
+      <w:rPr>
+        <w:rFonts w:ascii="Wingdings" w:hAnsi="Wingdings" w:hint="default"/>
+        <w:sz w:val="20"/>
+      </w:rPr>
+    </w:lvl>
+    <w:lvl w:ilvl="6" w:tentative="1">
+      <w:start w:val="1"/>
+      <w:numFmt w:val="bullet"/>
+      <w:lvlText w:val=""/>
+      <w:lvlJc w:val="left"/>
+      <w:pPr>
+        <w:tabs>
+          <w:tab w:val="num" w:pos="5040"/>
+        </w:tabs>
+        <w:ind w:left="5040" w:hanging="360"/>
+      </w:pPr>
+      <w:rPr>
+        <w:rFonts w:ascii="Wingdings" w:hAnsi="Wingdings" w:hint="default"/>
+        <w:sz w:val="20"/>
+      </w:rPr>
+    </w:lvl>
+    <w:lvl w:ilvl="7" w:tentative="1">
+      <w:start w:val="1"/>
+      <w:numFmt w:val="bullet"/>
+      <w:lvlText w:val=""/>
+      <w:lvlJc w:val="left"/>
+      <w:pPr>
+        <w:tabs>
+          <w:tab w:val="num" w:pos="5760"/>
+        </w:tabs>
+        <w:ind w:left="5760" w:hanging="360"/>
+      </w:pPr>
+      <w:rPr>
+        <w:rFonts w:ascii="Wingdings" w:hAnsi="Wingdings" w:hint="default"/>
+        <w:sz w:val="20"/>
+      </w:rPr>
+    </w:lvl>
+    <w:lvl w:ilvl="8" w:tentative="1">
+      <w:start w:val="1"/>
+      <w:numFmt w:val="bullet"/>
+      <w:lvlText w:val=""/>
+      <w:lvlJc w:val="left"/>
+      <w:pPr>
+        <w:tabs>
+          <w:tab w:val="num" w:pos="6480"/>
+        </w:tabs>
+        <w:ind w:left="6480" w:hanging="360"/>
+      </w:pPr>
+      <w:rPr>
+        <w:rFonts w:ascii="Wingdings" w:hAnsi="Wingdings" w:hint="default"/>
+        <w:sz w:val="20"/>
+      </w:rPr>
+    </w:lvl>
+  </w:abstractNum>
+  <w:abstractNum w:abstractNumId="13" w15:restartNumberingAfterBreak="0">
     <w:nsid w:val="289927EA"/>
     <w:multiLevelType w:val="hybridMultilevel"/>
     <w:tmpl w:val="0A165C9E"/>
@@ -4883,7 +6190,7 @@
       </w:rPr>
     </w:lvl>
   </w:abstractNum>
-  <w:abstractNum w:abstractNumId="10" w15:restartNumberingAfterBreak="0">
+  <w:abstractNum w:abstractNumId="14" w15:restartNumberingAfterBreak="0">
     <w:nsid w:val="2ABC349A"/>
     <w:multiLevelType w:val="multilevel"/>
     <w:tmpl w:val="65BE9852"/>
@@ -5032,7 +6339,7 @@
       </w:rPr>
     </w:lvl>
   </w:abstractNum>
-  <w:abstractNum w:abstractNumId="11" w15:restartNumberingAfterBreak="0">
+  <w:abstractNum w:abstractNumId="15" w15:restartNumberingAfterBreak="0">
     <w:nsid w:val="2C586896"/>
     <w:multiLevelType w:val="hybridMultilevel"/>
     <w:tmpl w:val="29528D92"/>
@@ -5145,7 +6452,7 @@
       </w:rPr>
     </w:lvl>
   </w:abstractNum>
-  <w:abstractNum w:abstractNumId="12" w15:restartNumberingAfterBreak="0">
+  <w:abstractNum w:abstractNumId="16" w15:restartNumberingAfterBreak="0">
     <w:nsid w:val="30F847E3"/>
     <w:multiLevelType w:val="hybridMultilevel"/>
     <w:tmpl w:val="0DF6E9BE"/>
@@ -5258,7 +6565,7 @@
       </w:rPr>
     </w:lvl>
   </w:abstractNum>
-  <w:abstractNum w:abstractNumId="13" w15:restartNumberingAfterBreak="0">
+  <w:abstractNum w:abstractNumId="17" w15:restartNumberingAfterBreak="0">
     <w:nsid w:val="39813AD7"/>
     <w:multiLevelType w:val="hybridMultilevel"/>
     <w:tmpl w:val="0B9CCFDC"/>
@@ -5371,7 +6678,7 @@
       </w:rPr>
     </w:lvl>
   </w:abstractNum>
-  <w:abstractNum w:abstractNumId="14" w15:restartNumberingAfterBreak="0">
+  <w:abstractNum w:abstractNumId="18" w15:restartNumberingAfterBreak="0">
     <w:nsid w:val="3FEF7FD3"/>
     <w:multiLevelType w:val="multilevel"/>
     <w:tmpl w:val="4BDC9CA8"/>
@@ -5520,7 +6827,7 @@
       </w:rPr>
     </w:lvl>
   </w:abstractNum>
-  <w:abstractNum w:abstractNumId="15" w15:restartNumberingAfterBreak="0">
+  <w:abstractNum w:abstractNumId="19" w15:restartNumberingAfterBreak="0">
     <w:nsid w:val="45546783"/>
     <w:multiLevelType w:val="hybridMultilevel"/>
     <w:tmpl w:val="C29A1E90"/>
@@ -5633,7 +6940,7 @@
       </w:rPr>
     </w:lvl>
   </w:abstractNum>
-  <w:abstractNum w:abstractNumId="16" w15:restartNumberingAfterBreak="0">
+  <w:abstractNum w:abstractNumId="20" w15:restartNumberingAfterBreak="0">
     <w:nsid w:val="488B50F9"/>
     <w:multiLevelType w:val="hybridMultilevel"/>
     <w:tmpl w:val="4AF4E1B2"/>
@@ -5746,7 +7053,7 @@
       </w:rPr>
     </w:lvl>
   </w:abstractNum>
-  <w:abstractNum w:abstractNumId="17" w15:restartNumberingAfterBreak="0">
+  <w:abstractNum w:abstractNumId="21" w15:restartNumberingAfterBreak="0">
     <w:nsid w:val="500B6F34"/>
     <w:multiLevelType w:val="hybridMultilevel"/>
     <w:tmpl w:val="BD982AB6"/>
@@ -5859,7 +7166,7 @@
       </w:rPr>
     </w:lvl>
   </w:abstractNum>
-  <w:abstractNum w:abstractNumId="18" w15:restartNumberingAfterBreak="0">
+  <w:abstractNum w:abstractNumId="22" w15:restartNumberingAfterBreak="0">
     <w:nsid w:val="575402D3"/>
     <w:multiLevelType w:val="hybridMultilevel"/>
     <w:tmpl w:val="ECD41090"/>
@@ -5972,7 +7279,7 @@
       </w:rPr>
     </w:lvl>
   </w:abstractNum>
-  <w:abstractNum w:abstractNumId="19" w15:restartNumberingAfterBreak="0">
+  <w:abstractNum w:abstractNumId="23" w15:restartNumberingAfterBreak="0">
     <w:nsid w:val="62E12D1A"/>
     <w:multiLevelType w:val="hybridMultilevel"/>
     <w:tmpl w:val="7BD2A1E2"/>
@@ -6062,7 +7369,7 @@
       </w:pPr>
     </w:lvl>
   </w:abstractNum>
-  <w:abstractNum w:abstractNumId="20" w15:restartNumberingAfterBreak="0">
+  <w:abstractNum w:abstractNumId="24" w15:restartNumberingAfterBreak="0">
     <w:nsid w:val="665E6836"/>
     <w:multiLevelType w:val="hybridMultilevel"/>
     <w:tmpl w:val="327C1B88"/>
@@ -6151,7 +7458,7 @@
       </w:pPr>
     </w:lvl>
   </w:abstractNum>
-  <w:abstractNum w:abstractNumId="21" w15:restartNumberingAfterBreak="0">
+  <w:abstractNum w:abstractNumId="25" w15:restartNumberingAfterBreak="0">
     <w:nsid w:val="6E5462A5"/>
     <w:multiLevelType w:val="hybridMultilevel"/>
     <w:tmpl w:val="39D4D97E"/>
@@ -6264,7 +7571,120 @@
       </w:rPr>
     </w:lvl>
   </w:abstractNum>
-  <w:abstractNum w:abstractNumId="22" w15:restartNumberingAfterBreak="0">
+  <w:abstractNum w:abstractNumId="26" w15:restartNumberingAfterBreak="0">
+    <w:nsid w:val="727C4CA0"/>
+    <w:multiLevelType w:val="hybridMultilevel"/>
+    <w:tmpl w:val="B06EF700"/>
+    <w:lvl w:ilvl="0" w:tplc="40090001">
+      <w:start w:val="1"/>
+      <w:numFmt w:val="bullet"/>
+      <w:lvlText w:val=""/>
+      <w:lvlJc w:val="left"/>
+      <w:pPr>
+        <w:ind w:left="720" w:hanging="360"/>
+      </w:pPr>
+      <w:rPr>
+        <w:rFonts w:ascii="Symbol" w:hAnsi="Symbol" w:hint="default"/>
+      </w:rPr>
+    </w:lvl>
+    <w:lvl w:ilvl="1" w:tplc="40090003" w:tentative="1">
+      <w:start w:val="1"/>
+      <w:numFmt w:val="bullet"/>
+      <w:lvlText w:val="o"/>
+      <w:lvlJc w:val="left"/>
+      <w:pPr>
+        <w:ind w:left="1440" w:hanging="360"/>
+      </w:pPr>
+      <w:rPr>
+        <w:rFonts w:ascii="Courier New" w:hAnsi="Courier New" w:cs="Courier New" w:hint="default"/>
+      </w:rPr>
+    </w:lvl>
+    <w:lvl w:ilvl="2" w:tplc="40090005" w:tentative="1">
+      <w:start w:val="1"/>
+      <w:numFmt w:val="bullet"/>
+      <w:lvlText w:val=""/>
+      <w:lvlJc w:val="left"/>
+      <w:pPr>
+        <w:ind w:left="2160" w:hanging="360"/>
+      </w:pPr>
+      <w:rPr>
+        <w:rFonts w:ascii="Wingdings" w:hAnsi="Wingdings" w:hint="default"/>
+      </w:rPr>
+    </w:lvl>
+    <w:lvl w:ilvl="3" w:tplc="40090001" w:tentative="1">
+      <w:start w:val="1"/>
+      <w:numFmt w:val="bullet"/>
+      <w:lvlText w:val=""/>
+      <w:lvlJc w:val="left"/>
+      <w:pPr>
+        <w:ind w:left="2880" w:hanging="360"/>
+      </w:pPr>
+      <w:rPr>
+        <w:rFonts w:ascii="Symbol" w:hAnsi="Symbol" w:hint="default"/>
+      </w:rPr>
+    </w:lvl>
+    <w:lvl w:ilvl="4" w:tplc="40090003" w:tentative="1">
+      <w:start w:val="1"/>
+      <w:numFmt w:val="bullet"/>
+      <w:lvlText w:val="o"/>
+      <w:lvlJc w:val="left"/>
+      <w:pPr>
+        <w:ind w:left="3600" w:hanging="360"/>
+      </w:pPr>
+      <w:rPr>
+        <w:rFonts w:ascii="Courier New" w:hAnsi="Courier New" w:cs="Courier New" w:hint="default"/>
+      </w:rPr>
+    </w:lvl>
+    <w:lvl w:ilvl="5" w:tplc="40090005" w:tentative="1">
+      <w:start w:val="1"/>
+      <w:numFmt w:val="bullet"/>
+      <w:lvlText w:val=""/>
+      <w:lvlJc w:val="left"/>
+      <w:pPr>
+        <w:ind w:left="4320" w:hanging="360"/>
+      </w:pPr>
+      <w:rPr>
+        <w:rFonts w:ascii="Wingdings" w:hAnsi="Wingdings" w:hint="default"/>
+      </w:rPr>
+    </w:lvl>
+    <w:lvl w:ilvl="6" w:tplc="40090001" w:tentative="1">
+      <w:start w:val="1"/>
+      <w:numFmt w:val="bullet"/>
+      <w:lvlText w:val=""/>
+      <w:lvlJc w:val="left"/>
+      <w:pPr>
+        <w:ind w:left="5040" w:hanging="360"/>
+      </w:pPr>
+      <w:rPr>
+        <w:rFonts w:ascii="Symbol" w:hAnsi="Symbol" w:hint="default"/>
+      </w:rPr>
+    </w:lvl>
+    <w:lvl w:ilvl="7" w:tplc="40090003" w:tentative="1">
+      <w:start w:val="1"/>
+      <w:numFmt w:val="bullet"/>
+      <w:lvlText w:val="o"/>
+      <w:lvlJc w:val="left"/>
+      <w:pPr>
+        <w:ind w:left="5760" w:hanging="360"/>
+      </w:pPr>
+      <w:rPr>
+        <w:rFonts w:ascii="Courier New" w:hAnsi="Courier New" w:cs="Courier New" w:hint="default"/>
+      </w:rPr>
+    </w:lvl>
+    <w:lvl w:ilvl="8" w:tplc="40090005" w:tentative="1">
+      <w:start w:val="1"/>
+      <w:numFmt w:val="bullet"/>
+      <w:lvlText w:val=""/>
+      <w:lvlJc w:val="left"/>
+      <w:pPr>
+        <w:ind w:left="6480" w:hanging="360"/>
+      </w:pPr>
+      <w:rPr>
+        <w:rFonts w:ascii="Wingdings" w:hAnsi="Wingdings" w:hint="default"/>
+      </w:rPr>
+    </w:lvl>
+  </w:abstractNum>
+  <w:abstractNum w:abstractNumId="27" w15:restartNumberingAfterBreak="0">
     <w:nsid w:val="72894494"/>
     <w:multiLevelType w:val="hybridMultilevel"/>
     <w:tmpl w:val="65B2DCAA"/>
@@ -6377,7 +7797,7 @@
       </w:rPr>
     </w:lvl>
   </w:abstractNum>
-  <w:abstractNum w:abstractNumId="23" w15:restartNumberingAfterBreak="0">
+  <w:abstractNum w:abstractNumId="28" w15:restartNumberingAfterBreak="0">
     <w:nsid w:val="73E97109"/>
     <w:multiLevelType w:val="hybridMultilevel"/>
     <w:tmpl w:val="5F549056"/>
@@ -6490,7 +7910,7 @@
       </w:rPr>
     </w:lvl>
   </w:abstractNum>
-  <w:abstractNum w:abstractNumId="24" w15:restartNumberingAfterBreak="0">
+  <w:abstractNum w:abstractNumId="29" w15:restartNumberingAfterBreak="0">
     <w:nsid w:val="7EDB5E69"/>
     <w:multiLevelType w:val="hybridMultilevel"/>
     <w:tmpl w:val="65586D1E"/>
@@ -6603,7 +8023,7 @@
       </w:rPr>
     </w:lvl>
   </w:abstractNum>
-  <w:abstractNum w:abstractNumId="25" w15:restartNumberingAfterBreak="0">
+  <w:abstractNum w:abstractNumId="30" w15:restartNumberingAfterBreak="0">
     <w:nsid w:val="7F400690"/>
     <w:multiLevelType w:val="hybridMultilevel"/>
     <w:tmpl w:val="96FE2352"/>
@@ -6694,82 +8114,97 @@
     </w:lvl>
   </w:abstractNum>
   <w:num w:numId="1" w16cid:durableId="967128401">
-    <w:abstractNumId w:val="5"/>
+    <w:abstractNumId w:val="6"/>
   </w:num>
   <w:num w:numId="2" w16cid:durableId="394010046">
-    <w:abstractNumId w:val="11"/>
+    <w:abstractNumId w:val="15"/>
   </w:num>
   <w:num w:numId="3" w16cid:durableId="1219584200">
-    <w:abstractNumId w:val="7"/>
+    <w:abstractNumId w:val="9"/>
   </w:num>
   <w:num w:numId="4" w16cid:durableId="1482426334">
     <w:abstractNumId w:val="0"/>
   </w:num>
   <w:num w:numId="5" w16cid:durableId="51586480">
+    <w:abstractNumId w:val="30"/>
+  </w:num>
+  <w:num w:numId="6" w16cid:durableId="291400334">
+    <w:abstractNumId w:val="13"/>
+  </w:num>
+  <w:num w:numId="7" w16cid:durableId="1242831358">
+    <w:abstractNumId w:val="8"/>
+  </w:num>
+  <w:num w:numId="8" w16cid:durableId="2141605364">
+    <w:abstractNumId w:val="20"/>
+  </w:num>
+  <w:num w:numId="9" w16cid:durableId="39060268">
     <w:abstractNumId w:val="25"/>
   </w:num>
-  <w:num w:numId="6" w16cid:durableId="291400334">
-    <w:abstractNumId w:val="9"/>
+  <w:num w:numId="10" w16cid:durableId="1033075945">
+    <w:abstractNumId w:val="18"/>
   </w:num>
-  <w:num w:numId="7" w16cid:durableId="1242831358">
-    <w:abstractNumId w:val="6"/>
-  </w:num>
-  <w:num w:numId="8" w16cid:durableId="2141605364">
+  <w:num w:numId="11" w16cid:durableId="1170943159">
     <w:abstractNumId w:val="16"/>
   </w:num>
-  <w:num w:numId="9" w16cid:durableId="39060268">
-    <w:abstractNumId w:val="21"/>
-  </w:num>
-  <w:num w:numId="10" w16cid:durableId="1033075945">
-    <w:abstractNumId w:val="14"/>
-  </w:num>
-  <w:num w:numId="11" w16cid:durableId="1170943159">
-    <w:abstractNumId w:val="12"/>
-  </w:num>
   <w:num w:numId="12" w16cid:durableId="383456835">
-    <w:abstractNumId w:val="15"/>
+    <w:abstractNumId w:val="19"/>
   </w:num>
   <w:num w:numId="13" w16cid:durableId="73555556">
-    <w:abstractNumId w:val="23"/>
+    <w:abstractNumId w:val="28"/>
   </w:num>
   <w:num w:numId="14" w16cid:durableId="265115548">
-    <w:abstractNumId w:val="10"/>
+    <w:abstractNumId w:val="14"/>
   </w:num>
   <w:num w:numId="15" w16cid:durableId="273295478">
     <w:abstractNumId w:val="1"/>
   </w:num>
   <w:num w:numId="16" w16cid:durableId="760297462">
-    <w:abstractNumId w:val="4"/>
+    <w:abstractNumId w:val="5"/>
   </w:num>
   <w:num w:numId="17" w16cid:durableId="127431838">
-    <w:abstractNumId w:val="20"/>
+    <w:abstractNumId w:val="24"/>
   </w:num>
   <w:num w:numId="18" w16cid:durableId="1252928967">
     <w:abstractNumId w:val="3"/>
   </w:num>
   <w:num w:numId="19" w16cid:durableId="330182803">
-    <w:abstractNumId w:val="13"/>
+    <w:abstractNumId w:val="17"/>
   </w:num>
   <w:num w:numId="20" w16cid:durableId="1587417564">
-    <w:abstractNumId w:val="18"/>
+    <w:abstractNumId w:val="22"/>
   </w:num>
   <w:num w:numId="21" w16cid:durableId="1048603556">
     <w:abstractNumId w:val="2"/>
   </w:num>
   <w:num w:numId="22" w16cid:durableId="354307219">
-    <w:abstractNumId w:val="22"/>
+    <w:abstractNumId w:val="27"/>
   </w:num>
   <w:num w:numId="23" w16cid:durableId="1345744394">
-    <w:abstractNumId w:val="17"/>
+    <w:abstractNumId w:val="21"/>
   </w:num>
   <w:num w:numId="24" w16cid:durableId="828978298">
-    <w:abstractNumId w:val="19"/>
+    <w:abstractNumId w:val="23"/>
   </w:num>
   <w:num w:numId="25" w16cid:durableId="1662585460">
-    <w:abstractNumId w:val="8"/>
+    <w:abstractNumId w:val="11"/>
   </w:num>
   <w:num w:numId="26" w16cid:durableId="854540185">
-    <w:abstractNumId w:val="24"/>
+    <w:abstractNumId w:val="29"/>
+  </w:num>
+  <w:num w:numId="27" w16cid:durableId="326908233">
+    <w:abstractNumId w:val="10"/>
+  </w:num>
+  <w:num w:numId="28" w16cid:durableId="887305763">
+    <w:abstractNumId w:val="12"/>
+  </w:num>
+  <w:num w:numId="29" w16cid:durableId="1122186447">
+    <w:abstractNumId w:val="4"/>
+  </w:num>
+  <w:num w:numId="30" w16cid:durableId="2120711749">
+    <w:abstractNumId w:val="26"/>
+  </w:num>
+  <w:num w:numId="31" w16cid:durableId="1385325144">
+    <w:abstractNumId w:val="7"/>
   </w:num>
 </w:numbering>
 </file>
@@ -7376,7 +8811,6 @@
   <w:style w:type="character" w:default="1" w:styleId="DefaultParagraphFont">
     <w:name w:val="Default Paragraph Font"/>
     <w:uiPriority w:val="1"/>
-    <w:semiHidden/>
     <w:unhideWhenUsed/>
   </w:style>
   <w:style w:type="table" w:default="1" w:styleId="TableNormal">
@@ -7690,6 +9124,29 @@
       <w:spacing w:val="5"/>
     </w:rPr>
   </w:style>
+  <w:style w:type="character" w:styleId="Hyperlink">
+    <w:name w:val="Hyperlink"/>
+    <w:basedOn w:val="DefaultParagraphFont"/>
+    <w:uiPriority w:val="99"/>
+    <w:unhideWhenUsed/>
+    <w:rsid w:val="00EB4F84"/>
+    <w:rPr>
+      <w:color w:val="467886" w:themeColor="hyperlink"/>
+      <w:u w:val="single"/>
+    </w:rPr>
+  </w:style>
+  <w:style w:type="character" w:styleId="UnresolvedMention">
+    <w:name w:val="Unresolved Mention"/>
+    <w:basedOn w:val="DefaultParagraphFont"/>
+    <w:uiPriority w:val="99"/>
+    <w:semiHidden/>
+    <w:unhideWhenUsed/>
+    <w:rsid w:val="00EB4F84"/>
+    <w:rPr>
+      <w:color w:val="605E5C"/>
+      <w:shd w:val="clear" w:color="auto" w:fill="E1DFDD"/>
+    </w:rPr>
+  </w:style>
 </w:styles>
 </file>
 

</xml_diff>